<commit_message>
SEB politikų santraukos ir ESG punkto „fulfills SEB policies“ vertinimas
Co-Authored-By: Claude Opus 5.5 (1M context) <noreply@anthropic.com>
Claude-Session: https://claude.ai/code/session_013ZCssjCF43KM8LCnCdqfwt
</commit_message>
<xml_diff>
--- a/docs/files/ignitis/ignitis_6M2026_en.docx
+++ b/docs/files/ignitis/ignitis_6M2026_en.docx
@@ -5012,7 +5012,7 @@
         <w:rPr>
           <w:sz w:val="24"/>
         </w:rPr>
-        <w:t xml:space="preserve">☐ </w:t>
+        <w:t xml:space="preserve">☑ </w:t>
       </w:r>
       <w:r>
         <w:t>Yes, the company fulfills the expectations from SEB thematic and sector policies</w:t>
@@ -5036,7 +5036,7 @@
           <w:color w:val="333333"/>
           <w:sz w:val="19"/>
         </w:rPr>
-        <w:t xml:space="preserve">Needs review. </w:t>
+        <w:t>Applicable:</w:t>
       </w:r>
       <w:r>
         <w:rPr>
@@ -5044,7 +5044,358 @@
           <w:color w:val="333333"/>
           <w:sz w:val="19"/>
         </w:rPr>
-        <w:t>Fossil fuel policy - met (no coal, no oil &amp; gas exploration). Electricity &amp; renewables, climate and human rights policy content could not be read automatically (SEB PDFs block automated reading) - manual check needed.</w:t>
+        <w:t xml:space="preserve"> the SEB Investments policy</w:t>
+      </w:r>
+      <w:hyperlink r:id="rId33">
+        <w:r>
+          <w:rPr>
+            <w:color w:val="2A78D6"/>
+            <w:vertAlign w:val="superscript"/>
+            <w:sz w:val="16"/>
+          </w:rPr>
+          <w:t xml:space="preserve">28</w:t>
+        </w:r>
+      </w:hyperlink>
+      <w:r>
+        <w:rPr>
+          <w:b w:val="0"/>
+          <w:color w:val="333333"/>
+          <w:sz w:val="19"/>
+        </w:rPr>
+        <w:t>, the Electricity &amp; Renewable Energy policy, since green generation and networks make up more than 15% of revenue</w:t>
+      </w:r>
+      <w:hyperlink r:id="rId34">
+        <w:r>
+          <w:rPr>
+            <w:color w:val="2A78D6"/>
+            <w:vertAlign w:val="superscript"/>
+            <w:sz w:val="16"/>
+          </w:rPr>
+          <w:t xml:space="preserve">29</w:t>
+        </w:r>
+      </w:hyperlink>
+      <w:r>
+        <w:rPr>
+          <w:b w:val="0"/>
+          <w:color w:val="333333"/>
+          <w:sz w:val="19"/>
+        </w:rPr>
+        <w:t>, and the Fossil Fuels policy for gas distribution, gas supply and the Elektrėnai reserve plants. The gas revenue share was not found</w:t>
+      </w:r>
+      <w:hyperlink r:id="rId35">
+        <w:r>
+          <w:rPr>
+            <w:color w:val="2A78D6"/>
+            <w:vertAlign w:val="superscript"/>
+            <w:sz w:val="16"/>
+          </w:rPr>
+          <w:t xml:space="preserve">30</w:t>
+        </w:r>
+      </w:hyperlink>
+      <w:r>
+        <w:rPr>
+          <w:color w:val="2A78D6"/>
+          <w:vertAlign w:val="superscript"/>
+        </w:rPr>
+        <w:t>,</w:t>
+      </w:r>
+      <w:hyperlink r:id="rId36">
+        <w:r>
+          <w:rPr>
+            <w:color w:val="2A78D6"/>
+            <w:vertAlign w:val="superscript"/>
+            <w:sz w:val="16"/>
+          </w:rPr>
+          <w:t xml:space="preserve">31</w:t>
+        </w:r>
+      </w:hyperlink>
+      <w:r>
+        <w:rPr>
+          <w:b w:val="0"/>
+          <w:color w:val="333333"/>
+          <w:sz w:val="19"/>
+        </w:rPr>
+        <w:t xml:space="preserve">. </w:t>
+      </w:r>
+      <w:r>
+        <w:rPr>
+          <w:b/>
+          <w:color w:val="333333"/>
+          <w:sz w:val="19"/>
+        </w:rPr>
+        <w:t>Requirements met:</w:t>
+      </w:r>
+      <w:r>
+        <w:rPr>
+          <w:b w:val="0"/>
+          <w:color w:val="333333"/>
+          <w:sz w:val="19"/>
+        </w:rPr>
+        <w:t xml:space="preserve"> Scope 1-3 emissions disclosed (4.49m t CO2e in 2025) and SBTi-validated 1.5°C targets</w:t>
+      </w:r>
+      <w:hyperlink r:id="rId37">
+        <w:r>
+          <w:rPr>
+            <w:color w:val="2A78D6"/>
+            <w:vertAlign w:val="superscript"/>
+            <w:sz w:val="16"/>
+          </w:rPr>
+          <w:t xml:space="preserve">32</w:t>
+        </w:r>
+      </w:hyperlink>
+      <w:r>
+        <w:rPr>
+          <w:b w:val="0"/>
+          <w:color w:val="333333"/>
+          <w:sz w:val="19"/>
+        </w:rPr>
+        <w:t>; ISO 14001 environmental management at ESO, Ignitis gamyba, Ignitis and the Vilnius and Kaunas CHPs</w:t>
+      </w:r>
+      <w:hyperlink r:id="rId38">
+        <w:r>
+          <w:rPr>
+            <w:color w:val="2A78D6"/>
+            <w:vertAlign w:val="superscript"/>
+            <w:sz w:val="16"/>
+          </w:rPr>
+          <w:t xml:space="preserve">33</w:t>
+        </w:r>
+      </w:hyperlink>
+      <w:r>
+        <w:rPr>
+          <w:b w:val="0"/>
+          <w:color w:val="333333"/>
+          <w:sz w:val="19"/>
+        </w:rPr>
+        <w:t>. No coal, peat or oil &amp; gas extraction</w:t>
+      </w:r>
+      <w:hyperlink r:id="rId24">
+        <w:r>
+          <w:rPr>
+            <w:color w:val="2A78D6"/>
+            <w:vertAlign w:val="superscript"/>
+            <w:sz w:val="16"/>
+          </w:rPr>
+          <w:t xml:space="preserve">15</w:t>
+        </w:r>
+      </w:hyperlink>
+      <w:r>
+        <w:rPr>
+          <w:b w:val="0"/>
+          <w:color w:val="333333"/>
+          <w:sz w:val="19"/>
+        </w:rPr>
+        <w:t xml:space="preserve">. </w:t>
+      </w:r>
+      <w:r>
+        <w:rPr>
+          <w:b/>
+          <w:color w:val="333333"/>
+          <w:sz w:val="19"/>
+        </w:rPr>
+        <w:t>Expectations met:</w:t>
+      </w:r>
+      <w:r>
+        <w:rPr>
+          <w:b w:val="0"/>
+          <w:color w:val="333333"/>
+          <w:sz w:val="19"/>
+        </w:rPr>
+        <w:t xml:space="preserve"> ISO 45001 safety management, no fatal accidents in 2025</w:t>
+      </w:r>
+      <w:hyperlink r:id="rId39">
+        <w:r>
+          <w:rPr>
+            <w:color w:val="2A78D6"/>
+            <w:vertAlign w:val="superscript"/>
+            <w:sz w:val="16"/>
+          </w:rPr>
+          <w:t xml:space="preserve">34</w:t>
+        </w:r>
+      </w:hyperlink>
+      <w:r>
+        <w:rPr>
+          <w:color w:val="2A78D6"/>
+          <w:vertAlign w:val="superscript"/>
+        </w:rPr>
+        <w:t>,</w:t>
+      </w:r>
+      <w:hyperlink r:id="rId38">
+        <w:r>
+          <w:rPr>
+            <w:color w:val="2A78D6"/>
+            <w:vertAlign w:val="superscript"/>
+            <w:sz w:val="16"/>
+          </w:rPr>
+          <w:t xml:space="preserve">33</w:t>
+        </w:r>
+      </w:hyperlink>
+      <w:r>
+        <w:rPr>
+          <w:b w:val="0"/>
+          <w:color w:val="333333"/>
+          <w:sz w:val="19"/>
+        </w:rPr>
+        <w:t>; trust line for anonymous reports</w:t>
+      </w:r>
+      <w:hyperlink r:id="rId40">
+        <w:r>
+          <w:rPr>
+            <w:color w:val="2A78D6"/>
+            <w:vertAlign w:val="superscript"/>
+            <w:sz w:val="16"/>
+          </w:rPr>
+          <w:t xml:space="preserve">35</w:t>
+        </w:r>
+      </w:hyperlink>
+      <w:r>
+        <w:rPr>
+          <w:b w:val="0"/>
+          <w:color w:val="333333"/>
+          <w:sz w:val="19"/>
+        </w:rPr>
+        <w:t>; anti-corruption policy and ISO 37001 certification</w:t>
+      </w:r>
+      <w:hyperlink r:id="rId38">
+        <w:r>
+          <w:rPr>
+            <w:color w:val="2A78D6"/>
+            <w:vertAlign w:val="superscript"/>
+            <w:sz w:val="16"/>
+          </w:rPr>
+          <w:t xml:space="preserve">33</w:t>
+        </w:r>
+      </w:hyperlink>
+      <w:r>
+        <w:rPr>
+          <w:color w:val="2A78D6"/>
+          <w:vertAlign w:val="superscript"/>
+        </w:rPr>
+        <w:t>,</w:t>
+      </w:r>
+      <w:hyperlink r:id="rId40">
+        <w:r>
+          <w:rPr>
+            <w:color w:val="2A78D6"/>
+            <w:vertAlign w:val="superscript"/>
+            <w:sz w:val="16"/>
+          </w:rPr>
+          <w:t xml:space="preserve">35</w:t>
+        </w:r>
+      </w:hyperlink>
+      <w:r>
+        <w:rPr>
+          <w:b w:val="0"/>
+          <w:color w:val="333333"/>
+          <w:sz w:val="19"/>
+        </w:rPr>
+        <w:t>; UN Global Compact</w:t>
+      </w:r>
+      <w:hyperlink r:id="rId37">
+        <w:r>
+          <w:rPr>
+            <w:color w:val="2A78D6"/>
+            <w:vertAlign w:val="superscript"/>
+            <w:sz w:val="16"/>
+          </w:rPr>
+          <w:t xml:space="preserve">36</w:t>
+        </w:r>
+      </w:hyperlink>
+      <w:r>
+        <w:rPr>
+          <w:b w:val="0"/>
+          <w:color w:val="333333"/>
+          <w:sz w:val="19"/>
+        </w:rPr>
+        <w:t>; integrated annual report with climate data</w:t>
+      </w:r>
+      <w:hyperlink r:id="rId24">
+        <w:r>
+          <w:rPr>
+            <w:color w:val="2A78D6"/>
+            <w:vertAlign w:val="superscript"/>
+            <w:sz w:val="16"/>
+          </w:rPr>
+          <w:t xml:space="preserve">15</w:t>
+        </w:r>
+      </w:hyperlink>
+      <w:r>
+        <w:rPr>
+          <w:b w:val="0"/>
+          <w:color w:val="333333"/>
+          <w:sz w:val="19"/>
+        </w:rPr>
+        <w:t>; biodiversity monitoring and mitigation measures</w:t>
+      </w:r>
+      <w:hyperlink r:id="rId41">
+        <w:r>
+          <w:rPr>
+            <w:color w:val="2A78D6"/>
+            <w:vertAlign w:val="superscript"/>
+            <w:sz w:val="16"/>
+          </w:rPr>
+          <w:t xml:space="preserve">37</w:t>
+        </w:r>
+      </w:hyperlink>
+      <w:r>
+        <w:rPr>
+          <w:b w:val="0"/>
+          <w:color w:val="333333"/>
+          <w:sz w:val="19"/>
+        </w:rPr>
+        <w:t xml:space="preserve">. </w:t>
+      </w:r>
+      <w:r>
+        <w:rPr>
+          <w:b/>
+          <w:color w:val="333333"/>
+          <w:sz w:val="19"/>
+        </w:rPr>
+        <w:t>Not found / to check:</w:t>
+      </w:r>
+      <w:r>
+        <w:rPr>
+          <w:b w:val="0"/>
+          <w:color w:val="333333"/>
+          <w:sz w:val="19"/>
+        </w:rPr>
+        <w:t xml:space="preserve"> a named human rights due diligence process and quantified biodiversity targets</w:t>
+      </w:r>
+      <w:hyperlink r:id="rId34">
+        <w:r>
+          <w:rPr>
+            <w:color w:val="2A78D6"/>
+            <w:vertAlign w:val="superscript"/>
+            <w:sz w:val="16"/>
+          </w:rPr>
+          <w:t xml:space="preserve">38</w:t>
+        </w:r>
+      </w:hyperlink>
+      <w:r>
+        <w:rPr>
+          <w:b w:val="0"/>
+          <w:color w:val="333333"/>
+          <w:sz w:val="19"/>
+        </w:rPr>
+        <w:t>; country-by-country tax report (listed at</w:t>
+      </w:r>
+      <w:hyperlink r:id="rId42">
+        <w:r>
+          <w:rPr>
+            <w:color w:val="2A78D6"/>
+            <w:vertAlign w:val="superscript"/>
+            <w:sz w:val="16"/>
+          </w:rPr>
+          <w:t xml:space="preserve">39</w:t>
+        </w:r>
+      </w:hyperlink>
+      <w:r>
+        <w:rPr>
+          <w:b w:val="0"/>
+          <w:color w:val="333333"/>
+          <w:sz w:val="19"/>
+        </w:rPr>
+        <w:t>, not read).</w:t>
       </w:r>
     </w:p>
     <w:p>
@@ -5260,7 +5611,7 @@
           <w:color w:val="5F6B7A"/>
           <w:sz w:val="16"/>
         </w:rPr>
-        <w:t>SEB policies applied: Fossil Fuels (coal, oil &amp; gas, peat) sector policy; Electricity &amp; Renewable Energy sector policy; Environmental Policy on Climate, Nature and Water; Social and Human Rights Policy; Anti-corruption, Code of Conduct, Tax</w:t>
+        <w:t>SEB policies applied: Policy on Sustainability Considerations in Investments (SEB AB); Electricity &amp; Renewable Energy sector policy; Fossil Fuels sector policy (coal, oil &amp; gas, peat); Environmental Policy on Climate, Nature and Water (thematic); Social and Human Rights Policy (thematic); Governance expectations in sector policies (anti-corruption, tax, reporting)</w:t>
       </w:r>
     </w:p>
     <w:p>
@@ -5847,6 +6198,258 @@
       </w:hyperlink>
     </w:p>
     <w:p>
+      <w:pPr>
+        <w:spacing w:after="20"/>
+        <w:ind w:left="340" w:hanging="340"/>
+      </w:pPr>
+      <w:r>
+        <w:rPr>
+          <w:sz w:val="17"/>
+        </w:rPr>
+        <w:t xml:space="preserve">28. </w:t>
+      </w:r>
+      <w:hyperlink r:id="rId33">
+        <w:r>
+          <w:rPr>
+            <w:color w:val="2A78D6"/>
+            <w:sz w:val="17"/>
+          </w:rPr>
+          <w:t xml:space="preserve">SEB Policy on Sustainability Considerations in Investments (2026-04-15), p. 5, 2026-04-15</w:t>
+        </w:r>
+      </w:hyperlink>
+    </w:p>
+    <w:p>
+      <w:pPr>
+        <w:spacing w:after="20"/>
+        <w:ind w:left="340" w:hanging="340"/>
+      </w:pPr>
+      <w:r>
+        <w:rPr>
+          <w:sz w:val="17"/>
+        </w:rPr>
+        <w:t xml:space="preserve">29. </w:t>
+      </w:r>
+      <w:hyperlink r:id="rId34">
+        <w:r>
+          <w:rPr>
+            <w:color w:val="2A78D6"/>
+            <w:sz w:val="17"/>
+          </w:rPr>
+          <w:t xml:space="preserve">SEB Sector Policy on Electricity &amp; Renewable Energy (2026-04-23), p. 6, 2026-04-23</w:t>
+        </w:r>
+      </w:hyperlink>
+    </w:p>
+    <w:p>
+      <w:pPr>
+        <w:spacing w:after="20"/>
+        <w:ind w:left="340" w:hanging="340"/>
+      </w:pPr>
+      <w:r>
+        <w:rPr>
+          <w:sz w:val="17"/>
+        </w:rPr>
+        <w:t xml:space="preserve">30. </w:t>
+      </w:r>
+      <w:hyperlink r:id="rId35">
+        <w:r>
+          <w:rPr>
+            <w:color w:val="2A78D6"/>
+            <w:sz w:val="17"/>
+          </w:rPr>
+          <w:t xml:space="preserve">Integrated Annual Report 2025, p. 24, 39, 2026-02-25</w:t>
+        </w:r>
+      </w:hyperlink>
+    </w:p>
+    <w:p>
+      <w:pPr>
+        <w:spacing w:after="20"/>
+        <w:ind w:left="340" w:hanging="340"/>
+      </w:pPr>
+      <w:r>
+        <w:rPr>
+          <w:sz w:val="17"/>
+        </w:rPr>
+        <w:t xml:space="preserve">31. </w:t>
+      </w:r>
+      <w:hyperlink r:id="rId36">
+        <w:r>
+          <w:rPr>
+            <w:color w:val="2A78D6"/>
+            <w:sz w:val="17"/>
+          </w:rPr>
+          <w:t xml:space="preserve">SEB Sector Policy on Fossil Fuels (2026-04-23), p. 4, 6, 2026-04-23</w:t>
+        </w:r>
+      </w:hyperlink>
+    </w:p>
+    <w:p>
+      <w:pPr>
+        <w:spacing w:after="20"/>
+        <w:ind w:left="340" w:hanging="340"/>
+      </w:pPr>
+      <w:r>
+        <w:rPr>
+          <w:sz w:val="17"/>
+        </w:rPr>
+        <w:t xml:space="preserve">32. </w:t>
+      </w:r>
+      <w:hyperlink r:id="rId37">
+        <w:r>
+          <w:rPr>
+            <w:color w:val="2A78D6"/>
+            <w:sz w:val="17"/>
+          </w:rPr>
+          <w:t xml:space="preserve">Integrated Annual Report 2025, p. 8-9, 15, 2026-02-25</w:t>
+        </w:r>
+      </w:hyperlink>
+    </w:p>
+    <w:p>
+      <w:pPr>
+        <w:spacing w:after="20"/>
+        <w:ind w:left="340" w:hanging="340"/>
+      </w:pPr>
+      <w:r>
+        <w:rPr>
+          <w:sz w:val="17"/>
+        </w:rPr>
+        <w:t xml:space="preserve">33. </w:t>
+      </w:r>
+      <w:hyperlink r:id="rId38">
+        <w:r>
+          <w:rPr>
+            <w:color w:val="2A78D6"/>
+            <w:sz w:val="17"/>
+          </w:rPr>
+          <w:t xml:space="preserve">Ignitis grupė - Politikos ir sertifikatai (website, LT), 2026-10-22</w:t>
+        </w:r>
+      </w:hyperlink>
+    </w:p>
+    <w:p>
+      <w:pPr>
+        <w:spacing w:after="20"/>
+        <w:ind w:left="340" w:hanging="340"/>
+      </w:pPr>
+      <w:r>
+        <w:rPr>
+          <w:sz w:val="17"/>
+        </w:rPr>
+        <w:t xml:space="preserve">34. </w:t>
+      </w:r>
+      <w:hyperlink r:id="rId39">
+        <w:r>
+          <w:rPr>
+            <w:color w:val="2A78D6"/>
+            <w:sz w:val="17"/>
+          </w:rPr>
+          <w:t xml:space="preserve">Integrated Annual Report 2025, p. 16, 2026-02-25</w:t>
+        </w:r>
+      </w:hyperlink>
+    </w:p>
+    <w:p>
+      <w:pPr>
+        <w:spacing w:after="20"/>
+        <w:ind w:left="340" w:hanging="340"/>
+      </w:pPr>
+      <w:r>
+        <w:rPr>
+          <w:sz w:val="17"/>
+        </w:rPr>
+        <w:t xml:space="preserve">35. </w:t>
+      </w:r>
+      <w:hyperlink r:id="rId40">
+        <w:r>
+          <w:rPr>
+            <w:color w:val="2A78D6"/>
+            <w:sz w:val="17"/>
+          </w:rPr>
+          <w:t xml:space="preserve">Ignitis grupė - Verslo etika (website, LT), 2026-10-22</w:t>
+        </w:r>
+      </w:hyperlink>
+    </w:p>
+    <w:p>
+      <w:pPr>
+        <w:spacing w:after="20"/>
+        <w:ind w:left="340" w:hanging="340"/>
+      </w:pPr>
+      <w:r>
+        <w:rPr>
+          <w:sz w:val="17"/>
+        </w:rPr>
+        <w:t xml:space="preserve">36. </w:t>
+      </w:r>
+      <w:hyperlink r:id="rId37">
+        <w:r>
+          <w:rPr>
+            <w:color w:val="2A78D6"/>
+            <w:sz w:val="17"/>
+          </w:rPr>
+          <w:t xml:space="preserve">Integrated Annual Report 2025, p. 8, 2026-02-25</w:t>
+        </w:r>
+      </w:hyperlink>
+    </w:p>
+    <w:p>
+      <w:pPr>
+        <w:spacing w:after="20"/>
+        <w:ind w:left="340" w:hanging="340"/>
+      </w:pPr>
+      <w:r>
+        <w:rPr>
+          <w:sz w:val="17"/>
+        </w:rPr>
+        <w:t xml:space="preserve">37. </w:t>
+      </w:r>
+      <w:hyperlink r:id="rId41">
+        <w:r>
+          <w:rPr>
+            <w:color w:val="2A78D6"/>
+            <w:sz w:val="17"/>
+          </w:rPr>
+          <w:t xml:space="preserve">Ignitis grupė - Gamta (website, LT), 2026-10-22</w:t>
+        </w:r>
+      </w:hyperlink>
+    </w:p>
+    <w:p>
+      <w:pPr>
+        <w:spacing w:after="20"/>
+        <w:ind w:left="340" w:hanging="340"/>
+      </w:pPr>
+      <w:r>
+        <w:rPr>
+          <w:sz w:val="17"/>
+        </w:rPr>
+        <w:t xml:space="preserve">38. </w:t>
+      </w:r>
+      <w:hyperlink r:id="rId34">
+        <w:r>
+          <w:rPr>
+            <w:color w:val="2A78D6"/>
+            <w:sz w:val="17"/>
+          </w:rPr>
+          <w:t xml:space="preserve">SEB Sector Policy on Electricity &amp; Renewable Energy (2026-04-23), p. 8, 2026-04-23</w:t>
+        </w:r>
+      </w:hyperlink>
+    </w:p>
+    <w:p>
+      <w:pPr>
+        <w:spacing w:after="20"/>
+        <w:ind w:left="340" w:hanging="340"/>
+      </w:pPr>
+      <w:r>
+        <w:rPr>
+          <w:sz w:val="17"/>
+        </w:rPr>
+        <w:t xml:space="preserve">39. </w:t>
+      </w:r>
+      <w:hyperlink r:id="rId42">
+        <w:r>
+          <w:rPr>
+            <w:color w:val="2A78D6"/>
+            <w:sz w:val="17"/>
+          </w:rPr>
+          <w:t xml:space="preserve">Integrated Annual Report 2025, p. 429, 2026-02-25</w:t>
+        </w:r>
+      </w:hyperlink>
+    </w:p>
+    <w:p>
       <w:r>
         <w:rPr>
           <w:i/>

</xml_diff>

<commit_message>
Rodiklių spalvos ir pokyčio stulpelis, planų priežastys, struktūruoti ESG atsakymai, aiškesnė santrauka
Co-Authored-By: Claude Opus 5.5 (1M context) <noreply@anthropic.com>
Claude-Session: https://claude.ai/code/session_013ZCssjCF43KM8LCnCdqfwt
</commit_message>
<xml_diff>
--- a/docs/files/ignitis/ignitis_6M2026_en.docx
+++ b/docs/files/ignitis/ignitis_6M2026_en.docx
@@ -304,9 +304,15 @@
       </w:pPr>
       <w:r>
         <w:rPr>
+          <w:b/>
+        </w:rPr>
+        <w:t>Earnings on track:</w:t>
+      </w:r>
+      <w:r>
+        <w:rPr>
           <w:b w:val="0"/>
         </w:rPr>
-        <w:t>6M Adjusted EBITDA EUR 306.6m (+1.9%). Networks and Customers &amp; Solutions grew, Green Capacities declined (EUR 149.2m vs 166.6m)</w:t>
+        <w:t xml:space="preserve"> 6M Adjusted EBITDA was EUR 306.6m, up 1.9%. Networks and Customers &amp; Solutions grew; Green Capacities fell to EUR 149.2m from 166.6m</w:t>
       </w:r>
       <w:hyperlink r:id="rId12">
         <w:r>
@@ -322,7 +328,7 @@
         <w:rPr>
           <w:b w:val="0"/>
         </w:rPr>
-        <w:t>. 2026 guidance of EUR 550-600m reiterated; 6M equals 51-56% of it</w:t>
+        <w:t>. The 2026 guidance of EUR 550-600m was kept, and about half of it is already reached (51-56%)</w:t>
       </w:r>
       <w:hyperlink r:id="rId13">
         <w:r>
@@ -350,13 +356,13 @@
         <w:rPr>
           <w:b/>
         </w:rPr>
-        <w:t>Debt stable:</w:t>
+        <w:t>Debt under control:</w:t>
       </w:r>
       <w:r>
         <w:rPr>
           <w:b w:val="0"/>
         </w:rPr>
-        <w:t xml:space="preserve"> net debt EUR 1,925.3m (+0.7% since YE2025), net debt / Adjusted EBITDA 3.49x, FFO / net debt 22.2% (strategic target ≥23%)</w:t>
+        <w:t xml:space="preserve"> net debt EUR 1,925.3m, almost unchanged since year-end (+0.7%). Leverage is 3.49x net debt / EBITDA. One metric lags: FFO / net debt 22.2% against a target of at least 23%</w:t>
       </w:r>
       <w:hyperlink r:id="rId14">
         <w:r>
@@ -401,13 +407,13 @@
         <w:rPr>
           <w:b/>
         </w:rPr>
-        <w:t>Ratings unchanged:</w:t>
+        <w:t>Ratings stable:</w:t>
       </w:r>
       <w:r>
         <w:rPr>
           <w:b w:val="0"/>
         </w:rPr>
-        <w:t xml:space="preserve"> S&amp;P BBB+ (stable, 2026-07-28), Moody's Baa1 (stable, first-time rating in 2026)</w:t>
+        <w:t xml:space="preserve"> S&amp;P BBB+ (stable, confirmed 2026-07-28) and Moody's Baa1 (stable, first rating in 2026)</w:t>
       </w:r>
       <w:hyperlink r:id="rId10">
         <w:r>
@@ -435,13 +441,13 @@
         <w:rPr>
           <w:b/>
         </w:rPr>
-        <w:t>Relevant for held bond XS1646530565 (2.000%, 2027-07-14):</w:t>
+        <w:t>Decision needed on a held bond:</w:t>
       </w:r>
       <w:r>
         <w:rPr>
           <w:b w:val="0"/>
         </w:rPr>
-        <w:t xml:space="preserve"> tender offer announced on 2026-10-19, financed with a new EUR 300m 4.500% EuGB bond due 2031-10-27</w:t>
+        <w:t xml:space="preserve"> on 2026-10-19 Ignitis offered to buy back XS1646530565 (2.000%, matures 2027-07-14). The buy-back is financed by a new EUR 300m green bond at 4.500% due 2031</w:t>
       </w:r>
       <w:hyperlink r:id="rId16">
         <w:r>
@@ -484,9 +490,15 @@
       </w:pPr>
       <w:r>
         <w:rPr>
+          <w:b/>
+        </w:rPr>
+        <w:t>Profit is the weak spot:</w:t>
+      </w:r>
+      <w:r>
+        <w:rPr>
           <w:b w:val="0"/>
         </w:rPr>
-        <w:t>Adjusted net profit fell 20.8% to EUR 115.8m; Adjusted ROCE (LTM) 6.7% (8.6% a year earlier)</w:t>
+        <w:t xml:space="preserve"> adjusted net profit fell 20.8% to EUR 115.8m. Return on capital (Adjusted ROCE, LTM) dropped to 6.7% from 8.6%</w:t>
       </w:r>
       <w:hyperlink r:id="rId18">
         <w:r>
@@ -1042,16 +1054,17 @@
         </w:tblBorders>
       </w:tblPr>
       <w:tblGrid>
-        <w:gridCol w:w="1994"/>
-        <w:gridCol w:w="1994"/>
-        <w:gridCol w:w="1994"/>
-        <w:gridCol w:w="1994"/>
-        <w:gridCol w:w="1994"/>
+        <w:gridCol w:w="1662"/>
+        <w:gridCol w:w="1662"/>
+        <w:gridCol w:w="1662"/>
+        <w:gridCol w:w="1662"/>
+        <w:gridCol w:w="1662"/>
+        <w:gridCol w:w="1662"/>
       </w:tblGrid>
       <w:tr>
         <w:tc>
           <w:tcPr>
-            <w:tcW w:type="dxa" w:w="3628"/>
+            <w:tcW w:type="dxa" w:w="2948"/>
             <w:shd w:val="clear" w:color="auto" w:fill="1F4E79"/>
           </w:tcPr>
           <w:p>
@@ -1068,7 +1081,7 @@
         </w:tc>
         <w:tc>
           <w:tcPr>
-            <w:tcW w:type="dxa" w:w="1474"/>
+            <w:tcW w:type="dxa" w:w="1191"/>
             <w:shd w:val="clear" w:color="auto" w:fill="1F4E79"/>
           </w:tcPr>
           <w:p>
@@ -1088,7 +1101,7 @@
         </w:tc>
         <w:tc>
           <w:tcPr>
-            <w:tcW w:type="dxa" w:w="1474"/>
+            <w:tcW w:type="dxa" w:w="1191"/>
             <w:shd w:val="clear" w:color="auto" w:fill="1F4E79"/>
           </w:tcPr>
           <w:p>
@@ -1108,7 +1121,7 @@
         </w:tc>
         <w:tc>
           <w:tcPr>
-            <w:tcW w:type="dxa" w:w="1474"/>
+            <w:tcW w:type="dxa" w:w="1191"/>
             <w:shd w:val="clear" w:color="auto" w:fill="1F4E79"/>
           </w:tcPr>
           <w:p>
@@ -1128,7 +1141,7 @@
         </w:tc>
         <w:tc>
           <w:tcPr>
-            <w:tcW w:type="dxa" w:w="1474"/>
+            <w:tcW w:type="dxa" w:w="1191"/>
             <w:shd w:val="clear" w:color="auto" w:fill="1F4E79"/>
           </w:tcPr>
           <w:p>
@@ -1146,11 +1159,31 @@
             </w:r>
           </w:p>
         </w:tc>
+        <w:tc>
+          <w:tcPr>
+            <w:tcW w:type="dxa" w:w="2211"/>
+            <w:shd w:val="clear" w:color="auto" w:fill="1F4E79"/>
+          </w:tcPr>
+          <w:p>
+            <w:pPr>
+              <w:jc w:val="right"/>
+            </w:pPr>
+            <w:r/>
+            <w:r>
+              <w:rPr>
+                <w:b/>
+                <w:color w:val="FFFFFF"/>
+                <w:sz w:val="17"/>
+              </w:rPr>
+              <w:t>Change</w:t>
+            </w:r>
+          </w:p>
+        </w:tc>
       </w:tr>
       <w:tr>
         <w:tc>
           <w:tcPr>
-            <w:tcW w:type="dxa" w:w="3628"/>
+            <w:tcW w:type="dxa" w:w="2948"/>
           </w:tcPr>
           <w:p>
             <w:pPr>
@@ -1178,7 +1211,7 @@
         </w:tc>
         <w:tc>
           <w:tcPr>
-            <w:tcW w:type="dxa" w:w="1474"/>
+            <w:tcW w:type="dxa" w:w="1191"/>
           </w:tcPr>
           <w:p>
             <w:pPr>
@@ -1197,7 +1230,7 @@
         </w:tc>
         <w:tc>
           <w:tcPr>
-            <w:tcW w:type="dxa" w:w="1474"/>
+            <w:tcW w:type="dxa" w:w="1191"/>
           </w:tcPr>
           <w:p>
             <w:pPr>
@@ -1216,7 +1249,7 @@
         </w:tc>
         <w:tc>
           <w:tcPr>
-            <w:tcW w:type="dxa" w:w="1474"/>
+            <w:tcW w:type="dxa" w:w="1191"/>
           </w:tcPr>
           <w:p>
             <w:pPr>
@@ -1235,7 +1268,7 @@
         </w:tc>
         <w:tc>
           <w:tcPr>
-            <w:tcW w:type="dxa" w:w="1474"/>
+            <w:tcW w:type="dxa" w:w="1191"/>
           </w:tcPr>
           <w:p>
             <w:pPr>
@@ -1252,11 +1285,31 @@
             </w:r>
           </w:p>
         </w:tc>
+        <w:tc>
+          <w:tcPr>
+            <w:tcW w:type="dxa" w:w="2211"/>
+          </w:tcPr>
+          <w:p>
+            <w:pPr>
+              <w:spacing w:after="0"/>
+              <w:jc w:val="right"/>
+            </w:pPr>
+            <w:r/>
+            <w:r>
+              <w:rPr>
+                <w:b/>
+                <w:color w:val="1B7F3B"/>
+                <w:sz w:val="17"/>
+              </w:rPr>
+              <w:t>▲ 15.4 % vs 6M2025</w:t>
+            </w:r>
+          </w:p>
+        </w:tc>
       </w:tr>
       <w:tr>
         <w:tc>
           <w:tcPr>
-            <w:tcW w:type="dxa" w:w="3628"/>
+            <w:tcW w:type="dxa" w:w="2948"/>
             <w:shd w:val="clear" w:color="auto" w:fill="F6F8FA"/>
           </w:tcPr>
           <w:p>
@@ -1319,7 +1372,7 @@
         </w:tc>
         <w:tc>
           <w:tcPr>
-            <w:tcW w:type="dxa" w:w="1474"/>
+            <w:tcW w:type="dxa" w:w="1191"/>
             <w:shd w:val="clear" w:color="auto" w:fill="F6F8FA"/>
           </w:tcPr>
           <w:p>
@@ -1339,7 +1392,7 @@
         </w:tc>
         <w:tc>
           <w:tcPr>
-            <w:tcW w:type="dxa" w:w="1474"/>
+            <w:tcW w:type="dxa" w:w="1191"/>
             <w:shd w:val="clear" w:color="auto" w:fill="F6F8FA"/>
           </w:tcPr>
           <w:p>
@@ -1359,7 +1412,7 @@
         </w:tc>
         <w:tc>
           <w:tcPr>
-            <w:tcW w:type="dxa" w:w="1474"/>
+            <w:tcW w:type="dxa" w:w="1191"/>
             <w:shd w:val="clear" w:color="auto" w:fill="F6F8FA"/>
           </w:tcPr>
           <w:p>
@@ -1379,7 +1432,7 @@
         </w:tc>
         <w:tc>
           <w:tcPr>
-            <w:tcW w:type="dxa" w:w="1474"/>
+            <w:tcW w:type="dxa" w:w="1191"/>
             <w:shd w:val="clear" w:color="auto" w:fill="F6F8FA"/>
           </w:tcPr>
           <w:p>
@@ -1397,11 +1450,32 @@
             </w:r>
           </w:p>
         </w:tc>
+        <w:tc>
+          <w:tcPr>
+            <w:tcW w:type="dxa" w:w="2211"/>
+            <w:shd w:val="clear" w:color="auto" w:fill="F6F8FA"/>
+          </w:tcPr>
+          <w:p>
+            <w:pPr>
+              <w:spacing w:after="0"/>
+              <w:jc w:val="right"/>
+            </w:pPr>
+            <w:r/>
+            <w:r>
+              <w:rPr>
+                <w:b/>
+                <w:color w:val="1B7F3B"/>
+                <w:sz w:val="17"/>
+              </w:rPr>
+              <w:t>▲ 1.9 % vs 6M2025</w:t>
+            </w:r>
+          </w:p>
+        </w:tc>
       </w:tr>
       <w:tr>
         <w:tc>
           <w:tcPr>
-            <w:tcW w:type="dxa" w:w="3628"/>
+            <w:tcW w:type="dxa" w:w="2948"/>
           </w:tcPr>
           <w:p>
             <w:pPr>
@@ -1446,7 +1520,7 @@
         </w:tc>
         <w:tc>
           <w:tcPr>
-            <w:tcW w:type="dxa" w:w="1474"/>
+            <w:tcW w:type="dxa" w:w="1191"/>
           </w:tcPr>
           <w:p>
             <w:pPr>
@@ -1465,7 +1539,7 @@
         </w:tc>
         <w:tc>
           <w:tcPr>
-            <w:tcW w:type="dxa" w:w="1474"/>
+            <w:tcW w:type="dxa" w:w="1191"/>
           </w:tcPr>
           <w:p>
             <w:pPr>
@@ -1484,7 +1558,7 @@
         </w:tc>
         <w:tc>
           <w:tcPr>
-            <w:tcW w:type="dxa" w:w="1474"/>
+            <w:tcW w:type="dxa" w:w="1191"/>
           </w:tcPr>
           <w:p>
             <w:pPr>
@@ -1503,7 +1577,7 @@
         </w:tc>
         <w:tc>
           <w:tcPr>
-            <w:tcW w:type="dxa" w:w="1474"/>
+            <w:tcW w:type="dxa" w:w="1191"/>
           </w:tcPr>
           <w:p>
             <w:pPr>
@@ -1520,11 +1594,31 @@
             </w:r>
           </w:p>
         </w:tc>
+        <w:tc>
+          <w:tcPr>
+            <w:tcW w:type="dxa" w:w="2211"/>
+          </w:tcPr>
+          <w:p>
+            <w:pPr>
+              <w:spacing w:after="0"/>
+              <w:jc w:val="right"/>
+            </w:pPr>
+            <w:r/>
+            <w:r>
+              <w:rPr>
+                <w:b/>
+                <w:color w:val="1B7F3B"/>
+                <w:sz w:val="17"/>
+              </w:rPr>
+              <w:t>▲ 15.6 % vs 6M2025</w:t>
+            </w:r>
+          </w:p>
+        </w:tc>
       </w:tr>
       <w:tr>
         <w:tc>
           <w:tcPr>
-            <w:tcW w:type="dxa" w:w="3628"/>
+            <w:tcW w:type="dxa" w:w="2948"/>
             <w:shd w:val="clear" w:color="auto" w:fill="F6F8FA"/>
           </w:tcPr>
           <w:p>
@@ -1587,7 +1681,7 @@
         </w:tc>
         <w:tc>
           <w:tcPr>
-            <w:tcW w:type="dxa" w:w="1474"/>
+            <w:tcW w:type="dxa" w:w="1191"/>
             <w:shd w:val="clear" w:color="auto" w:fill="F6F8FA"/>
           </w:tcPr>
           <w:p>
@@ -1607,7 +1701,7 @@
         </w:tc>
         <w:tc>
           <w:tcPr>
-            <w:tcW w:type="dxa" w:w="1474"/>
+            <w:tcW w:type="dxa" w:w="1191"/>
             <w:shd w:val="clear" w:color="auto" w:fill="F6F8FA"/>
           </w:tcPr>
           <w:p>
@@ -1627,7 +1721,7 @@
         </w:tc>
         <w:tc>
           <w:tcPr>
-            <w:tcW w:type="dxa" w:w="1474"/>
+            <w:tcW w:type="dxa" w:w="1191"/>
             <w:shd w:val="clear" w:color="auto" w:fill="F6F8FA"/>
           </w:tcPr>
           <w:p>
@@ -1647,7 +1741,7 @@
         </w:tc>
         <w:tc>
           <w:tcPr>
-            <w:tcW w:type="dxa" w:w="1474"/>
+            <w:tcW w:type="dxa" w:w="1191"/>
             <w:shd w:val="clear" w:color="auto" w:fill="F6F8FA"/>
           </w:tcPr>
           <w:p>
@@ -1665,11 +1759,32 @@
             </w:r>
           </w:p>
         </w:tc>
+        <w:tc>
+          <w:tcPr>
+            <w:tcW w:type="dxa" w:w="2211"/>
+            <w:shd w:val="clear" w:color="auto" w:fill="F6F8FA"/>
+          </w:tcPr>
+          <w:p>
+            <w:pPr>
+              <w:spacing w:after="0"/>
+              <w:jc w:val="right"/>
+            </w:pPr>
+            <w:r/>
+            <w:r>
+              <w:rPr>
+                <w:b/>
+                <w:color w:val="B42318"/>
+                <w:sz w:val="17"/>
+              </w:rPr>
+              <w:t>▼ 20.8 % vs 6M2025</w:t>
+            </w:r>
+          </w:p>
+        </w:tc>
       </w:tr>
       <w:tr>
         <w:tc>
           <w:tcPr>
-            <w:tcW w:type="dxa" w:w="3628"/>
+            <w:tcW w:type="dxa" w:w="2948"/>
           </w:tcPr>
           <w:p>
             <w:pPr>
@@ -1714,7 +1829,7 @@
         </w:tc>
         <w:tc>
           <w:tcPr>
-            <w:tcW w:type="dxa" w:w="1474"/>
+            <w:tcW w:type="dxa" w:w="1191"/>
           </w:tcPr>
           <w:p>
             <w:pPr>
@@ -1733,7 +1848,7 @@
         </w:tc>
         <w:tc>
           <w:tcPr>
-            <w:tcW w:type="dxa" w:w="1474"/>
+            <w:tcW w:type="dxa" w:w="1191"/>
           </w:tcPr>
           <w:p>
             <w:pPr>
@@ -1752,7 +1867,7 @@
         </w:tc>
         <w:tc>
           <w:tcPr>
-            <w:tcW w:type="dxa" w:w="1474"/>
+            <w:tcW w:type="dxa" w:w="1191"/>
           </w:tcPr>
           <w:p>
             <w:pPr>
@@ -1771,7 +1886,7 @@
         </w:tc>
         <w:tc>
           <w:tcPr>
-            <w:tcW w:type="dxa" w:w="1474"/>
+            <w:tcW w:type="dxa" w:w="1191"/>
           </w:tcPr>
           <w:p>
             <w:pPr>
@@ -1788,11 +1903,31 @@
             </w:r>
           </w:p>
         </w:tc>
+        <w:tc>
+          <w:tcPr>
+            <w:tcW w:type="dxa" w:w="2211"/>
+          </w:tcPr>
+          <w:p>
+            <w:pPr>
+              <w:spacing w:after="0"/>
+              <w:jc w:val="right"/>
+            </w:pPr>
+            <w:r/>
+            <w:r>
+              <w:rPr>
+                <w:b/>
+                <w:color w:val="1B7F3B"/>
+                <w:sz w:val="17"/>
+              </w:rPr>
+              <w:t>▲ 1.6 % vs 6M2025</w:t>
+            </w:r>
+          </w:p>
+        </w:tc>
       </w:tr>
       <w:tr>
         <w:tc>
           <w:tcPr>
-            <w:tcW w:type="dxa" w:w="3628"/>
+            <w:tcW w:type="dxa" w:w="2948"/>
             <w:shd w:val="clear" w:color="auto" w:fill="F6F8FA"/>
           </w:tcPr>
           <w:p>
@@ -1855,7 +1990,7 @@
         </w:tc>
         <w:tc>
           <w:tcPr>
-            <w:tcW w:type="dxa" w:w="1474"/>
+            <w:tcW w:type="dxa" w:w="1191"/>
             <w:shd w:val="clear" w:color="auto" w:fill="F6F8FA"/>
           </w:tcPr>
           <w:p>
@@ -1875,7 +2010,7 @@
         </w:tc>
         <w:tc>
           <w:tcPr>
-            <w:tcW w:type="dxa" w:w="1474"/>
+            <w:tcW w:type="dxa" w:w="1191"/>
             <w:shd w:val="clear" w:color="auto" w:fill="F6F8FA"/>
           </w:tcPr>
           <w:p>
@@ -1895,7 +2030,7 @@
         </w:tc>
         <w:tc>
           <w:tcPr>
-            <w:tcW w:type="dxa" w:w="1474"/>
+            <w:tcW w:type="dxa" w:w="1191"/>
             <w:shd w:val="clear" w:color="auto" w:fill="F6F8FA"/>
           </w:tcPr>
           <w:p>
@@ -1915,7 +2050,7 @@
         </w:tc>
         <w:tc>
           <w:tcPr>
-            <w:tcW w:type="dxa" w:w="1474"/>
+            <w:tcW w:type="dxa" w:w="1191"/>
             <w:shd w:val="clear" w:color="auto" w:fill="F6F8FA"/>
           </w:tcPr>
           <w:p>
@@ -1933,11 +2068,32 @@
             </w:r>
           </w:p>
         </w:tc>
+        <w:tc>
+          <w:tcPr>
+            <w:tcW w:type="dxa" w:w="2211"/>
+            <w:shd w:val="clear" w:color="auto" w:fill="F6F8FA"/>
+          </w:tcPr>
+          <w:p>
+            <w:pPr>
+              <w:spacing w:after="0"/>
+              <w:jc w:val="right"/>
+            </w:pPr>
+            <w:r/>
+            <w:r>
+              <w:rPr>
+                <w:b w:val="0"/>
+                <w:color w:val="5F6B7A"/>
+                <w:sz w:val="17"/>
+              </w:rPr>
+              <w:t>▼ 10.8 % vs 6M2025</w:t>
+            </w:r>
+          </w:p>
+        </w:tc>
       </w:tr>
       <w:tr>
         <w:tc>
           <w:tcPr>
-            <w:tcW w:type="dxa" w:w="3628"/>
+            <w:tcW w:type="dxa" w:w="2948"/>
           </w:tcPr>
           <w:p>
             <w:pPr>
@@ -1965,7 +2121,7 @@
         </w:tc>
         <w:tc>
           <w:tcPr>
-            <w:tcW w:type="dxa" w:w="1474"/>
+            <w:tcW w:type="dxa" w:w="1191"/>
           </w:tcPr>
           <w:p>
             <w:pPr>
@@ -1984,7 +2140,7 @@
         </w:tc>
         <w:tc>
           <w:tcPr>
-            <w:tcW w:type="dxa" w:w="1474"/>
+            <w:tcW w:type="dxa" w:w="1191"/>
           </w:tcPr>
           <w:p>
             <w:pPr>
@@ -2003,7 +2159,7 @@
         </w:tc>
         <w:tc>
           <w:tcPr>
-            <w:tcW w:type="dxa" w:w="1474"/>
+            <w:tcW w:type="dxa" w:w="1191"/>
           </w:tcPr>
           <w:p>
             <w:pPr>
@@ -2022,7 +2178,7 @@
         </w:tc>
         <w:tc>
           <w:tcPr>
-            <w:tcW w:type="dxa" w:w="1474"/>
+            <w:tcW w:type="dxa" w:w="1191"/>
           </w:tcPr>
           <w:p>
             <w:pPr>
@@ -2039,11 +2195,31 @@
             </w:r>
           </w:p>
         </w:tc>
+        <w:tc>
+          <w:tcPr>
+            <w:tcW w:type="dxa" w:w="2211"/>
+          </w:tcPr>
+          <w:p>
+            <w:pPr>
+              <w:spacing w:after="0"/>
+              <w:jc w:val="right"/>
+            </w:pPr>
+            <w:r/>
+            <w:r>
+              <w:rPr>
+                <w:b/>
+                <w:color w:val="1B7F3B"/>
+                <w:sz w:val="17"/>
+              </w:rPr>
+              <w:t>▲ 11.3 % vs 6M2025</w:t>
+            </w:r>
+          </w:p>
+        </w:tc>
       </w:tr>
       <w:tr>
         <w:tc>
           <w:tcPr>
-            <w:tcW w:type="dxa" w:w="3628"/>
+            <w:tcW w:type="dxa" w:w="2948"/>
             <w:shd w:val="clear" w:color="auto" w:fill="F6F8FA"/>
           </w:tcPr>
           <w:p>
@@ -2072,7 +2248,7 @@
         </w:tc>
         <w:tc>
           <w:tcPr>
-            <w:tcW w:type="dxa" w:w="1474"/>
+            <w:tcW w:type="dxa" w:w="1191"/>
             <w:shd w:val="clear" w:color="auto" w:fill="F6F8FA"/>
           </w:tcPr>
           <w:p>
@@ -2092,7 +2268,7 @@
         </w:tc>
         <w:tc>
           <w:tcPr>
-            <w:tcW w:type="dxa" w:w="1474"/>
+            <w:tcW w:type="dxa" w:w="1191"/>
             <w:shd w:val="clear" w:color="auto" w:fill="F6F8FA"/>
           </w:tcPr>
           <w:p>
@@ -2112,7 +2288,7 @@
         </w:tc>
         <w:tc>
           <w:tcPr>
-            <w:tcW w:type="dxa" w:w="1474"/>
+            <w:tcW w:type="dxa" w:w="1191"/>
             <w:shd w:val="clear" w:color="auto" w:fill="F6F8FA"/>
           </w:tcPr>
           <w:p>
@@ -2132,7 +2308,7 @@
         </w:tc>
         <w:tc>
           <w:tcPr>
-            <w:tcW w:type="dxa" w:w="1474"/>
+            <w:tcW w:type="dxa" w:w="1191"/>
             <w:shd w:val="clear" w:color="auto" w:fill="F6F8FA"/>
           </w:tcPr>
           <w:p>
@@ -2150,11 +2326,32 @@
             </w:r>
           </w:p>
         </w:tc>
+        <w:tc>
+          <w:tcPr>
+            <w:tcW w:type="dxa" w:w="2211"/>
+            <w:shd w:val="clear" w:color="auto" w:fill="F6F8FA"/>
+          </w:tcPr>
+          <w:p>
+            <w:pPr>
+              <w:spacing w:after="0"/>
+              <w:jc w:val="right"/>
+            </w:pPr>
+            <w:r/>
+            <w:r>
+              <w:rPr>
+                <w:b/>
+                <w:color w:val="B42318"/>
+                <w:sz w:val="17"/>
+              </w:rPr>
+              <w:t>▼ 91.7 % vs 6M2025</w:t>
+            </w:r>
+          </w:p>
+        </w:tc>
       </w:tr>
       <w:tr>
         <w:tc>
           <w:tcPr>
-            <w:tcW w:type="dxa" w:w="3628"/>
+            <w:tcW w:type="dxa" w:w="2948"/>
           </w:tcPr>
           <w:p>
             <w:pPr>
@@ -2199,7 +2396,7 @@
         </w:tc>
         <w:tc>
           <w:tcPr>
-            <w:tcW w:type="dxa" w:w="1474"/>
+            <w:tcW w:type="dxa" w:w="1191"/>
           </w:tcPr>
           <w:p>
             <w:pPr>
@@ -2218,7 +2415,7 @@
         </w:tc>
         <w:tc>
           <w:tcPr>
-            <w:tcW w:type="dxa" w:w="1474"/>
+            <w:tcW w:type="dxa" w:w="1191"/>
           </w:tcPr>
           <w:p>
             <w:pPr>
@@ -2237,7 +2434,7 @@
         </w:tc>
         <w:tc>
           <w:tcPr>
-            <w:tcW w:type="dxa" w:w="1474"/>
+            <w:tcW w:type="dxa" w:w="1191"/>
           </w:tcPr>
           <w:p>
             <w:pPr>
@@ -2256,7 +2453,7 @@
         </w:tc>
         <w:tc>
           <w:tcPr>
-            <w:tcW w:type="dxa" w:w="1474"/>
+            <w:tcW w:type="dxa" w:w="1191"/>
           </w:tcPr>
           <w:p>
             <w:pPr>
@@ -2273,11 +2470,31 @@
             </w:r>
           </w:p>
         </w:tc>
+        <w:tc>
+          <w:tcPr>
+            <w:tcW w:type="dxa" w:w="2211"/>
+          </w:tcPr>
+          <w:p>
+            <w:pPr>
+              <w:spacing w:after="0"/>
+              <w:jc w:val="right"/>
+            </w:pPr>
+            <w:r/>
+            <w:r>
+              <w:rPr>
+                <w:b/>
+                <w:color w:val="B42318"/>
+                <w:sz w:val="17"/>
+              </w:rPr>
+              <w:t>▲ 0.7 % vs FY2025</w:t>
+            </w:r>
+          </w:p>
+        </w:tc>
       </w:tr>
       <w:tr>
         <w:tc>
           <w:tcPr>
-            <w:tcW w:type="dxa" w:w="3628"/>
+            <w:tcW w:type="dxa" w:w="2948"/>
             <w:shd w:val="clear" w:color="auto" w:fill="F6F8FA"/>
           </w:tcPr>
           <w:p>
@@ -2323,7 +2540,7 @@
         </w:tc>
         <w:tc>
           <w:tcPr>
-            <w:tcW w:type="dxa" w:w="1474"/>
+            <w:tcW w:type="dxa" w:w="1191"/>
             <w:shd w:val="clear" w:color="auto" w:fill="F6F8FA"/>
           </w:tcPr>
           <w:p>
@@ -2343,7 +2560,7 @@
         </w:tc>
         <w:tc>
           <w:tcPr>
-            <w:tcW w:type="dxa" w:w="1474"/>
+            <w:tcW w:type="dxa" w:w="1191"/>
             <w:shd w:val="clear" w:color="auto" w:fill="F6F8FA"/>
           </w:tcPr>
           <w:p>
@@ -2363,7 +2580,7 @@
         </w:tc>
         <w:tc>
           <w:tcPr>
-            <w:tcW w:type="dxa" w:w="1474"/>
+            <w:tcW w:type="dxa" w:w="1191"/>
             <w:shd w:val="clear" w:color="auto" w:fill="F6F8FA"/>
           </w:tcPr>
           <w:p>
@@ -2383,7 +2600,27 @@
         </w:tc>
         <w:tc>
           <w:tcPr>
-            <w:tcW w:type="dxa" w:w="1474"/>
+            <w:tcW w:type="dxa" w:w="1191"/>
+            <w:shd w:val="clear" w:color="auto" w:fill="FDF1D8"/>
+          </w:tcPr>
+          <w:p>
+            <w:pPr>
+              <w:spacing w:after="0"/>
+              <w:jc w:val="right"/>
+            </w:pPr>
+            <w:r/>
+            <w:r>
+              <w:rPr>
+                <w:b/>
+                <w:sz w:val="17"/>
+              </w:rPr>
+              <w:t>3.49x</w:t>
+            </w:r>
+          </w:p>
+        </w:tc>
+        <w:tc>
+          <w:tcPr>
+            <w:tcW w:type="dxa" w:w="2211"/>
             <w:shd w:val="clear" w:color="auto" w:fill="F6F8FA"/>
           </w:tcPr>
           <w:p>
@@ -2394,10 +2631,11 @@
             <w:r/>
             <w:r>
               <w:rPr>
-                <w:b w:val="0"/>
+                <w:b/>
+                <w:color w:val="1B7F3B"/>
                 <w:sz w:val="17"/>
               </w:rPr>
-              <w:t>3.49x</w:t>
+              <w:t>▼ 0.01x vs FY2025</w:t>
             </w:r>
           </w:p>
         </w:tc>
@@ -2405,7 +2643,7 @@
       <w:tr>
         <w:tc>
           <w:tcPr>
-            <w:tcW w:type="dxa" w:w="3628"/>
+            <w:tcW w:type="dxa" w:w="2948"/>
           </w:tcPr>
           <w:p>
             <w:pPr>
@@ -2450,7 +2688,7 @@
         </w:tc>
         <w:tc>
           <w:tcPr>
-            <w:tcW w:type="dxa" w:w="1474"/>
+            <w:tcW w:type="dxa" w:w="1191"/>
           </w:tcPr>
           <w:p>
             <w:pPr>
@@ -2469,7 +2707,7 @@
         </w:tc>
         <w:tc>
           <w:tcPr>
-            <w:tcW w:type="dxa" w:w="1474"/>
+            <w:tcW w:type="dxa" w:w="1191"/>
           </w:tcPr>
           <w:p>
             <w:pPr>
@@ -2488,7 +2726,7 @@
         </w:tc>
         <w:tc>
           <w:tcPr>
-            <w:tcW w:type="dxa" w:w="1474"/>
+            <w:tcW w:type="dxa" w:w="1191"/>
           </w:tcPr>
           <w:p>
             <w:pPr>
@@ -2507,7 +2745,8 @@
         </w:tc>
         <w:tc>
           <w:tcPr>
-            <w:tcW w:type="dxa" w:w="1474"/>
+            <w:tcW w:type="dxa" w:w="1191"/>
+            <w:shd w:val="clear" w:color="auto" w:fill="FDF1D8"/>
           </w:tcPr>
           <w:p>
             <w:pPr>
@@ -2517,10 +2756,30 @@
             <w:r/>
             <w:r>
               <w:rPr>
-                <w:b w:val="0"/>
+                <w:b/>
                 <w:sz w:val="17"/>
               </w:rPr>
               <w:t>22.2%</w:t>
+            </w:r>
+          </w:p>
+        </w:tc>
+        <w:tc>
+          <w:tcPr>
+            <w:tcW w:type="dxa" w:w="2211"/>
+          </w:tcPr>
+          <w:p>
+            <w:pPr>
+              <w:spacing w:after="0"/>
+              <w:jc w:val="right"/>
+            </w:pPr>
+            <w:r/>
+            <w:r>
+              <w:rPr>
+                <w:b/>
+                <w:color w:val="1B7F3B"/>
+                <w:sz w:val="17"/>
+              </w:rPr>
+              <w:t>▲ 1.2 p. p. vs FY2025</w:t>
             </w:r>
           </w:p>
         </w:tc>
@@ -2528,7 +2787,7 @@
       <w:tr>
         <w:tc>
           <w:tcPr>
-            <w:tcW w:type="dxa" w:w="3628"/>
+            <w:tcW w:type="dxa" w:w="2948"/>
             <w:shd w:val="clear" w:color="auto" w:fill="F6F8FA"/>
           </w:tcPr>
           <w:p>
@@ -2574,7 +2833,7 @@
         </w:tc>
         <w:tc>
           <w:tcPr>
-            <w:tcW w:type="dxa" w:w="1474"/>
+            <w:tcW w:type="dxa" w:w="1191"/>
             <w:shd w:val="clear" w:color="auto" w:fill="F6F8FA"/>
           </w:tcPr>
           <w:p>
@@ -2594,7 +2853,7 @@
         </w:tc>
         <w:tc>
           <w:tcPr>
-            <w:tcW w:type="dxa" w:w="1474"/>
+            <w:tcW w:type="dxa" w:w="1191"/>
             <w:shd w:val="clear" w:color="auto" w:fill="F6F8FA"/>
           </w:tcPr>
           <w:p>
@@ -2614,7 +2873,7 @@
         </w:tc>
         <w:tc>
           <w:tcPr>
-            <w:tcW w:type="dxa" w:w="1474"/>
+            <w:tcW w:type="dxa" w:w="1191"/>
             <w:shd w:val="clear" w:color="auto" w:fill="F6F8FA"/>
           </w:tcPr>
           <w:p>
@@ -2634,7 +2893,27 @@
         </w:tc>
         <w:tc>
           <w:tcPr>
-            <w:tcW w:type="dxa" w:w="1474"/>
+            <w:tcW w:type="dxa" w:w="1191"/>
+            <w:shd w:val="clear" w:color="auto" w:fill="FDF1D8"/>
+          </w:tcPr>
+          <w:p>
+            <w:pPr>
+              <w:spacing w:after="0"/>
+              <w:jc w:val="right"/>
+            </w:pPr>
+            <w:r/>
+            <w:r>
+              <w:rPr>
+                <w:b/>
+                <w:sz w:val="17"/>
+              </w:rPr>
+              <w:t>6.7%</w:t>
+            </w:r>
+          </w:p>
+        </w:tc>
+        <w:tc>
+          <w:tcPr>
+            <w:tcW w:type="dxa" w:w="2211"/>
             <w:shd w:val="clear" w:color="auto" w:fill="F6F8FA"/>
           </w:tcPr>
           <w:p>
@@ -2645,10 +2924,11 @@
             <w:r/>
             <w:r>
               <w:rPr>
-                <w:b w:val="0"/>
+                <w:b/>
+                <w:color w:val="B42318"/>
                 <w:sz w:val="17"/>
               </w:rPr>
-              <w:t>6.7%</w:t>
+              <w:t>▼ 0.8 p. p. vs FY2025</w:t>
             </w:r>
           </w:p>
         </w:tc>
@@ -2656,7 +2936,7 @@
       <w:tr>
         <w:tc>
           <w:tcPr>
-            <w:tcW w:type="dxa" w:w="3628"/>
+            <w:tcW w:type="dxa" w:w="2948"/>
           </w:tcPr>
           <w:p>
             <w:pPr>
@@ -2684,7 +2964,7 @@
         </w:tc>
         <w:tc>
           <w:tcPr>
-            <w:tcW w:type="dxa" w:w="1474"/>
+            <w:tcW w:type="dxa" w:w="1191"/>
           </w:tcPr>
           <w:p>
             <w:pPr>
@@ -2703,7 +2983,7 @@
         </w:tc>
         <w:tc>
           <w:tcPr>
-            <w:tcW w:type="dxa" w:w="1474"/>
+            <w:tcW w:type="dxa" w:w="1191"/>
           </w:tcPr>
           <w:p>
             <w:pPr>
@@ -2722,7 +3002,7 @@
         </w:tc>
         <w:tc>
           <w:tcPr>
-            <w:tcW w:type="dxa" w:w="1474"/>
+            <w:tcW w:type="dxa" w:w="1191"/>
           </w:tcPr>
           <w:p>
             <w:pPr>
@@ -2741,7 +3021,7 @@
         </w:tc>
         <w:tc>
           <w:tcPr>
-            <w:tcW w:type="dxa" w:w="1474"/>
+            <w:tcW w:type="dxa" w:w="1191"/>
           </w:tcPr>
           <w:p>
             <w:pPr>
@@ -2758,11 +3038,31 @@
             </w:r>
           </w:p>
         </w:tc>
+        <w:tc>
+          <w:tcPr>
+            <w:tcW w:type="dxa" w:w="2211"/>
+          </w:tcPr>
+          <w:p>
+            <w:pPr>
+              <w:spacing w:after="0"/>
+              <w:jc w:val="right"/>
+            </w:pPr>
+            <w:r/>
+            <w:r>
+              <w:rPr>
+                <w:b/>
+                <w:color w:val="1B7F3B"/>
+                <w:sz w:val="17"/>
+              </w:rPr>
+              <w:t>▲ 5.7 % vs FY2025</w:t>
+            </w:r>
+          </w:p>
+        </w:tc>
       </w:tr>
       <w:tr>
         <w:tc>
           <w:tcPr>
-            <w:tcW w:type="dxa" w:w="3628"/>
+            <w:tcW w:type="dxa" w:w="2948"/>
             <w:shd w:val="clear" w:color="auto" w:fill="F6F8FA"/>
           </w:tcPr>
           <w:p>
@@ -2791,7 +3091,7 @@
         </w:tc>
         <w:tc>
           <w:tcPr>
-            <w:tcW w:type="dxa" w:w="1474"/>
+            <w:tcW w:type="dxa" w:w="1191"/>
             <w:shd w:val="clear" w:color="auto" w:fill="F6F8FA"/>
           </w:tcPr>
           <w:p>
@@ -2811,7 +3111,7 @@
         </w:tc>
         <w:tc>
           <w:tcPr>
-            <w:tcW w:type="dxa" w:w="1474"/>
+            <w:tcW w:type="dxa" w:w="1191"/>
             <w:shd w:val="clear" w:color="auto" w:fill="F6F8FA"/>
           </w:tcPr>
           <w:p>
@@ -2831,7 +3131,7 @@
         </w:tc>
         <w:tc>
           <w:tcPr>
-            <w:tcW w:type="dxa" w:w="1474"/>
+            <w:tcW w:type="dxa" w:w="1191"/>
             <w:shd w:val="clear" w:color="auto" w:fill="F6F8FA"/>
           </w:tcPr>
           <w:p>
@@ -2851,7 +3151,7 @@
         </w:tc>
         <w:tc>
           <w:tcPr>
-            <w:tcW w:type="dxa" w:w="1474"/>
+            <w:tcW w:type="dxa" w:w="1191"/>
             <w:shd w:val="clear" w:color="auto" w:fill="F6F8FA"/>
           </w:tcPr>
           <w:p>
@@ -2869,11 +3169,32 @@
             </w:r>
           </w:p>
         </w:tc>
+        <w:tc>
+          <w:tcPr>
+            <w:tcW w:type="dxa" w:w="2211"/>
+            <w:shd w:val="clear" w:color="auto" w:fill="F6F8FA"/>
+          </w:tcPr>
+          <w:p>
+            <w:pPr>
+              <w:spacing w:after="0"/>
+              <w:jc w:val="right"/>
+            </w:pPr>
+            <w:r/>
+            <w:r>
+              <w:rPr>
+                <w:b w:val="0"/>
+                <w:color w:val="5F6B7A"/>
+                <w:sz w:val="17"/>
+              </w:rPr>
+              <w:t>▲ 1.0 % vs FY2025</w:t>
+            </w:r>
+          </w:p>
+        </w:tc>
       </w:tr>
       <w:tr>
         <w:tc>
           <w:tcPr>
-            <w:tcW w:type="dxa" w:w="3628"/>
+            <w:tcW w:type="dxa" w:w="2948"/>
           </w:tcPr>
           <w:p>
             <w:pPr>
@@ -2935,7 +3256,7 @@
         </w:tc>
         <w:tc>
           <w:tcPr>
-            <w:tcW w:type="dxa" w:w="1474"/>
+            <w:tcW w:type="dxa" w:w="1191"/>
           </w:tcPr>
           <w:p>
             <w:pPr>
@@ -2954,7 +3275,7 @@
         </w:tc>
         <w:tc>
           <w:tcPr>
-            <w:tcW w:type="dxa" w:w="1474"/>
+            <w:tcW w:type="dxa" w:w="1191"/>
           </w:tcPr>
           <w:p>
             <w:pPr>
@@ -2973,7 +3294,7 @@
         </w:tc>
         <w:tc>
           <w:tcPr>
-            <w:tcW w:type="dxa" w:w="1474"/>
+            <w:tcW w:type="dxa" w:w="1191"/>
           </w:tcPr>
           <w:p>
             <w:pPr>
@@ -2992,7 +3313,7 @@
         </w:tc>
         <w:tc>
           <w:tcPr>
-            <w:tcW w:type="dxa" w:w="1474"/>
+            <w:tcW w:type="dxa" w:w="1191"/>
           </w:tcPr>
           <w:p>
             <w:pPr>
@@ -3009,11 +3330,31 @@
             </w:r>
           </w:p>
         </w:tc>
+        <w:tc>
+          <w:tcPr>
+            <w:tcW w:type="dxa" w:w="2211"/>
+          </w:tcPr>
+          <w:p>
+            <w:pPr>
+              <w:spacing w:after="0"/>
+              <w:jc w:val="right"/>
+            </w:pPr>
+            <w:r/>
+            <w:r>
+              <w:rPr>
+                <w:b w:val="0"/>
+                <w:color w:val="5F6B7A"/>
+                <w:sz w:val="17"/>
+              </w:rPr>
+              <w:t>–</w:t>
+            </w:r>
+          </w:p>
+        </w:tc>
       </w:tr>
       <w:tr>
         <w:tc>
           <w:tcPr>
-            <w:tcW w:type="dxa" w:w="3628"/>
+            <w:tcW w:type="dxa" w:w="2948"/>
             <w:shd w:val="clear" w:color="auto" w:fill="F6F8FA"/>
           </w:tcPr>
           <w:p>
@@ -3059,7 +3400,7 @@
         </w:tc>
         <w:tc>
           <w:tcPr>
-            <w:tcW w:type="dxa" w:w="1474"/>
+            <w:tcW w:type="dxa" w:w="1191"/>
             <w:shd w:val="clear" w:color="auto" w:fill="F6F8FA"/>
           </w:tcPr>
           <w:p>
@@ -3079,7 +3420,7 @@
         </w:tc>
         <w:tc>
           <w:tcPr>
-            <w:tcW w:type="dxa" w:w="1474"/>
+            <w:tcW w:type="dxa" w:w="1191"/>
             <w:shd w:val="clear" w:color="auto" w:fill="F6F8FA"/>
           </w:tcPr>
           <w:p>
@@ -3099,7 +3440,7 @@
         </w:tc>
         <w:tc>
           <w:tcPr>
-            <w:tcW w:type="dxa" w:w="1474"/>
+            <w:tcW w:type="dxa" w:w="1191"/>
             <w:shd w:val="clear" w:color="auto" w:fill="F6F8FA"/>
           </w:tcPr>
           <w:p>
@@ -3119,7 +3460,7 @@
         </w:tc>
         <w:tc>
           <w:tcPr>
-            <w:tcW w:type="dxa" w:w="1474"/>
+            <w:tcW w:type="dxa" w:w="1191"/>
             <w:shd w:val="clear" w:color="auto" w:fill="F6F8FA"/>
           </w:tcPr>
           <w:p>
@@ -3137,8 +3478,39 @@
             </w:r>
           </w:p>
         </w:tc>
+        <w:tc>
+          <w:tcPr>
+            <w:tcW w:type="dxa" w:w="2211"/>
+            <w:shd w:val="clear" w:color="auto" w:fill="F6F8FA"/>
+          </w:tcPr>
+          <w:p>
+            <w:pPr>
+              <w:spacing w:after="0"/>
+              <w:jc w:val="right"/>
+            </w:pPr>
+            <w:r/>
+            <w:r>
+              <w:rPr>
+                <w:b w:val="0"/>
+                <w:color w:val="5F6B7A"/>
+                <w:sz w:val="17"/>
+              </w:rPr>
+              <w:t>• 0.0 % vs FY2025</w:t>
+            </w:r>
+          </w:p>
+        </w:tc>
       </w:tr>
     </w:tbl>
+    <w:p>
+      <w:r>
+        <w:rPr>
+          <w:i/>
+          <w:color w:val="5F6B7A"/>
+          <w:sz w:val="16"/>
+        </w:rPr>
+        <w:t>Colours: green change – the metric is improving, red – worsening. Latest-period cell background: green – good level, amber – average, red – weak (tool benchmarks, config/metric_rules.yaml).</w:t>
+      </w:r>
+    </w:p>
     <w:p>
       <w:r>
         <w:rPr>
@@ -3624,14 +3996,15 @@
         </w:tblBorders>
       </w:tblPr>
       <w:tblGrid>
-        <w:gridCol w:w="3324"/>
-        <w:gridCol w:w="3324"/>
-        <w:gridCol w:w="3324"/>
+        <w:gridCol w:w="2493"/>
+        <w:gridCol w:w="2493"/>
+        <w:gridCol w:w="2493"/>
+        <w:gridCol w:w="2493"/>
       </w:tblGrid>
       <w:tr>
         <w:tc>
           <w:tcPr>
-            <w:tcW w:type="dxa" w:w="3969"/>
+            <w:tcW w:type="dxa" w:w="2608"/>
             <w:shd w:val="clear" w:color="auto" w:fill="1F4E79"/>
           </w:tcPr>
           <w:p>
@@ -3648,7 +4021,7 @@
         </w:tc>
         <w:tc>
           <w:tcPr>
-            <w:tcW w:type="dxa" w:w="4082"/>
+            <w:tcW w:type="dxa" w:w="2608"/>
             <w:shd w:val="clear" w:color="auto" w:fill="1F4E79"/>
           </w:tcPr>
           <w:p>
@@ -3665,7 +4038,24 @@
         </w:tc>
         <w:tc>
           <w:tcPr>
-            <w:tcW w:type="dxa" w:w="1587"/>
+            <w:tcW w:type="dxa" w:w="3175"/>
+            <w:shd w:val="clear" w:color="auto" w:fill="1F4E79"/>
+          </w:tcPr>
+          <w:p>
+            <w:r/>
+            <w:r>
+              <w:rPr>
+                <w:b/>
+                <w:color w:val="FFFFFF"/>
+                <w:sz w:val="17"/>
+              </w:rPr>
+              <w:t>What changed and why</w:t>
+            </w:r>
+          </w:p>
+        </w:tc>
+        <w:tc>
+          <w:tcPr>
+            <w:tcW w:type="dxa" w:w="1361"/>
             <w:shd w:val="clear" w:color="auto" w:fill="1F4E79"/>
           </w:tcPr>
           <w:p>
@@ -3684,7 +4074,7 @@
       <w:tr>
         <w:tc>
           <w:tcPr>
-            <w:tcW w:type="dxa" w:w="3969"/>
+            <w:tcW w:type="dxa" w:w="2608"/>
           </w:tcPr>
           <w:p>
             <w:pPr>
@@ -3702,7 +4092,7 @@
         </w:tc>
         <w:tc>
           <w:tcPr>
-            <w:tcW w:type="dxa" w:w="4082"/>
+            <w:tcW w:type="dxa" w:w="2608"/>
           </w:tcPr>
           <w:p>
             <w:pPr>
@@ -3747,7 +4137,59 @@
         </w:tc>
         <w:tc>
           <w:tcPr>
-            <w:tcW w:type="dxa" w:w="1587"/>
+            <w:tcW w:type="dxa" w:w="3175"/>
+          </w:tcPr>
+          <w:p>
+            <w:pPr>
+              <w:spacing w:after="0"/>
+            </w:pPr>
+            <w:r/>
+            <w:r>
+              <w:rPr>
+                <w:b w:val="0"/>
+                <w:sz w:val="17"/>
+              </w:rPr>
+              <w:t>On track: 6M covers 51-56% of the range. Networks and Customers &amp; Solutions grew; Green Capacities fell on weaker wind and a lower hedge price</w:t>
+            </w:r>
+            <w:hyperlink r:id="rId12">
+              <w:r>
+                <w:rPr>
+                  <w:color w:val="2A78D6"/>
+                  <w:vertAlign w:val="superscript"/>
+                  <w:sz w:val="14"/>
+                </w:rPr>
+                <w:t xml:space="preserve">3</w:t>
+              </w:r>
+            </w:hyperlink>
+            <w:r>
+              <w:rPr>
+                <w:color w:val="2A78D6"/>
+                <w:vertAlign w:val="superscript"/>
+              </w:rPr>
+              <w:t>,</w:t>
+            </w:r>
+            <w:hyperlink r:id="rId27">
+              <w:r>
+                <w:rPr>
+                  <w:color w:val="2A78D6"/>
+                  <w:vertAlign w:val="superscript"/>
+                  <w:sz w:val="14"/>
+                </w:rPr>
+                <w:t xml:space="preserve">18</w:t>
+              </w:r>
+            </w:hyperlink>
+            <w:r>
+              <w:rPr>
+                <w:b w:val="0"/>
+                <w:sz w:val="17"/>
+              </w:rPr>
+              <w:t>.</w:t>
+            </w:r>
+          </w:p>
+        </w:tc>
+        <w:tc>
+          <w:tcPr>
+            <w:tcW w:type="dxa" w:w="1361"/>
             <w:shd w:val="clear" w:color="auto" w:fill="EAF1F8"/>
           </w:tcPr>
           <w:p>
@@ -3768,7 +4210,7 @@
       <w:tr>
         <w:tc>
           <w:tcPr>
-            <w:tcW w:type="dxa" w:w="3969"/>
+            <w:tcW w:type="dxa" w:w="2608"/>
             <w:shd w:val="clear" w:color="auto" w:fill="F6F8FA"/>
           </w:tcPr>
           <w:p>
@@ -3787,7 +4229,7 @@
         </w:tc>
         <w:tc>
           <w:tcPr>
-            <w:tcW w:type="dxa" w:w="4082"/>
+            <w:tcW w:type="dxa" w:w="2608"/>
             <w:shd w:val="clear" w:color="auto" w:fill="F6F8FA"/>
           </w:tcPr>
           <w:p>
@@ -3833,7 +4275,43 @@
         </w:tc>
         <w:tc>
           <w:tcPr>
-            <w:tcW w:type="dxa" w:w="1587"/>
+            <w:tcW w:type="dxa" w:w="3175"/>
+            <w:shd w:val="clear" w:color="auto" w:fill="F6F8FA"/>
+          </w:tcPr>
+          <w:p>
+            <w:pPr>
+              <w:spacing w:after="0"/>
+            </w:pPr>
+            <w:r/>
+            <w:r>
+              <w:rPr>
+                <w:b w:val="0"/>
+                <w:sz w:val="17"/>
+              </w:rPr>
+              <w:t>On track: 6M investments EUR 306.1m (−10.8% y/y); 68% went to Networks</w:t>
+            </w:r>
+            <w:hyperlink r:id="rId26">
+              <w:r>
+                <w:rPr>
+                  <w:color w:val="2A78D6"/>
+                  <w:vertAlign w:val="superscript"/>
+                  <w:sz w:val="14"/>
+                </w:rPr>
+                <w:t xml:space="preserve">23</w:t>
+              </w:r>
+            </w:hyperlink>
+            <w:r>
+              <w:rPr>
+                <w:b w:val="0"/>
+                <w:sz w:val="17"/>
+              </w:rPr>
+              <w:t>.</w:t>
+            </w:r>
+          </w:p>
+        </w:tc>
+        <w:tc>
+          <w:tcPr>
+            <w:tcW w:type="dxa" w:w="1361"/>
             <w:shd w:val="clear" w:color="auto" w:fill="EAF1F8"/>
           </w:tcPr>
           <w:p>
@@ -3854,7 +4332,7 @@
       <w:tr>
         <w:tc>
           <w:tcPr>
-            <w:tcW w:type="dxa" w:w="3969"/>
+            <w:tcW w:type="dxa" w:w="2608"/>
           </w:tcPr>
           <w:p>
             <w:pPr>
@@ -3872,7 +4350,7 @@
         </w:tc>
         <w:tc>
           <w:tcPr>
-            <w:tcW w:type="dxa" w:w="4082"/>
+            <w:tcW w:type="dxa" w:w="2608"/>
           </w:tcPr>
           <w:p>
             <w:pPr>
@@ -3917,7 +4395,42 @@
         </w:tc>
         <w:tc>
           <w:tcPr>
-            <w:tcW w:type="dxa" w:w="1587"/>
+            <w:tcW w:type="dxa" w:w="3175"/>
+          </w:tcPr>
+          <w:p>
+            <w:pPr>
+              <w:spacing w:after="0"/>
+            </w:pPr>
+            <w:r/>
+            <w:r>
+              <w:rPr>
+                <w:b w:val="0"/>
+                <w:sz w:val="17"/>
+              </w:rPr>
+              <w:t>Changed: the new 2026-2029 plan cuts the investment envelope to EUR 2.5-3.0bn and raises the EBITDA target to EUR 640-700m for 2029. Reason: not stated in the sources reviewed</w:t>
+            </w:r>
+            <w:hyperlink r:id="rId15">
+              <w:r>
+                <w:rPr>
+                  <w:color w:val="2A78D6"/>
+                  <w:vertAlign w:val="superscript"/>
+                  <w:sz w:val="14"/>
+                </w:rPr>
+                <w:t xml:space="preserve">6</w:t>
+              </w:r>
+            </w:hyperlink>
+            <w:r>
+              <w:rPr>
+                <w:b w:val="0"/>
+                <w:sz w:val="17"/>
+              </w:rPr>
+              <w:t>.</w:t>
+            </w:r>
+          </w:p>
+        </w:tc>
+        <w:tc>
+          <w:tcPr>
+            <w:tcW w:type="dxa" w:w="1361"/>
             <w:shd w:val="clear" w:color="auto" w:fill="FDF1D8"/>
           </w:tcPr>
           <w:p>
@@ -3938,7 +4451,7 @@
       <w:tr>
         <w:tc>
           <w:tcPr>
-            <w:tcW w:type="dxa" w:w="3969"/>
+            <w:tcW w:type="dxa" w:w="2608"/>
             <w:shd w:val="clear" w:color="auto" w:fill="F6F8FA"/>
           </w:tcPr>
           <w:p>
@@ -3957,7 +4470,7 @@
         </w:tc>
         <w:tc>
           <w:tcPr>
-            <w:tcW w:type="dxa" w:w="4082"/>
+            <w:tcW w:type="dxa" w:w="2608"/>
             <w:shd w:val="clear" w:color="auto" w:fill="F6F8FA"/>
           </w:tcPr>
           <w:p>
@@ -4003,7 +4516,43 @@
         </w:tc>
         <w:tc>
           <w:tcPr>
-            <w:tcW w:type="dxa" w:w="1587"/>
+            <w:tcW w:type="dxa" w:w="3175"/>
+            <w:shd w:val="clear" w:color="auto" w:fill="F6F8FA"/>
+          </w:tcPr>
+          <w:p>
+            <w:pPr>
+              <w:spacing w:after="0"/>
+            </w:pPr>
+            <w:r/>
+            <w:r>
+              <w:rPr>
+                <w:b w:val="0"/>
+                <w:sz w:val="17"/>
+              </w:rPr>
+              <w:t>Improving but still below target: 21.0% → 22.2% as FFO grew 11.3% while net debt stayed flat (+0.7%)</w:t>
+            </w:r>
+            <w:hyperlink r:id="rId14">
+              <w:r>
+                <w:rPr>
+                  <w:color w:val="2A78D6"/>
+                  <w:vertAlign w:val="superscript"/>
+                  <w:sz w:val="14"/>
+                </w:rPr>
+                <w:t xml:space="preserve">25</w:t>
+              </w:r>
+            </w:hyperlink>
+            <w:r>
+              <w:rPr>
+                <w:b w:val="0"/>
+                <w:sz w:val="17"/>
+              </w:rPr>
+              <w:t>.</w:t>
+            </w:r>
+          </w:p>
+        </w:tc>
+        <w:tc>
+          <w:tcPr>
+            <w:tcW w:type="dxa" w:w="1361"/>
             <w:shd w:val="clear" w:color="auto" w:fill="FDE7E5"/>
           </w:tcPr>
           <w:p>
@@ -4024,7 +4573,7 @@
       <w:tr>
         <w:tc>
           <w:tcPr>
-            <w:tcW w:type="dxa" w:w="3969"/>
+            <w:tcW w:type="dxa" w:w="2608"/>
           </w:tcPr>
           <w:p>
             <w:pPr>
@@ -4042,7 +4591,7 @@
         </w:tc>
         <w:tc>
           <w:tcPr>
-            <w:tcW w:type="dxa" w:w="4082"/>
+            <w:tcW w:type="dxa" w:w="2608"/>
           </w:tcPr>
           <w:p>
             <w:pPr>
@@ -4104,7 +4653,59 @@
         </w:tc>
         <w:tc>
           <w:tcPr>
-            <w:tcW w:type="dxa" w:w="1587"/>
+            <w:tcW w:type="dxa" w:w="3175"/>
+          </w:tcPr>
+          <w:p>
+            <w:pPr>
+              <w:spacing w:after="0"/>
+            </w:pPr>
+            <w:r/>
+            <w:r>
+              <w:rPr>
+                <w:b w:val="0"/>
+                <w:sz w:val="17"/>
+              </w:rPr>
+              <w:t>Met: leverage 3.49x, in the middle of the range; net debt +0.7% since YE2025; ratings stable</w:t>
+            </w:r>
+            <w:hyperlink r:id="rId14">
+              <w:r>
+                <w:rPr>
+                  <w:color w:val="2A78D6"/>
+                  <w:vertAlign w:val="superscript"/>
+                  <w:sz w:val="14"/>
+                </w:rPr>
+                <w:t xml:space="preserve">5</w:t>
+              </w:r>
+            </w:hyperlink>
+            <w:r>
+              <w:rPr>
+                <w:color w:val="2A78D6"/>
+                <w:vertAlign w:val="superscript"/>
+              </w:rPr>
+              <w:t>,</w:t>
+            </w:r>
+            <w:hyperlink r:id="rId10">
+              <w:r>
+                <w:rPr>
+                  <w:color w:val="2A78D6"/>
+                  <w:vertAlign w:val="superscript"/>
+                  <w:sz w:val="14"/>
+                </w:rPr>
+                <w:t xml:space="preserve">1</w:t>
+              </w:r>
+            </w:hyperlink>
+            <w:r>
+              <w:rPr>
+                <w:b w:val="0"/>
+                <w:sz w:val="17"/>
+              </w:rPr>
+              <w:t>.</w:t>
+            </w:r>
+          </w:p>
+        </w:tc>
+        <w:tc>
+          <w:tcPr>
+            <w:tcW w:type="dxa" w:w="1361"/>
             <w:shd w:val="clear" w:color="auto" w:fill="E3F3E8"/>
           </w:tcPr>
           <w:p>
@@ -4125,7 +4726,7 @@
       <w:tr>
         <w:tc>
           <w:tcPr>
-            <w:tcW w:type="dxa" w:w="3969"/>
+            <w:tcW w:type="dxa" w:w="2608"/>
             <w:shd w:val="clear" w:color="auto" w:fill="F6F8FA"/>
           </w:tcPr>
           <w:p>
@@ -4144,7 +4745,7 @@
         </w:tc>
         <w:tc>
           <w:tcPr>
-            <w:tcW w:type="dxa" w:w="4082"/>
+            <w:tcW w:type="dxa" w:w="2608"/>
             <w:shd w:val="clear" w:color="auto" w:fill="F6F8FA"/>
           </w:tcPr>
           <w:p>
@@ -4207,7 +4808,60 @@
         </w:tc>
         <w:tc>
           <w:tcPr>
-            <w:tcW w:type="dxa" w:w="1587"/>
+            <w:tcW w:type="dxa" w:w="3175"/>
+            <w:shd w:val="clear" w:color="auto" w:fill="F6F8FA"/>
+          </w:tcPr>
+          <w:p>
+            <w:pPr>
+              <w:spacing w:after="0"/>
+            </w:pPr>
+            <w:r/>
+            <w:r>
+              <w:rPr>
+                <w:b w:val="0"/>
+                <w:sz w:val="17"/>
+              </w:rPr>
+              <w:t>Met: +3.0% for 2025 and +3.1% for H1 2026, although adjusted profit fell 20.8% and free cash flow (EUR 5.3m) does not cover the dividend</w:t>
+            </w:r>
+            <w:hyperlink r:id="rId22">
+              <w:r>
+                <w:rPr>
+                  <w:color w:val="2A78D6"/>
+                  <w:vertAlign w:val="superscript"/>
+                  <w:sz w:val="14"/>
+                </w:rPr>
+                <w:t xml:space="preserve">13</w:t>
+              </w:r>
+            </w:hyperlink>
+            <w:r>
+              <w:rPr>
+                <w:color w:val="2A78D6"/>
+                <w:vertAlign w:val="superscript"/>
+              </w:rPr>
+              <w:t>,</w:t>
+            </w:r>
+            <w:hyperlink r:id="rId13">
+              <w:r>
+                <w:rPr>
+                  <w:color w:val="2A78D6"/>
+                  <w:vertAlign w:val="superscript"/>
+                  <w:sz w:val="14"/>
+                </w:rPr>
+                <w:t xml:space="preserve">4</w:t>
+              </w:r>
+            </w:hyperlink>
+            <w:r>
+              <w:rPr>
+                <w:b w:val="0"/>
+                <w:sz w:val="17"/>
+              </w:rPr>
+              <w:t>.</w:t>
+            </w:r>
+          </w:p>
+        </w:tc>
+        <w:tc>
+          <w:tcPr>
+            <w:tcW w:type="dxa" w:w="1361"/>
             <w:shd w:val="clear" w:color="auto" w:fill="E3F3E8"/>
           </w:tcPr>
           <w:p>
@@ -4228,7 +4882,7 @@
       <w:tr>
         <w:tc>
           <w:tcPr>
-            <w:tcW w:type="dxa" w:w="3969"/>
+            <w:tcW w:type="dxa" w:w="2608"/>
           </w:tcPr>
           <w:p>
             <w:pPr>
@@ -4246,7 +4900,7 @@
         </w:tc>
         <w:tc>
           <w:tcPr>
-            <w:tcW w:type="dxa" w:w="4082"/>
+            <w:tcW w:type="dxa" w:w="2608"/>
           </w:tcPr>
           <w:p>
             <w:pPr>
@@ -4284,14 +4938,49 @@
                   <w:vertAlign w:val="superscript"/>
                   <w:sz w:val="14"/>
                 </w:rPr>
-                <w:t xml:space="preserve">25</w:t>
+                <w:t xml:space="preserve">26</w:t>
               </w:r>
             </w:hyperlink>
           </w:p>
         </w:tc>
         <w:tc>
           <w:tcPr>
-            <w:tcW w:type="dxa" w:w="1587"/>
+            <w:tcW w:type="dxa" w:w="3175"/>
+          </w:tcPr>
+          <w:p>
+            <w:pPr>
+              <w:spacing w:after="0"/>
+            </w:pPr>
+            <w:r/>
+            <w:r>
+              <w:rPr>
+                <w:b w:val="0"/>
+                <w:sz w:val="17"/>
+              </w:rPr>
+              <w:t>Progressing: 2.1 GW installed + 0.7 GW under construction = 2.8 GW, the bottom of the target range (calculated by the tool)</w:t>
+            </w:r>
+            <w:hyperlink r:id="rId31">
+              <w:r>
+                <w:rPr>
+                  <w:color w:val="2A78D6"/>
+                  <w:vertAlign w:val="superscript"/>
+                  <w:sz w:val="14"/>
+                </w:rPr>
+                <w:t xml:space="preserve">26</w:t>
+              </w:r>
+            </w:hyperlink>
+            <w:r>
+              <w:rPr>
+                <w:b w:val="0"/>
+                <w:sz w:val="17"/>
+              </w:rPr>
+              <w:t>.</w:t>
+            </w:r>
+          </w:p>
+        </w:tc>
+        <w:tc>
+          <w:tcPr>
+            <w:tcW w:type="dxa" w:w="1361"/>
             <w:shd w:val="clear" w:color="auto" w:fill="EAF1F8"/>
           </w:tcPr>
           <w:p>
@@ -4384,7 +5073,7 @@
             <w:vertAlign w:val="superscript"/>
             <w:sz w:val="17"/>
           </w:rPr>
-          <w:t xml:space="preserve">26</w:t>
+          <w:t xml:space="preserve">27</w:t>
         </w:r>
       </w:hyperlink>
       <w:r>
@@ -4575,15 +5264,14 @@
     </w:p>
     <w:p>
       <w:pPr>
-        <w:ind w:left="397"/>
+        <w:spacing w:after="0"/>
+        <w:ind w:left="510" w:hanging="198"/>
       </w:pPr>
       <w:r>
         <w:rPr>
-          <w:b/>
-          <w:color w:val="333333"/>
           <w:sz w:val="19"/>
         </w:rPr>
-        <w:t xml:space="preserve">Evidence: </w:t>
+        <w:t xml:space="preserve">•  </w:t>
       </w:r>
       <w:r>
         <w:rPr>
@@ -4591,7 +5279,27 @@
           <w:color w:val="333333"/>
           <w:sz w:val="19"/>
         </w:rPr>
-        <w:t>No weapons, tobacco or gambling. No coal generation and no oil &amp; gas exploration</w:t>
+        <w:t>No weapons, tobacco or gambling.</w:t>
+      </w:r>
+    </w:p>
+    <w:p>
+      <w:pPr>
+        <w:spacing w:after="0"/>
+        <w:ind w:left="510" w:hanging="198"/>
+      </w:pPr>
+      <w:r>
+        <w:rPr>
+          <w:sz w:val="19"/>
+        </w:rPr>
+        <w:t xml:space="preserve">•  </w:t>
+      </w:r>
+      <w:r>
+        <w:rPr>
+          <w:b w:val="0"/>
+          <w:color w:val="333333"/>
+          <w:sz w:val="19"/>
+        </w:rPr>
+        <w:t>No coal generation and no oil &amp; gas exploration</w:t>
       </w:r>
       <w:hyperlink r:id="rId24">
         <w:r>
@@ -4609,7 +5317,27 @@
           <w:color w:val="333333"/>
           <w:sz w:val="19"/>
         </w:rPr>
-        <w:t>. Owns the gas-fired Elektrėnai complex (reserve capacity) and supplies gas - not restricted by the SEB fossil fuel policy (restricts coal &gt;5% of revenue and new exploration).</w:t>
+        <w:t>.</w:t>
+      </w:r>
+    </w:p>
+    <w:p>
+      <w:pPr>
+        <w:spacing w:after="120"/>
+        <w:ind w:left="510" w:hanging="198"/>
+      </w:pPr>
+      <w:r>
+        <w:rPr>
+          <w:sz w:val="19"/>
+        </w:rPr>
+        <w:t xml:space="preserve">•  </w:t>
+      </w:r>
+      <w:r>
+        <w:rPr>
+          <w:b w:val="0"/>
+          <w:color w:val="333333"/>
+          <w:sz w:val="19"/>
+        </w:rPr>
+        <w:t>Owns the gas-fired Elektrėnai complex (reserve capacity) and supplies gas - not restricted by the SEB fossil fuel policy (restricts coal &gt;5% of revenue and new exploration).</w:t>
       </w:r>
     </w:p>
     <w:p>
@@ -4628,15 +5356,14 @@
     </w:p>
     <w:p>
       <w:pPr>
-        <w:ind w:left="397"/>
+        <w:spacing w:after="0"/>
+        <w:ind w:left="510" w:hanging="198"/>
       </w:pPr>
       <w:r>
         <w:rPr>
-          <w:b/>
-          <w:color w:val="333333"/>
           <w:sz w:val="19"/>
         </w:rPr>
-        <w:t xml:space="preserve">Evidence: </w:t>
+        <w:t xml:space="preserve">•  </w:t>
       </w:r>
       <w:r>
         <w:rPr>
@@ -4644,7 +5371,27 @@
           <w:color w:val="333333"/>
           <w:sz w:val="19"/>
         </w:rPr>
-        <w:t>No red flags (UNGC / OECD breaches) found in public sources and the news scan (2026-10-22). Ignitis states it upholds the UN Global Compact principles</w:t>
+        <w:t>No red flags (UNGC / OECD breaches) found in public sources and the news scan (2026-10-22).</w:t>
+      </w:r>
+    </w:p>
+    <w:p>
+      <w:pPr>
+        <w:spacing w:after="120"/>
+        <w:ind w:left="510" w:hanging="198"/>
+      </w:pPr>
+      <w:r>
+        <w:rPr>
+          <w:sz w:val="19"/>
+        </w:rPr>
+        <w:t xml:space="preserve">•  </w:t>
+      </w:r>
+      <w:r>
+        <w:rPr>
+          <w:b w:val="0"/>
+          <w:color w:val="333333"/>
+          <w:sz w:val="19"/>
+        </w:rPr>
+        <w:t>Ignitis states it upholds the UN Global Compact principles</w:t>
       </w:r>
       <w:hyperlink r:id="rId24">
         <w:r>
@@ -4681,23 +5428,28 @@
     </w:p>
     <w:p>
       <w:pPr>
+        <w:spacing w:after="0"/>
         <w:ind w:left="397"/>
       </w:pPr>
       <w:r>
         <w:rPr>
           <w:b/>
-          <w:color w:val="333333"/>
+          <w:color w:val="B42318"/>
           <w:sz w:val="19"/>
         </w:rPr>
-        <w:t xml:space="preserve">Evidence: </w:t>
+        <w:t>Needs review</w:t>
       </w:r>
+    </w:p>
+    <w:p>
+      <w:pPr>
+        <w:spacing w:after="120"/>
+        <w:ind w:left="510" w:hanging="198"/>
+      </w:pPr>
       <w:r>
         <w:rPr>
-          <w:b/>
-          <w:color w:val="333333"/>
           <w:sz w:val="19"/>
         </w:rPr>
-        <w:t xml:space="preserve">Needs review. </w:t>
+        <w:t xml:space="preserve">•  </w:t>
       </w:r>
       <w:r>
         <w:rPr>
@@ -4724,23 +5476,28 @@
     </w:p>
     <w:p>
       <w:pPr>
+        <w:spacing w:after="0"/>
         <w:ind w:left="397"/>
       </w:pPr>
       <w:r>
         <w:rPr>
           <w:b/>
-          <w:color w:val="333333"/>
+          <w:color w:val="B42318"/>
           <w:sz w:val="19"/>
         </w:rPr>
-        <w:t xml:space="preserve">Evidence: </w:t>
+        <w:t>Needs review</w:t>
       </w:r>
+    </w:p>
+    <w:p>
+      <w:pPr>
+        <w:spacing w:after="0"/>
+        <w:ind w:left="510" w:hanging="198"/>
+      </w:pPr>
       <w:r>
         <w:rPr>
-          <w:b/>
-          <w:color w:val="333333"/>
           <w:sz w:val="19"/>
         </w:rPr>
-        <w:t xml:space="preserve">Needs review. </w:t>
+        <w:t xml:space="preserve">•  </w:t>
       </w:r>
       <w:r>
         <w:rPr>
@@ -4748,7 +5505,27 @@
           <w:color w:val="333333"/>
           <w:sz w:val="19"/>
         </w:rPr>
-        <w:t>The automatic news scan (LT, LV, EE, EN; 30 days) found no adverse headlines. Analyst confirms and adds a screenshot.</w:t>
+        <w:t>The automatic news scan (LT, LV, EE, EN; 30 days) found no adverse headlines.</w:t>
+      </w:r>
+    </w:p>
+    <w:p>
+      <w:pPr>
+        <w:spacing w:after="120"/>
+        <w:ind w:left="510" w:hanging="198"/>
+      </w:pPr>
+      <w:r>
+        <w:rPr>
+          <w:sz w:val="19"/>
+        </w:rPr>
+        <w:t xml:space="preserve">•  </w:t>
+      </w:r>
+      <w:r>
+        <w:rPr>
+          <w:b w:val="0"/>
+          <w:color w:val="333333"/>
+          <w:sz w:val="19"/>
+        </w:rPr>
+        <w:t>Analyst confirms and adds a screenshot.</w:t>
       </w:r>
     </w:p>
     <w:p>
@@ -4799,15 +5576,14 @@
     </w:p>
     <w:p>
       <w:pPr>
-        <w:ind w:left="397"/>
+        <w:spacing w:after="0"/>
+        <w:ind w:left="510" w:hanging="198"/>
       </w:pPr>
       <w:r>
         <w:rPr>
-          <w:b/>
-          <w:color w:val="333333"/>
           <w:sz w:val="19"/>
         </w:rPr>
-        <w:t xml:space="preserve">Evidence: </w:t>
+        <w:t xml:space="preserve">•  </w:t>
       </w:r>
       <w:r>
         <w:rPr>
@@ -4827,13 +5603,25 @@
           <w:t xml:space="preserve">9</w:t>
         </w:r>
       </w:hyperlink>
+    </w:p>
+    <w:p>
+      <w:pPr>
+        <w:spacing w:after="120"/>
+        <w:ind w:left="510" w:hanging="198"/>
+      </w:pPr>
+      <w:r>
+        <w:rPr>
+          <w:sz w:val="19"/>
+        </w:rPr>
+        <w:t xml:space="preserve">•  </w:t>
+      </w:r>
       <w:r>
         <w:rPr>
           <w:b w:val="0"/>
           <w:color w:val="333333"/>
           <w:sz w:val="19"/>
         </w:rPr>
-        <w:t>; green bonds and a new EU Green Bond Standard (EuGB) bond</w:t>
+        <w:t>Green bonds and a new EU Green Bond Standard (EuGB) bond</w:t>
       </w:r>
       <w:hyperlink r:id="rId17">
         <w:r>
@@ -4870,15 +5658,14 @@
     </w:p>
     <w:p>
       <w:pPr>
-        <w:ind w:left="397"/>
+        <w:spacing w:after="0"/>
+        <w:ind w:left="510" w:hanging="198"/>
       </w:pPr>
       <w:r>
         <w:rPr>
-          <w:b/>
-          <w:color w:val="333333"/>
           <w:sz w:val="19"/>
         </w:rPr>
-        <w:t xml:space="preserve">Evidence: </w:t>
+        <w:t xml:space="preserve">•  </w:t>
       </w:r>
       <w:r>
         <w:rPr>
@@ -4904,7 +5691,47 @@
           <w:color w:val="333333"/>
           <w:sz w:val="19"/>
         </w:rPr>
-        <w:t>. SBTi-validated targets in line with 1.5°C; net zero by 2050 or sooner</w:t>
+        <w:t>.</w:t>
+      </w:r>
+    </w:p>
+    <w:p>
+      <w:pPr>
+        <w:spacing w:after="0"/>
+        <w:ind w:left="510" w:hanging="198"/>
+      </w:pPr>
+      <w:r>
+        <w:rPr>
+          <w:sz w:val="19"/>
+        </w:rPr>
+        <w:t xml:space="preserve">•  </w:t>
+      </w:r>
+      <w:r>
+        <w:rPr>
+          <w:b w:val="0"/>
+          <w:color w:val="333333"/>
+          <w:sz w:val="19"/>
+        </w:rPr>
+        <w:t>SBTi-validated targets in line with 1.5°C</w:t>
+      </w:r>
+    </w:p>
+    <w:p>
+      <w:pPr>
+        <w:spacing w:after="120"/>
+        <w:ind w:left="510" w:hanging="198"/>
+      </w:pPr>
+      <w:r>
+        <w:rPr>
+          <w:sz w:val="19"/>
+        </w:rPr>
+        <w:t xml:space="preserve">•  </w:t>
+      </w:r>
+      <w:r>
+        <w:rPr>
+          <w:b w:val="0"/>
+          <w:color w:val="333333"/>
+          <w:sz w:val="19"/>
+        </w:rPr>
+        <w:t>Net zero by 2050 or sooner</w:t>
       </w:r>
       <w:hyperlink r:id="rId32">
         <w:r>
@@ -4913,7 +5740,7 @@
             <w:vertAlign w:val="superscript"/>
             <w:sz w:val="16"/>
           </w:rPr>
-          <w:t xml:space="preserve">27</w:t>
+          <w:t xml:space="preserve">28</w:t>
         </w:r>
       </w:hyperlink>
       <w:r>
@@ -4941,23 +5768,28 @@
     </w:p>
     <w:p>
       <w:pPr>
+        <w:spacing w:after="0"/>
         <w:ind w:left="397"/>
       </w:pPr>
       <w:r>
         <w:rPr>
           <w:b/>
-          <w:color w:val="333333"/>
+          <w:color w:val="B42318"/>
           <w:sz w:val="19"/>
         </w:rPr>
-        <w:t xml:space="preserve">Evidence: </w:t>
+        <w:t>Needs review</w:t>
       </w:r>
+    </w:p>
+    <w:p>
+      <w:pPr>
+        <w:spacing w:after="0"/>
+        <w:ind w:left="510" w:hanging="198"/>
+      </w:pPr>
       <w:r>
         <w:rPr>
-          <w:b/>
-          <w:color w:val="333333"/>
           <w:sz w:val="19"/>
         </w:rPr>
-        <w:t xml:space="preserve">Needs review. </w:t>
+        <w:t xml:space="preserve">•  </w:t>
       </w:r>
       <w:r>
         <w:rPr>
@@ -4983,7 +5815,27 @@
           <w:color w:val="333333"/>
           <w:sz w:val="19"/>
         </w:rPr>
-        <w:t>. Scope 1 emissions rose 54.7% in 2025 due to higher gas generation</w:t>
+        <w:t>.</w:t>
+      </w:r>
+    </w:p>
+    <w:p>
+      <w:pPr>
+        <w:spacing w:after="120"/>
+        <w:ind w:left="510" w:hanging="198"/>
+      </w:pPr>
+      <w:r>
+        <w:rPr>
+          <w:sz w:val="19"/>
+        </w:rPr>
+        <w:t xml:space="preserve">•  </w:t>
+      </w:r>
+      <w:r>
+        <w:rPr>
+          <w:b w:val="0"/>
+          <w:color w:val="333333"/>
+          <w:sz w:val="19"/>
+        </w:rPr>
+        <w:t>Scope 1 emissions rose 54.7% in 2025 due to higher gas generation</w:t>
       </w:r>
       <w:hyperlink r:id="rId24">
         <w:r>
@@ -5020,6 +5872,7 @@
     </w:p>
     <w:p>
       <w:pPr>
+        <w:spacing w:after="0"/>
         <w:ind w:left="397"/>
       </w:pPr>
       <w:r>
@@ -5028,15 +5881,19 @@
           <w:color w:val="333333"/>
           <w:sz w:val="19"/>
         </w:rPr>
-        <w:t xml:space="preserve">Evidence: </w:t>
+        <w:t>Applicable</w:t>
       </w:r>
+    </w:p>
+    <w:p>
+      <w:pPr>
+        <w:spacing w:after="0"/>
+        <w:ind w:left="737" w:hanging="198"/>
+      </w:pPr>
       <w:r>
         <w:rPr>
-          <w:b/>
-          <w:color w:val="333333"/>
           <w:sz w:val="19"/>
         </w:rPr>
-        <w:t>Applicable:</w:t>
+        <w:t xml:space="preserve">•  </w:t>
       </w:r>
       <w:r>
         <w:rPr>
@@ -5044,7 +5901,7 @@
           <w:color w:val="333333"/>
           <w:sz w:val="19"/>
         </w:rPr>
-        <w:t xml:space="preserve"> the SEB Investments policy</w:t>
+        <w:t>The SEB Investments policy</w:t>
       </w:r>
       <w:hyperlink r:id="rId33">
         <w:r>
@@ -5053,7 +5910,7 @@
             <w:vertAlign w:val="superscript"/>
             <w:sz w:val="16"/>
           </w:rPr>
-          <w:t xml:space="preserve">28</w:t>
+          <w:t xml:space="preserve">29</w:t>
         </w:r>
       </w:hyperlink>
       <w:r>
@@ -5071,7 +5928,7 @@
             <w:vertAlign w:val="superscript"/>
             <w:sz w:val="16"/>
           </w:rPr>
-          <w:t xml:space="preserve">29</w:t>
+          <w:t xml:space="preserve">30</w:t>
         </w:r>
       </w:hyperlink>
       <w:r>
@@ -5080,7 +5937,27 @@
           <w:color w:val="333333"/>
           <w:sz w:val="19"/>
         </w:rPr>
-        <w:t>, and the Fossil Fuels policy for gas distribution, gas supply and the Elektrėnai reserve plants. The gas revenue share was not found</w:t>
+        <w:t>, and the Fossil Fuels policy for gas distribution, gas supply and the Elektrėnai reserve plants.</w:t>
+      </w:r>
+    </w:p>
+    <w:p>
+      <w:pPr>
+        <w:spacing w:after="0"/>
+        <w:ind w:left="737" w:hanging="198"/>
+      </w:pPr>
+      <w:r>
+        <w:rPr>
+          <w:sz w:val="19"/>
+        </w:rPr>
+        <w:t xml:space="preserve">•  </w:t>
+      </w:r>
+      <w:r>
+        <w:rPr>
+          <w:b w:val="0"/>
+          <w:color w:val="333333"/>
+          <w:sz w:val="19"/>
+        </w:rPr>
+        <w:t>The gas revenue share was not found</w:t>
       </w:r>
       <w:hyperlink r:id="rId35">
         <w:r>
@@ -5089,7 +5966,7 @@
             <w:vertAlign w:val="superscript"/>
             <w:sz w:val="16"/>
           </w:rPr>
-          <w:t xml:space="preserve">30</w:t>
+          <w:t xml:space="preserve">31</w:t>
         </w:r>
       </w:hyperlink>
       <w:r>
@@ -5106,40 +5983,6 @@
             <w:vertAlign w:val="superscript"/>
             <w:sz w:val="16"/>
           </w:rPr>
-          <w:t xml:space="preserve">31</w:t>
-        </w:r>
-      </w:hyperlink>
-      <w:r>
-        <w:rPr>
-          <w:b w:val="0"/>
-          <w:color w:val="333333"/>
-          <w:sz w:val="19"/>
-        </w:rPr>
-        <w:t xml:space="preserve">. </w:t>
-      </w:r>
-      <w:r>
-        <w:rPr>
-          <w:b/>
-          <w:color w:val="333333"/>
-          <w:sz w:val="19"/>
-        </w:rPr>
-        <w:t>Requirements met:</w:t>
-      </w:r>
-      <w:r>
-        <w:rPr>
-          <w:b w:val="0"/>
-          <w:color w:val="333333"/>
-          <w:sz w:val="19"/>
-        </w:rPr>
-        <w:t xml:space="preserve"> Scope 1-3 emissions disclosed (4.49m t CO2e in 2025) and SBTi-validated 1.5°C targets</w:t>
-      </w:r>
-      <w:hyperlink r:id="rId37">
-        <w:r>
-          <w:rPr>
-            <w:color w:val="2A78D6"/>
-            <w:vertAlign w:val="superscript"/>
-            <w:sz w:val="16"/>
-          </w:rPr>
           <w:t xml:space="preserve">32</w:t>
         </w:r>
       </w:hyperlink>
@@ -5149,9 +5992,43 @@
           <w:color w:val="333333"/>
           <w:sz w:val="19"/>
         </w:rPr>
-        <w:t>; ISO 14001 environmental management at ESO, Ignitis gamyba, Ignitis and the Vilnius and Kaunas CHPs</w:t>
+        <w:t>.</w:t>
       </w:r>
-      <w:hyperlink r:id="rId38">
+    </w:p>
+    <w:p>
+      <w:pPr>
+        <w:spacing w:after="0"/>
+        <w:ind w:left="397"/>
+      </w:pPr>
+      <w:r>
+        <w:rPr>
+          <w:b/>
+          <w:color w:val="333333"/>
+          <w:sz w:val="19"/>
+        </w:rPr>
+        <w:t>Requirements met</w:t>
+      </w:r>
+    </w:p>
+    <w:p>
+      <w:pPr>
+        <w:spacing w:after="0"/>
+        <w:ind w:left="737" w:hanging="198"/>
+      </w:pPr>
+      <w:r>
+        <w:rPr>
+          <w:sz w:val="19"/>
+        </w:rPr>
+        <w:t xml:space="preserve">•  </w:t>
+      </w:r>
+      <w:r>
+        <w:rPr>
+          <w:b w:val="0"/>
+          <w:color w:val="333333"/>
+          <w:sz w:val="19"/>
+        </w:rPr>
+        <w:t>Scope 1-3 emissions disclosed (4.49m t CO2e in 2025) and SBTi-validated 1.5°C targets</w:t>
+      </w:r>
+      <w:hyperlink r:id="rId37">
         <w:r>
           <w:rPr>
             <w:color w:val="2A78D6"/>
@@ -5161,13 +6038,63 @@
           <w:t xml:space="preserve">33</w:t>
         </w:r>
       </w:hyperlink>
+    </w:p>
+    <w:p>
+      <w:pPr>
+        <w:spacing w:after="0"/>
+        <w:ind w:left="737" w:hanging="198"/>
+      </w:pPr>
+      <w:r>
+        <w:rPr>
+          <w:sz w:val="19"/>
+        </w:rPr>
+        <w:t xml:space="preserve">•  </w:t>
+      </w:r>
       <w:r>
         <w:rPr>
           <w:b w:val="0"/>
           <w:color w:val="333333"/>
           <w:sz w:val="19"/>
         </w:rPr>
-        <w:t>. No coal, peat or oil &amp; gas extraction</w:t>
+        <w:t>ISO 14001 environmental management at ESO, Ignitis gamyba, Ignitis and the Vilnius and Kaunas CHPs</w:t>
+      </w:r>
+      <w:hyperlink r:id="rId38">
+        <w:r>
+          <w:rPr>
+            <w:color w:val="2A78D6"/>
+            <w:vertAlign w:val="superscript"/>
+            <w:sz w:val="16"/>
+          </w:rPr>
+          <w:t xml:space="preserve">34</w:t>
+        </w:r>
+      </w:hyperlink>
+      <w:r>
+        <w:rPr>
+          <w:b w:val="0"/>
+          <w:color w:val="333333"/>
+          <w:sz w:val="19"/>
+        </w:rPr>
+        <w:t>.</w:t>
+      </w:r>
+    </w:p>
+    <w:p>
+      <w:pPr>
+        <w:spacing w:after="0"/>
+        <w:ind w:left="737" w:hanging="198"/>
+      </w:pPr>
+      <w:r>
+        <w:rPr>
+          <w:sz w:val="19"/>
+        </w:rPr>
+        <w:t xml:space="preserve">•  </w:t>
+      </w:r>
+      <w:r>
+        <w:rPr>
+          <w:b w:val="0"/>
+          <w:color w:val="333333"/>
+          <w:sz w:val="19"/>
+        </w:rPr>
+        <w:t>No coal, peat or oil &amp; gas extraction</w:t>
       </w:r>
       <w:hyperlink r:id="rId24">
         <w:r>
@@ -5185,15 +6112,33 @@
           <w:color w:val="333333"/>
           <w:sz w:val="19"/>
         </w:rPr>
-        <w:t xml:space="preserve">. </w:t>
+        <w:t>.</w:t>
       </w:r>
+    </w:p>
+    <w:p>
+      <w:pPr>
+        <w:spacing w:after="0"/>
+        <w:ind w:left="397"/>
+      </w:pPr>
       <w:r>
         <w:rPr>
           <w:b/>
           <w:color w:val="333333"/>
           <w:sz w:val="19"/>
         </w:rPr>
-        <w:t>Expectations met:</w:t>
+        <w:t>Expectations met</w:t>
+      </w:r>
+    </w:p>
+    <w:p>
+      <w:pPr>
+        <w:spacing w:after="0"/>
+        <w:ind w:left="737" w:hanging="198"/>
+      </w:pPr>
+      <w:r>
+        <w:rPr>
+          <w:sz w:val="19"/>
+        </w:rPr>
+        <w:t xml:space="preserve">•  </w:t>
       </w:r>
       <w:r>
         <w:rPr>
@@ -5201,9 +6146,86 @@
           <w:color w:val="333333"/>
           <w:sz w:val="19"/>
         </w:rPr>
-        <w:t xml:space="preserve"> ISO 45001 safety management, no fatal accidents in 2025</w:t>
+        <w:t>ISO 45001 safety management, no fatal accidents in 2025</w:t>
       </w:r>
       <w:hyperlink r:id="rId39">
+        <w:r>
+          <w:rPr>
+            <w:color w:val="2A78D6"/>
+            <w:vertAlign w:val="superscript"/>
+            <w:sz w:val="16"/>
+          </w:rPr>
+          <w:t xml:space="preserve">35</w:t>
+        </w:r>
+      </w:hyperlink>
+      <w:r>
+        <w:rPr>
+          <w:color w:val="2A78D6"/>
+          <w:vertAlign w:val="superscript"/>
+        </w:rPr>
+        <w:t>,</w:t>
+      </w:r>
+      <w:hyperlink r:id="rId38">
+        <w:r>
+          <w:rPr>
+            <w:color w:val="2A78D6"/>
+            <w:vertAlign w:val="superscript"/>
+            <w:sz w:val="16"/>
+          </w:rPr>
+          <w:t xml:space="preserve">34</w:t>
+        </w:r>
+      </w:hyperlink>
+    </w:p>
+    <w:p>
+      <w:pPr>
+        <w:spacing w:after="0"/>
+        <w:ind w:left="737" w:hanging="198"/>
+      </w:pPr>
+      <w:r>
+        <w:rPr>
+          <w:sz w:val="19"/>
+        </w:rPr>
+        <w:t xml:space="preserve">•  </w:t>
+      </w:r>
+      <w:r>
+        <w:rPr>
+          <w:b w:val="0"/>
+          <w:color w:val="333333"/>
+          <w:sz w:val="19"/>
+        </w:rPr>
+        <w:t>Trust line for anonymous reports</w:t>
+      </w:r>
+      <w:hyperlink r:id="rId40">
+        <w:r>
+          <w:rPr>
+            <w:color w:val="2A78D6"/>
+            <w:vertAlign w:val="superscript"/>
+            <w:sz w:val="16"/>
+          </w:rPr>
+          <w:t xml:space="preserve">36</w:t>
+        </w:r>
+      </w:hyperlink>
+    </w:p>
+    <w:p>
+      <w:pPr>
+        <w:spacing w:after="0"/>
+        <w:ind w:left="737" w:hanging="198"/>
+      </w:pPr>
+      <w:r>
+        <w:rPr>
+          <w:sz w:val="19"/>
+        </w:rPr>
+        <w:t xml:space="preserve">•  </w:t>
+      </w:r>
+      <w:r>
+        <w:rPr>
+          <w:b w:val="0"/>
+          <w:color w:val="333333"/>
+          <w:sz w:val="19"/>
+        </w:rPr>
+        <w:t>Anti-corruption policy and ISO 37001 certification</w:t>
+      </w:r>
+      <w:hyperlink r:id="rId38">
         <w:r>
           <w:rPr>
             <w:color w:val="2A78D6"/>
@@ -5220,78 +6242,7 @@
         </w:rPr>
         <w:t>,</w:t>
       </w:r>
-      <w:hyperlink r:id="rId38">
-        <w:r>
-          <w:rPr>
-            <w:color w:val="2A78D6"/>
-            <w:vertAlign w:val="superscript"/>
-            <w:sz w:val="16"/>
-          </w:rPr>
-          <w:t xml:space="preserve">33</w:t>
-        </w:r>
-      </w:hyperlink>
-      <w:r>
-        <w:rPr>
-          <w:b w:val="0"/>
-          <w:color w:val="333333"/>
-          <w:sz w:val="19"/>
-        </w:rPr>
-        <w:t>; trust line for anonymous reports</w:t>
-      </w:r>
       <w:hyperlink r:id="rId40">
-        <w:r>
-          <w:rPr>
-            <w:color w:val="2A78D6"/>
-            <w:vertAlign w:val="superscript"/>
-            <w:sz w:val="16"/>
-          </w:rPr>
-          <w:t xml:space="preserve">35</w:t>
-        </w:r>
-      </w:hyperlink>
-      <w:r>
-        <w:rPr>
-          <w:b w:val="0"/>
-          <w:color w:val="333333"/>
-          <w:sz w:val="19"/>
-        </w:rPr>
-        <w:t>; anti-corruption policy and ISO 37001 certification</w:t>
-      </w:r>
-      <w:hyperlink r:id="rId38">
-        <w:r>
-          <w:rPr>
-            <w:color w:val="2A78D6"/>
-            <w:vertAlign w:val="superscript"/>
-            <w:sz w:val="16"/>
-          </w:rPr>
-          <w:t xml:space="preserve">33</w:t>
-        </w:r>
-      </w:hyperlink>
-      <w:r>
-        <w:rPr>
-          <w:color w:val="2A78D6"/>
-          <w:vertAlign w:val="superscript"/>
-        </w:rPr>
-        <w:t>,</w:t>
-      </w:r>
-      <w:hyperlink r:id="rId40">
-        <w:r>
-          <w:rPr>
-            <w:color w:val="2A78D6"/>
-            <w:vertAlign w:val="superscript"/>
-            <w:sz w:val="16"/>
-          </w:rPr>
-          <w:t xml:space="preserve">35</w:t>
-        </w:r>
-      </w:hyperlink>
-      <w:r>
-        <w:rPr>
-          <w:b w:val="0"/>
-          <w:color w:val="333333"/>
-          <w:sz w:val="19"/>
-        </w:rPr>
-        <w:t>; UN Global Compact</w:t>
-      </w:r>
-      <w:hyperlink r:id="rId37">
         <w:r>
           <w:rPr>
             <w:color w:val="2A78D6"/>
@@ -5301,13 +6252,55 @@
           <w:t xml:space="preserve">36</w:t>
         </w:r>
       </w:hyperlink>
+    </w:p>
+    <w:p>
+      <w:pPr>
+        <w:spacing w:after="0"/>
+        <w:ind w:left="737" w:hanging="198"/>
+      </w:pPr>
+      <w:r>
+        <w:rPr>
+          <w:sz w:val="19"/>
+        </w:rPr>
+        <w:t xml:space="preserve">•  </w:t>
+      </w:r>
       <w:r>
         <w:rPr>
           <w:b w:val="0"/>
           <w:color w:val="333333"/>
           <w:sz w:val="19"/>
         </w:rPr>
-        <w:t>; integrated annual report with climate data</w:t>
+        <w:t>UN Global Compact</w:t>
+      </w:r>
+      <w:hyperlink r:id="rId37">
+        <w:r>
+          <w:rPr>
+            <w:color w:val="2A78D6"/>
+            <w:vertAlign w:val="superscript"/>
+            <w:sz w:val="16"/>
+          </w:rPr>
+          <w:t xml:space="preserve">37</w:t>
+        </w:r>
+      </w:hyperlink>
+    </w:p>
+    <w:p>
+      <w:pPr>
+        <w:spacing w:after="0"/>
+        <w:ind w:left="737" w:hanging="198"/>
+      </w:pPr>
+      <w:r>
+        <w:rPr>
+          <w:sz w:val="19"/>
+        </w:rPr>
+        <w:t xml:space="preserve">•  </w:t>
+      </w:r>
+      <w:r>
+        <w:rPr>
+          <w:b w:val="0"/>
+          <w:color w:val="333333"/>
+          <w:sz w:val="19"/>
+        </w:rPr>
+        <w:t>Integrated annual report with climate data</w:t>
       </w:r>
       <w:hyperlink r:id="rId24">
         <w:r>
@@ -5319,39 +6312,17 @@
           <w:t xml:space="preserve">15</w:t>
         </w:r>
       </w:hyperlink>
+    </w:p>
+    <w:p>
+      <w:pPr>
+        <w:spacing w:after="0"/>
+        <w:ind w:left="737" w:hanging="198"/>
+      </w:pPr>
       <w:r>
         <w:rPr>
-          <w:b w:val="0"/>
-          <w:color w:val="333333"/>
           <w:sz w:val="19"/>
         </w:rPr>
-        <w:t>; biodiversity monitoring and mitigation measures</w:t>
-      </w:r>
-      <w:hyperlink r:id="rId41">
-        <w:r>
-          <w:rPr>
-            <w:color w:val="2A78D6"/>
-            <w:vertAlign w:val="superscript"/>
-            <w:sz w:val="16"/>
-          </w:rPr>
-          <w:t xml:space="preserve">37</w:t>
-        </w:r>
-      </w:hyperlink>
-      <w:r>
-        <w:rPr>
-          <w:b w:val="0"/>
-          <w:color w:val="333333"/>
-          <w:sz w:val="19"/>
-        </w:rPr>
-        <w:t xml:space="preserve">. </w:t>
-      </w:r>
-      <w:r>
-        <w:rPr>
-          <w:b/>
-          <w:color w:val="333333"/>
-          <w:sz w:val="19"/>
-        </w:rPr>
-        <w:t>Not found / to check:</w:t>
+        <w:t xml:space="preserve">•  </w:t>
       </w:r>
       <w:r>
         <w:rPr>
@@ -5359,9 +6330,9 @@
           <w:color w:val="333333"/>
           <w:sz w:val="19"/>
         </w:rPr>
-        <w:t xml:space="preserve"> a named human rights due diligence process and quantified biodiversity targets</w:t>
+        <w:t>Biodiversity monitoring and mitigation measures</w:t>
       </w:r>
-      <w:hyperlink r:id="rId34">
+      <w:hyperlink r:id="rId41">
         <w:r>
           <w:rPr>
             <w:color w:val="2A78D6"/>
@@ -5377,7 +6348,71 @@
           <w:color w:val="333333"/>
           <w:sz w:val="19"/>
         </w:rPr>
-        <w:t>; country-by-country tax report (listed at</w:t>
+        <w:t>.</w:t>
+      </w:r>
+    </w:p>
+    <w:p>
+      <w:pPr>
+        <w:spacing w:after="0"/>
+        <w:ind w:left="397"/>
+      </w:pPr>
+      <w:r>
+        <w:rPr>
+          <w:b/>
+          <w:color w:val="333333"/>
+          <w:sz w:val="19"/>
+        </w:rPr>
+        <w:t>Not found / to check</w:t>
+      </w:r>
+    </w:p>
+    <w:p>
+      <w:pPr>
+        <w:spacing w:after="0"/>
+        <w:ind w:left="737" w:hanging="198"/>
+      </w:pPr>
+      <w:r>
+        <w:rPr>
+          <w:sz w:val="19"/>
+        </w:rPr>
+        <w:t xml:space="preserve">•  </w:t>
+      </w:r>
+      <w:r>
+        <w:rPr>
+          <w:b w:val="0"/>
+          <w:color w:val="333333"/>
+          <w:sz w:val="19"/>
+        </w:rPr>
+        <w:t>A named human rights due diligence process and quantified biodiversity targets</w:t>
+      </w:r>
+      <w:hyperlink r:id="rId34">
+        <w:r>
+          <w:rPr>
+            <w:color w:val="2A78D6"/>
+            <w:vertAlign w:val="superscript"/>
+            <w:sz w:val="16"/>
+          </w:rPr>
+          <w:t xml:space="preserve">39</w:t>
+        </w:r>
+      </w:hyperlink>
+    </w:p>
+    <w:p>
+      <w:pPr>
+        <w:spacing w:after="120"/>
+        <w:ind w:left="737" w:hanging="198"/>
+      </w:pPr>
+      <w:r>
+        <w:rPr>
+          <w:sz w:val="19"/>
+        </w:rPr>
+        <w:t xml:space="preserve">•  </w:t>
+      </w:r>
+      <w:r>
+        <w:rPr>
+          <w:b w:val="0"/>
+          <w:color w:val="333333"/>
+          <w:sz w:val="19"/>
+        </w:rPr>
+        <w:t>Country-by-country tax report (listed at</w:t>
       </w:r>
       <w:hyperlink r:id="rId42">
         <w:r>
@@ -5386,7 +6421,7 @@
             <w:vertAlign w:val="superscript"/>
             <w:sz w:val="16"/>
           </w:rPr>
-          <w:t xml:space="preserve">39</w:t>
+          <w:t xml:space="preserve">40</w:t>
         </w:r>
       </w:hyperlink>
       <w:r>
@@ -5437,15 +6472,14 @@
     </w:p>
     <w:p>
       <w:pPr>
-        <w:ind w:left="397"/>
+        <w:spacing w:after="0"/>
+        <w:ind w:left="510" w:hanging="198"/>
       </w:pPr>
       <w:r>
         <w:rPr>
-          <w:b/>
-          <w:color w:val="333333"/>
           <w:sz w:val="19"/>
         </w:rPr>
-        <w:t xml:space="preserve">Evidence: </w:t>
+        <w:t xml:space="preserve">•  </w:t>
       </w:r>
       <w:r>
         <w:rPr>
@@ -5453,7 +6487,27 @@
           <w:color w:val="333333"/>
           <w:sz w:val="19"/>
         </w:rPr>
-        <w:t>No need identified. Possible topics: share of gas generation and Scope 1 growth, contractor safety.</w:t>
+        <w:t>No need identified.</w:t>
+      </w:r>
+    </w:p>
+    <w:p>
+      <w:pPr>
+        <w:spacing w:after="120"/>
+        <w:ind w:left="510" w:hanging="198"/>
+      </w:pPr>
+      <w:r>
+        <w:rPr>
+          <w:sz w:val="19"/>
+        </w:rPr>
+        <w:t xml:space="preserve">•  </w:t>
+      </w:r>
+      <w:r>
+        <w:rPr>
+          <w:b w:val="0"/>
+          <w:color w:val="333333"/>
+          <w:sz w:val="19"/>
+        </w:rPr>
+        <w:t>Possible topics: share of gas generation and Scope 1 growth, contractor safety.</w:t>
       </w:r>
     </w:p>
     <w:p>
@@ -5495,23 +6549,28 @@
     </w:p>
     <w:p>
       <w:pPr>
+        <w:spacing w:after="0"/>
         <w:ind w:left="397"/>
       </w:pPr>
       <w:r>
         <w:rPr>
           <w:b/>
-          <w:color w:val="333333"/>
+          <w:color w:val="B42318"/>
           <w:sz w:val="19"/>
         </w:rPr>
-        <w:t xml:space="preserve">Evidence: </w:t>
+        <w:t>Needs review</w:t>
       </w:r>
+    </w:p>
+    <w:p>
+      <w:pPr>
+        <w:spacing w:after="0"/>
+        <w:ind w:left="510" w:hanging="198"/>
+      </w:pPr>
       <w:r>
         <w:rPr>
-          <w:b/>
-          <w:color w:val="333333"/>
           <w:sz w:val="19"/>
         </w:rPr>
-        <w:t xml:space="preserve">Needs review. </w:t>
+        <w:t xml:space="preserve">•  </w:t>
       </w:r>
       <w:r>
         <w:rPr>
@@ -5531,13 +6590,25 @@
           <w:t xml:space="preserve">15</w:t>
         </w:r>
       </w:hyperlink>
+    </w:p>
+    <w:p>
+      <w:pPr>
+        <w:spacing w:after="0"/>
+        <w:ind w:left="510" w:hanging="198"/>
+      </w:pPr>
+      <w:r>
+        <w:rPr>
+          <w:sz w:val="19"/>
+        </w:rPr>
+        <w:t xml:space="preserve">•  </w:t>
+      </w:r>
       <w:r>
         <w:rPr>
           <w:b w:val="0"/>
           <w:color w:val="333333"/>
           <w:sz w:val="19"/>
         </w:rPr>
-        <w:t>; carbon intensity (Scope 1+2) 214 g CO2e/kWh in Q1 2026 (−12.8%)</w:t>
+        <w:t>Carbon intensity (Scope 1+2) 214 g CO2e/kWh in Q1 2026 (−12.8%)</w:t>
       </w:r>
       <w:hyperlink r:id="rId29">
         <w:r>
@@ -5549,13 +6620,25 @@
           <w:t xml:space="preserve">20</w:t>
         </w:r>
       </w:hyperlink>
+    </w:p>
+    <w:p>
+      <w:pPr>
+        <w:spacing w:after="0"/>
+        <w:ind w:left="510" w:hanging="198"/>
+      </w:pPr>
+      <w:r>
+        <w:rPr>
+          <w:sz w:val="19"/>
+        </w:rPr>
+        <w:t xml:space="preserve">•  </w:t>
+      </w:r>
       <w:r>
         <w:rPr>
           <w:b w:val="0"/>
           <w:color w:val="333333"/>
           <w:sz w:val="19"/>
         </w:rPr>
-        <w:t>; Taxonomy-aligned capex 84.7%</w:t>
+        <w:t>Taxonomy-aligned capex 84.7%</w:t>
       </w:r>
       <w:hyperlink r:id="rId24">
         <w:r>
@@ -5573,7 +6656,27 @@
           <w:color w:val="333333"/>
           <w:sz w:val="19"/>
         </w:rPr>
-        <w:t>. Comparison with the Fund's targets - analyst.</w:t>
+        <w:t>.</w:t>
+      </w:r>
+    </w:p>
+    <w:p>
+      <w:pPr>
+        <w:spacing w:after="120"/>
+        <w:ind w:left="510" w:hanging="198"/>
+      </w:pPr>
+      <w:r>
+        <w:rPr>
+          <w:sz w:val="19"/>
+        </w:rPr>
+        <w:t xml:space="preserve">•  </w:t>
+      </w:r>
+      <w:r>
+        <w:rPr>
+          <w:b w:val="0"/>
+          <w:color w:val="333333"/>
+          <w:sz w:val="19"/>
+        </w:rPr>
+        <w:t>Comparison with the Fund's targets - analyst.</w:t>
       </w:r>
     </w:p>
     <w:p>
@@ -6145,6 +7248,27 @@
         </w:rPr>
         <w:t xml:space="preserve">25. </w:t>
       </w:r>
+      <w:hyperlink r:id="rId14">
+        <w:r>
+          <w:rPr>
+            <w:color w:val="2A78D6"/>
+            <w:sz w:val="17"/>
+          </w:rPr>
+          <w:t xml:space="preserve">Ignitis Group - First six months 2026 interim report, p. 10, 29, 2026-08-12</w:t>
+        </w:r>
+      </w:hyperlink>
+    </w:p>
+    <w:p>
+      <w:pPr>
+        <w:spacing w:after="20"/>
+        <w:ind w:left="340" w:hanging="340"/>
+      </w:pPr>
+      <w:r>
+        <w:rPr>
+          <w:sz w:val="17"/>
+        </w:rPr>
+        <w:t xml:space="preserve">26. </w:t>
+      </w:r>
       <w:hyperlink r:id="rId31">
         <w:r>
           <w:rPr>
@@ -6164,7 +7288,7 @@
         <w:rPr>
           <w:sz w:val="17"/>
         </w:rPr>
-        <w:t xml:space="preserve">26. </w:t>
+        <w:t xml:space="preserve">27. </w:t>
       </w:r>
       <w:hyperlink r:id="rId26">
         <w:r>
@@ -6185,7 +7309,7 @@
         <w:rPr>
           <w:sz w:val="17"/>
         </w:rPr>
-        <w:t xml:space="preserve">27. </w:t>
+        <w:t xml:space="preserve">28. </w:t>
       </w:r>
       <w:hyperlink r:id="rId32">
         <w:r>
@@ -6206,7 +7330,7 @@
         <w:rPr>
           <w:sz w:val="17"/>
         </w:rPr>
-        <w:t xml:space="preserve">28. </w:t>
+        <w:t xml:space="preserve">29. </w:t>
       </w:r>
       <w:hyperlink r:id="rId33">
         <w:r>
@@ -6227,7 +7351,7 @@
         <w:rPr>
           <w:sz w:val="17"/>
         </w:rPr>
-        <w:t xml:space="preserve">29. </w:t>
+        <w:t xml:space="preserve">30. </w:t>
       </w:r>
       <w:hyperlink r:id="rId34">
         <w:r>
@@ -6248,7 +7372,7 @@
         <w:rPr>
           <w:sz w:val="17"/>
         </w:rPr>
-        <w:t xml:space="preserve">30. </w:t>
+        <w:t xml:space="preserve">31. </w:t>
       </w:r>
       <w:hyperlink r:id="rId35">
         <w:r>
@@ -6269,7 +7393,7 @@
         <w:rPr>
           <w:sz w:val="17"/>
         </w:rPr>
-        <w:t xml:space="preserve">31. </w:t>
+        <w:t xml:space="preserve">32. </w:t>
       </w:r>
       <w:hyperlink r:id="rId36">
         <w:r>
@@ -6290,7 +7414,7 @@
         <w:rPr>
           <w:sz w:val="17"/>
         </w:rPr>
-        <w:t xml:space="preserve">32. </w:t>
+        <w:t xml:space="preserve">33. </w:t>
       </w:r>
       <w:hyperlink r:id="rId37">
         <w:r>
@@ -6311,7 +7435,7 @@
         <w:rPr>
           <w:sz w:val="17"/>
         </w:rPr>
-        <w:t xml:space="preserve">33. </w:t>
+        <w:t xml:space="preserve">34. </w:t>
       </w:r>
       <w:hyperlink r:id="rId38">
         <w:r>
@@ -6332,7 +7456,7 @@
         <w:rPr>
           <w:sz w:val="17"/>
         </w:rPr>
-        <w:t xml:space="preserve">34. </w:t>
+        <w:t xml:space="preserve">35. </w:t>
       </w:r>
       <w:hyperlink r:id="rId39">
         <w:r>
@@ -6353,7 +7477,7 @@
         <w:rPr>
           <w:sz w:val="17"/>
         </w:rPr>
-        <w:t xml:space="preserve">35. </w:t>
+        <w:t xml:space="preserve">36. </w:t>
       </w:r>
       <w:hyperlink r:id="rId40">
         <w:r>
@@ -6374,7 +7498,7 @@
         <w:rPr>
           <w:sz w:val="17"/>
         </w:rPr>
-        <w:t xml:space="preserve">36. </w:t>
+        <w:t xml:space="preserve">37. </w:t>
       </w:r>
       <w:hyperlink r:id="rId37">
         <w:r>
@@ -6395,7 +7519,7 @@
         <w:rPr>
           <w:sz w:val="17"/>
         </w:rPr>
-        <w:t xml:space="preserve">37. </w:t>
+        <w:t xml:space="preserve">38. </w:t>
       </w:r>
       <w:hyperlink r:id="rId41">
         <w:r>
@@ -6416,7 +7540,7 @@
         <w:rPr>
           <w:sz w:val="17"/>
         </w:rPr>
-        <w:t xml:space="preserve">38. </w:t>
+        <w:t xml:space="preserve">39. </w:t>
       </w:r>
       <w:hyperlink r:id="rId34">
         <w:r>
@@ -6437,7 +7561,7 @@
         <w:rPr>
           <w:sz w:val="17"/>
         </w:rPr>
-        <w:t xml:space="preserve">39. </w:t>
+        <w:t xml:space="preserve">40. </w:t>
       </w:r>
       <w:hyperlink r:id="rId42">
         <w:r>

</xml_diff>

<commit_message>
Išvados viršuje, užpildyti rodikliai, obligacijų sąlygos, atlaidesnis ESG, sankcijų patikra, ISIN saugykla
Co-Authored-By: Claude Opus 5.5 (1M context) <noreply@anthropic.com>
Claude-Session: https://claude.ai/code/session_013ZCssjCF43KM8LCnCdqfwt
</commit_message>
<xml_diff>
--- a/docs/files/ignitis/ignitis_6M2026_en.docx
+++ b/docs/files/ignitis/ignitis_6M2026_en.docx
@@ -101,6 +101,115 @@
         </w:r>
       </w:hyperlink>
     </w:p>
+    <w:tbl>
+      <w:tblPr>
+        <w:tblW w:type="auto" w:w="0"/>
+        <w:tblLook w:firstColumn="1" w:firstRow="1" w:lastColumn="0" w:lastRow="0" w:noHBand="0" w:noVBand="1" w:val="04A0"/>
+      </w:tblPr>
+      <w:tblGrid>
+        <w:gridCol w:w="9972"/>
+      </w:tblGrid>
+      <w:tr>
+        <w:tc>
+          <w:tcPr>
+            <w:tcW w:type="dxa" w:w="9638"/>
+            <w:shd w:val="clear" w:color="auto" w:fill="E3F3E8"/>
+          </w:tcPr>
+          <w:p>
+            <w:pPr>
+              <w:spacing w:before="60" w:after="60"/>
+            </w:pPr>
+            <w:r>
+              <w:rPr>
+                <w:b/>
+                <w:color w:val="1A1A1A"/>
+                <w:sz w:val="21"/>
+              </w:rPr>
+              <w:t>Position OK.</w:t>
+            </w:r>
+            <w:r>
+              <w:rPr>
+                <w:b w:val="0"/>
+                <w:color w:val="1A1A1A"/>
+                <w:sz w:val="21"/>
+              </w:rPr>
+              <w:t xml:space="preserve"> Credit quality is stable: BBB+ / Baa1 ratings and leverage of 3.49x, inside the 3-4x target</w:t>
+            </w:r>
+            <w:hyperlink r:id="rId12">
+              <w:r>
+                <w:rPr>
+                  <w:color w:val="2A78D6"/>
+                  <w:vertAlign w:val="superscript"/>
+                  <w:sz w:val="17"/>
+                </w:rPr>
+                <w:t xml:space="preserve">3</w:t>
+              </w:r>
+            </w:hyperlink>
+            <w:r>
+              <w:rPr>
+                <w:color w:val="2A78D6"/>
+                <w:vertAlign w:val="superscript"/>
+              </w:rPr>
+              <w:t>,</w:t>
+            </w:r>
+            <w:hyperlink r:id="rId10">
+              <w:r>
+                <w:rPr>
+                  <w:color w:val="2A78D6"/>
+                  <w:vertAlign w:val="superscript"/>
+                  <w:sz w:val="17"/>
+                </w:rPr>
+                <w:t xml:space="preserve">1</w:t>
+              </w:r>
+            </w:hyperlink>
+            <w:r>
+              <w:rPr>
+                <w:b w:val="0"/>
+                <w:color w:val="1A1A1A"/>
+                <w:sz w:val="21"/>
+              </w:rPr>
+              <w:t>. Profit is weaker, but the 2026 guidance was kept</w:t>
+            </w:r>
+            <w:hyperlink r:id="rId13">
+              <w:r>
+                <w:rPr>
+                  <w:color w:val="2A78D6"/>
+                  <w:vertAlign w:val="superscript"/>
+                  <w:sz w:val="17"/>
+                </w:rPr>
+                <w:t xml:space="preserve">4</w:t>
+              </w:r>
+            </w:hyperlink>
+            <w:r>
+              <w:rPr>
+                <w:b w:val="0"/>
+                <w:color w:val="1A1A1A"/>
+                <w:sz w:val="21"/>
+              </w:rPr>
+              <w:t>. The held bond XS1646530565 is subject to the issuer's tender offer of 2026-10-19</w:t>
+            </w:r>
+            <w:hyperlink r:id="rId14">
+              <w:r>
+                <w:rPr>
+                  <w:color w:val="2A78D6"/>
+                  <w:vertAlign w:val="superscript"/>
+                  <w:sz w:val="17"/>
+                </w:rPr>
+                <w:t xml:space="preserve">5</w:t>
+              </w:r>
+            </w:hyperlink>
+            <w:r>
+              <w:rPr>
+                <w:b w:val="0"/>
+                <w:color w:val="1A1A1A"/>
+                <w:sz w:val="21"/>
+              </w:rPr>
+              <w:t>.</w:t>
+            </w:r>
+          </w:p>
+        </w:tc>
+      </w:tr>
+    </w:tbl>
     <w:p>
       <w:pPr>
         <w:spacing w:after="0"/>
@@ -237,7 +346,7 @@
                 <w:color w:val="5F6B7A"/>
                 <w:sz w:val="16"/>
               </w:rPr>
-              <w:t>▲ 0.7 % vs FY2025</w:t>
+              <w:t>▲ 19.6 % vs 6M2025</w:t>
             </w:r>
           </w:p>
         </w:tc>
@@ -275,7 +384,7 @@
                 <w:color w:val="5F6B7A"/>
                 <w:sz w:val="16"/>
               </w:rPr>
-              <w:t>▼ 0.01x vs FY2025</w:t>
+              <w:t>▲ 0.5x vs 6M2025</w:t>
             </w:r>
           </w:p>
         </w:tc>
@@ -314,14 +423,14 @@
         </w:rPr>
         <w:t xml:space="preserve"> 6M Adjusted EBITDA was EUR 306.6m, up 1.9%. Networks and Customers &amp; Solutions grew; Green Capacities fell to EUR 149.2m from 166.6m</w:t>
       </w:r>
-      <w:hyperlink r:id="rId12">
+      <w:hyperlink r:id="rId15">
         <w:r>
           <w:rPr>
             <w:color w:val="2A78D6"/>
             <w:vertAlign w:val="superscript"/>
             <w:sz w:val="17"/>
           </w:rPr>
-          <w:t xml:space="preserve">3</w:t>
+          <w:t xml:space="preserve">6</w:t>
         </w:r>
       </w:hyperlink>
       <w:r>
@@ -364,14 +473,14 @@
         </w:rPr>
         <w:t xml:space="preserve"> net debt EUR 1,925.3m, almost unchanged since year-end (+0.7%). Leverage is 3.49x net debt / EBITDA. One metric lags: FFO / net debt 22.2% against a target of at least 23%</w:t>
       </w:r>
-      <w:hyperlink r:id="rId14">
+      <w:hyperlink r:id="rId12">
         <w:r>
           <w:rPr>
             <w:color w:val="2A78D6"/>
             <w:vertAlign w:val="superscript"/>
             <w:sz w:val="17"/>
           </w:rPr>
-          <w:t xml:space="preserve">5</w:t>
+          <w:t xml:space="preserve">3</w:t>
         </w:r>
       </w:hyperlink>
       <w:r>
@@ -381,14 +490,14 @@
         </w:rPr>
         <w:t>,</w:t>
       </w:r>
-      <w:hyperlink r:id="rId15">
+      <w:hyperlink r:id="rId16">
         <w:r>
           <w:rPr>
             <w:color w:val="2A78D6"/>
             <w:vertAlign w:val="superscript"/>
             <w:sz w:val="17"/>
           </w:rPr>
-          <w:t xml:space="preserve">6</w:t>
+          <w:t xml:space="preserve">7</w:t>
         </w:r>
       </w:hyperlink>
       <w:r>
@@ -449,14 +558,14 @@
         </w:rPr>
         <w:t xml:space="preserve"> on 2026-10-19 Ignitis offered to buy back XS1646530565 (2.000%, matures 2027-07-14). The buy-back is financed by a new EUR 300m green bond at 4.500% due 2031</w:t>
       </w:r>
-      <w:hyperlink r:id="rId16">
+      <w:hyperlink r:id="rId14">
         <w:r>
           <w:rPr>
             <w:color w:val="2A78D6"/>
             <w:vertAlign w:val="superscript"/>
             <w:sz w:val="17"/>
           </w:rPr>
-          <w:t xml:space="preserve">7</w:t>
+          <w:t xml:space="preserve">5</w:t>
         </w:r>
       </w:hyperlink>
       <w:r>
@@ -921,7 +1030,6 @@
                 <w:b w:val="0"/>
                 <w:sz w:val="17"/>
               </w:rPr>
-              <w:t>⚠ Issuer pages differ on dates (newer page: 2018-07-10 / 2028-07-10; older page: 2017/2027) - check Final Terms</w:t>
             </w:r>
           </w:p>
         </w:tc>
@@ -2382,14 +2490,31 @@
               </w:rPr>
               <w:t>,</w:t>
             </w:r>
-            <w:hyperlink r:id="rId14">
+            <w:hyperlink r:id="rId12">
               <w:r>
                 <w:rPr>
                   <w:color w:val="2A78D6"/>
                   <w:vertAlign w:val="superscript"/>
                   <w:sz w:val="14"/>
                 </w:rPr>
-                <w:t xml:space="preserve">5</w:t>
+                <w:t xml:space="preserve">3</w:t>
+              </w:r>
+            </w:hyperlink>
+            <w:r>
+              <w:rPr>
+                <w:color w:val="2A78D6"/>
+                <w:vertAlign w:val="superscript"/>
+              </w:rPr>
+              <w:t>,</w:t>
+            </w:r>
+            <w:hyperlink r:id="rId23">
+              <w:r>
+                <w:rPr>
+                  <w:color w:val="2A78D6"/>
+                  <w:vertAlign w:val="superscript"/>
+                  <w:sz w:val="14"/>
+                </w:rPr>
+                <w:t xml:space="preserve">14</w:t>
               </w:r>
             </w:hyperlink>
           </w:p>
@@ -2447,7 +2572,7 @@
                 <w:b w:val="0"/>
                 <w:sz w:val="17"/>
               </w:rPr>
-              <w:t>–</w:t>
+              <w:t>1,609.9</w:t>
             </w:r>
           </w:p>
         </w:tc>
@@ -2486,7 +2611,7 @@
                 <w:color w:val="B42318"/>
                 <w:sz w:val="17"/>
               </w:rPr>
-              <w:t>▲ 0.7 % vs FY2025</w:t>
+              <w:t>▲ 19.6 % vs 6M2025</w:t>
             </w:r>
           </w:p>
         </w:tc>
@@ -2526,14 +2651,31 @@
               </w:rPr>
               <w:t>,</w:t>
             </w:r>
-            <w:hyperlink r:id="rId14">
+            <w:hyperlink r:id="rId12">
               <w:r>
                 <w:rPr>
                   <w:color w:val="2A78D6"/>
                   <w:vertAlign w:val="superscript"/>
                   <w:sz w:val="14"/>
                 </w:rPr>
-                <w:t xml:space="preserve">5</w:t>
+                <w:t xml:space="preserve">3</w:t>
+              </w:r>
+            </w:hyperlink>
+            <w:r>
+              <w:rPr>
+                <w:color w:val="2A78D6"/>
+                <w:vertAlign w:val="superscript"/>
+              </w:rPr>
+              <w:t>,</w:t>
+            </w:r>
+            <w:hyperlink r:id="rId23">
+              <w:r>
+                <w:rPr>
+                  <w:color w:val="2A78D6"/>
+                  <w:vertAlign w:val="superscript"/>
+                  <w:sz w:val="14"/>
+                </w:rPr>
+                <w:t xml:space="preserve">14</w:t>
               </w:r>
             </w:hyperlink>
           </w:p>
@@ -2594,7 +2736,7 @@
                 <w:b w:val="0"/>
                 <w:sz w:val="17"/>
               </w:rPr>
-              <w:t>–</w:t>
+              <w:t>2.99x</w:t>
             </w:r>
           </w:p>
         </w:tc>
@@ -2632,10 +2774,10 @@
             <w:r>
               <w:rPr>
                 <w:b/>
-                <w:color w:val="1B7F3B"/>
+                <w:color w:val="B42318"/>
                 <w:sz w:val="17"/>
               </w:rPr>
-              <w:t>▼ 0.01x vs FY2025</w:t>
+              <w:t>▲ 0.5x vs 6M2025</w:t>
             </w:r>
           </w:p>
         </w:tc>
@@ -2674,14 +2816,31 @@
               </w:rPr>
               <w:t>,</w:t>
             </w:r>
-            <w:hyperlink r:id="rId14">
+            <w:hyperlink r:id="rId12">
               <w:r>
                 <w:rPr>
                   <w:color w:val="2A78D6"/>
                   <w:vertAlign w:val="superscript"/>
                   <w:sz w:val="14"/>
                 </w:rPr>
-                <w:t xml:space="preserve">5</w:t>
+                <w:t xml:space="preserve">3</w:t>
+              </w:r>
+            </w:hyperlink>
+            <w:r>
+              <w:rPr>
+                <w:color w:val="2A78D6"/>
+                <w:vertAlign w:val="superscript"/>
+              </w:rPr>
+              <w:t>,</w:t>
+            </w:r>
+            <w:hyperlink r:id="rId23">
+              <w:r>
+                <w:rPr>
+                  <w:color w:val="2A78D6"/>
+                  <w:vertAlign w:val="superscript"/>
+                  <w:sz w:val="14"/>
+                </w:rPr>
+                <w:t xml:space="preserve">14</w:t>
               </w:r>
             </w:hyperlink>
           </w:p>
@@ -2739,7 +2898,7 @@
                 <w:b w:val="0"/>
                 <w:sz w:val="17"/>
               </w:rPr>
-              <w:t>–</w:t>
+              <w:t>29.8%</w:t>
             </w:r>
           </w:p>
         </w:tc>
@@ -2776,10 +2935,10 @@
             <w:r>
               <w:rPr>
                 <w:b/>
-                <w:color w:val="1B7F3B"/>
+                <w:color w:val="B42318"/>
                 <w:sz w:val="17"/>
               </w:rPr>
-              <w:t>▲ 1.2 p. p. vs FY2025</w:t>
+              <w:t>▼ 7.6 p. p. vs 6M2025</w:t>
             </w:r>
           </w:p>
         </w:tc>
@@ -2810,6 +2969,23 @@
                   <w:sz w:val="14"/>
                 </w:rPr>
                 <w:t xml:space="preserve">11</w:t>
+              </w:r>
+            </w:hyperlink>
+            <w:r>
+              <w:rPr>
+                <w:color w:val="2A78D6"/>
+                <w:vertAlign w:val="superscript"/>
+              </w:rPr>
+              <w:t>,</w:t>
+            </w:r>
+            <w:hyperlink r:id="rId24">
+              <w:r>
+                <w:rPr>
+                  <w:color w:val="2A78D6"/>
+                  <w:vertAlign w:val="superscript"/>
+                  <w:sz w:val="14"/>
+                </w:rPr>
+                <w:t xml:space="preserve">15</w:t>
               </w:r>
             </w:hyperlink>
             <w:r>
@@ -2887,7 +3063,7 @@
                 <w:b w:val="0"/>
                 <w:sz w:val="17"/>
               </w:rPr>
-              <w:t>–</w:t>
+              <w:t>8.6%</w:t>
             </w:r>
           </w:p>
         </w:tc>
@@ -2928,7 +3104,7 @@
                 <w:color w:val="B42318"/>
                 <w:sz w:val="17"/>
               </w:rPr>
-              <w:t>▼ 0.8 p. p. vs FY2025</w:t>
+              <w:t>▼ 1.9 p. p. vs 6M2025</w:t>
             </w:r>
           </w:p>
         </w:tc>
@@ -2960,6 +3136,23 @@
                 <w:t xml:space="preserve">14</w:t>
               </w:r>
             </w:hyperlink>
+            <w:r>
+              <w:rPr>
+                <w:color w:val="2A78D6"/>
+                <w:vertAlign w:val="superscript"/>
+              </w:rPr>
+              <w:t>,</w:t>
+            </w:r>
+            <w:hyperlink r:id="rId25">
+              <w:r>
+                <w:rPr>
+                  <w:color w:val="2A78D6"/>
+                  <w:vertAlign w:val="superscript"/>
+                  <w:sz w:val="14"/>
+                </w:rPr>
+                <w:t xml:space="preserve">16</w:t>
+              </w:r>
+            </w:hyperlink>
           </w:p>
         </w:tc>
         <w:tc>
@@ -2977,7 +3170,7 @@
                 <w:b w:val="0"/>
                 <w:sz w:val="17"/>
               </w:rPr>
-              <w:t>–</w:t>
+              <w:t>2,436.8</w:t>
             </w:r>
           </w:p>
         </w:tc>
@@ -2996,7 +3189,7 @@
                 <w:b w:val="0"/>
                 <w:sz w:val="17"/>
               </w:rPr>
-              <w:t>2,494.7*</w:t>
+              <w:t>2,494.7</w:t>
             </w:r>
           </w:p>
         </w:tc>
@@ -3015,7 +3208,7 @@
                 <w:b w:val="0"/>
                 <w:sz w:val="17"/>
               </w:rPr>
-              <w:t>–</w:t>
+              <w:t>2,492.0</w:t>
             </w:r>
           </w:p>
         </w:tc>
@@ -3054,7 +3247,7 @@
                 <w:color w:val="1B7F3B"/>
                 <w:sz w:val="17"/>
               </w:rPr>
-              <w:t>▲ 5.7 % vs FY2025</w:t>
+              <w:t>▲ 5.8 % vs 6M2025</w:t>
             </w:r>
           </w:p>
         </w:tc>
@@ -3087,6 +3280,23 @@
                 <w:t xml:space="preserve">14</w:t>
               </w:r>
             </w:hyperlink>
+            <w:r>
+              <w:rPr>
+                <w:color w:val="2A78D6"/>
+                <w:vertAlign w:val="superscript"/>
+              </w:rPr>
+              <w:t>,</w:t>
+            </w:r>
+            <w:hyperlink r:id="rId25">
+              <w:r>
+                <w:rPr>
+                  <w:color w:val="2A78D6"/>
+                  <w:vertAlign w:val="superscript"/>
+                  <w:sz w:val="14"/>
+                </w:rPr>
+                <w:t xml:space="preserve">16</w:t>
+              </w:r>
+            </w:hyperlink>
           </w:p>
         </w:tc>
         <w:tc>
@@ -3105,7 +3315,7 @@
                 <w:b w:val="0"/>
                 <w:sz w:val="17"/>
               </w:rPr>
-              <w:t>–</w:t>
+              <w:t>5,706.0</w:t>
             </w:r>
           </w:p>
         </w:tc>
@@ -3145,7 +3355,7 @@
                 <w:b w:val="0"/>
                 <w:sz w:val="17"/>
               </w:rPr>
-              <w:t>–</w:t>
+              <w:t>5,897.3</w:t>
             </w:r>
           </w:p>
         </w:tc>
@@ -3186,7 +3396,7 @@
                 <w:color w:val="5F6B7A"/>
                 <w:sz w:val="17"/>
               </w:rPr>
-              <w:t>▲ 1.0 % vs FY2025</w:t>
+              <w:t>▲ 7.5 % vs 6M2025</w:t>
             </w:r>
           </w:p>
         </w:tc>
@@ -3208,14 +3418,14 @@
               </w:rPr>
               <w:t>Dividend per share, EUR</w:t>
             </w:r>
-            <w:hyperlink r:id="rId24">
+            <w:hyperlink r:id="rId26">
               <w:r>
                 <w:rPr>
                   <w:color w:val="2A78D6"/>
                   <w:vertAlign w:val="superscript"/>
                   <w:sz w:val="14"/>
                 </w:rPr>
-                <w:t xml:space="preserve">15</w:t>
+                <w:t xml:space="preserve">17</w:t>
               </w:r>
             </w:hyperlink>
             <w:r>
@@ -3242,14 +3452,14 @@
               </w:rPr>
               <w:t>,</w:t>
             </w:r>
-            <w:hyperlink r:id="rId13">
+            <w:hyperlink r:id="rId27">
               <w:r>
                 <w:rPr>
                   <w:color w:val="2A78D6"/>
                   <w:vertAlign w:val="superscript"/>
                   <w:sz w:val="14"/>
                 </w:rPr>
-                <w:t xml:space="preserve">4</w:t>
+                <w:t xml:space="preserve">18</w:t>
               </w:r>
             </w:hyperlink>
           </w:p>
@@ -3307,7 +3517,7 @@
                 <w:b w:val="0"/>
                 <w:sz w:val="17"/>
               </w:rPr>
-              <w:t>–</w:t>
+              <w:t>0.683</w:t>
             </w:r>
           </w:p>
         </w:tc>
@@ -3342,11 +3552,11 @@
             <w:r/>
             <w:r>
               <w:rPr>
-                <w:b w:val="0"/>
-                <w:color w:val="5F6B7A"/>
+                <w:b/>
+                <w:color w:val="1B7F3B"/>
                 <w:sz w:val="17"/>
               </w:rPr>
-              <w:t>–</w:t>
+              <w:t>▲ 3.1 % vs 6M2025</w:t>
             </w:r>
           </w:p>
         </w:tc>
@@ -3377,6 +3587,23 @@
                   <w:sz w:val="14"/>
                 </w:rPr>
                 <w:t xml:space="preserve">12</w:t>
+              </w:r>
+            </w:hyperlink>
+            <w:r>
+              <w:rPr>
+                <w:color w:val="2A78D6"/>
+                <w:vertAlign w:val="superscript"/>
+              </w:rPr>
+              <w:t>,</w:t>
+            </w:r>
+            <w:hyperlink r:id="rId28">
+              <w:r>
+                <w:rPr>
+                  <w:color w:val="2A78D6"/>
+                  <w:vertAlign w:val="superscript"/>
+                  <w:sz w:val="14"/>
+                </w:rPr>
+                <w:t xml:space="preserve">19</w:t>
               </w:r>
             </w:hyperlink>
             <w:r>
@@ -3454,7 +3681,7 @@
                 <w:b w:val="0"/>
                 <w:sz w:val="17"/>
               </w:rPr>
-              <w:t>–</w:t>
+              <w:t>1.75</w:t>
             </w:r>
           </w:p>
         </w:tc>
@@ -3491,11 +3718,11 @@
             <w:r/>
             <w:r>
               <w:rPr>
-                <w:b w:val="0"/>
-                <w:color w:val="5F6B7A"/>
+                <w:b/>
+                <w:color w:val="1B7F3B"/>
                 <w:sz w:val="17"/>
               </w:rPr>
-              <w:t>• 0.0 % vs FY2025</w:t>
+              <w:t>▲ 20.0 % vs 6M2025</w:t>
             </w:r>
           </w:p>
         </w:tc>
@@ -3538,7 +3765,7 @@
                     <pic:cNvPicPr/>
                   </pic:nvPicPr>
                   <pic:blipFill>
-                    <a:blip r:embed="rId25"/>
+                    <a:blip r:embed="rId29"/>
                     <a:stretch>
                       <a:fillRect/>
                     </a:stretch>
@@ -3590,14 +3817,14 @@
         </w:rPr>
         <w:t xml:space="preserve"> investments EUR 208.3m (+26.1%), 68% of total; segment Adjusted EBITDA EUR 147.3m (132.6m)</w:t>
       </w:r>
-      <w:hyperlink r:id="rId26">
+      <w:hyperlink r:id="rId30">
         <w:r>
           <w:rPr>
             <w:color w:val="2A78D6"/>
             <w:vertAlign w:val="superscript"/>
             <w:sz w:val="17"/>
           </w:rPr>
-          <w:t xml:space="preserve">16</w:t>
+          <w:t xml:space="preserve">20</w:t>
         </w:r>
       </w:hyperlink>
       <w:r>
@@ -3631,7 +3858,7 @@
             <w:vertAlign w:val="superscript"/>
             <w:sz w:val="17"/>
           </w:rPr>
-          <w:t xml:space="preserve">17</w:t>
+          <w:t xml:space="preserve">21</w:t>
         </w:r>
       </w:hyperlink>
       <w:r>
@@ -3640,14 +3867,14 @@
         </w:rPr>
         <w:t>. EBITDA declined due to weaker wind in Q1-Q2 and a lower hedge price (EUR 130 → 82/MWh)</w:t>
       </w:r>
-      <w:hyperlink r:id="rId27">
+      <w:hyperlink r:id="rId31">
         <w:r>
           <w:rPr>
             <w:color w:val="2A78D6"/>
             <w:vertAlign w:val="superscript"/>
             <w:sz w:val="17"/>
           </w:rPr>
-          <w:t xml:space="preserve">18</w:t>
+          <w:t xml:space="preserve">22</w:t>
         </w:r>
       </w:hyperlink>
       <w:r>
@@ -3674,14 +3901,14 @@
         </w:rPr>
         <w:t xml:space="preserve"> Adjusted EBITDA EUR 17.9m (29.1m, −38%); the balancing market is becoming more competitive</w:t>
       </w:r>
-      <w:hyperlink r:id="rId12">
+      <w:hyperlink r:id="rId15">
         <w:r>
           <w:rPr>
             <w:color w:val="2A78D6"/>
             <w:vertAlign w:val="superscript"/>
             <w:sz w:val="17"/>
           </w:rPr>
-          <w:t xml:space="preserve">3</w:t>
+          <w:t xml:space="preserve">6</w:t>
         </w:r>
       </w:hyperlink>
       <w:r>
@@ -3691,14 +3918,14 @@
         </w:rPr>
         <w:t>,</w:t>
       </w:r>
-      <w:hyperlink r:id="rId27">
+      <w:hyperlink r:id="rId31">
         <w:r>
           <w:rPr>
             <w:color w:val="2A78D6"/>
             <w:vertAlign w:val="superscript"/>
             <w:sz w:val="17"/>
           </w:rPr>
-          <w:t xml:space="preserve">18</w:t>
+          <w:t xml:space="preserve">22</w:t>
         </w:r>
       </w:hyperlink>
       <w:r>
@@ -3741,14 +3968,14 @@
         </w:rPr>
         <w:t>. Prosumer impact c. EUR −30m EBITDA in 2025, expected somewhat higher in 2026, 60-70% to be covered by new legislation</w:t>
       </w:r>
-      <w:hyperlink r:id="rId27">
+      <w:hyperlink r:id="rId31">
         <w:r>
           <w:rPr>
             <w:color w:val="2A78D6"/>
             <w:vertAlign w:val="superscript"/>
             <w:sz w:val="17"/>
           </w:rPr>
-          <w:t xml:space="preserve">18</w:t>
+          <w:t xml:space="preserve">22</w:t>
         </w:r>
       </w:hyperlink>
       <w:r>
@@ -3775,14 +4002,14 @@
         </w:rPr>
         <w:t xml:space="preserve"> 49% of Vilnius CHP sold (Quaero Capital, March 2026); 399 MW / 798 MWh of BESS under construction; Kruonis PSHP unit 5 ~80% complete; data-centre partner search launched 2026-08-11</w:t>
       </w:r>
-      <w:hyperlink r:id="rId28">
+      <w:hyperlink r:id="rId32">
         <w:r>
           <w:rPr>
             <w:color w:val="2A78D6"/>
             <w:vertAlign w:val="superscript"/>
             <w:sz w:val="17"/>
           </w:rPr>
-          <w:t xml:space="preserve">19</w:t>
+          <w:t xml:space="preserve">23</w:t>
         </w:r>
       </w:hyperlink>
       <w:r>
@@ -3826,14 +4053,14 @@
         </w:rPr>
         <w:t xml:space="preserve"> a contractor employee was fatally injured in February 2026</w:t>
       </w:r>
-      <w:hyperlink r:id="rId29">
+      <w:hyperlink r:id="rId33">
         <w:r>
           <w:rPr>
             <w:color w:val="2A78D6"/>
             <w:vertAlign w:val="superscript"/>
             <w:sz w:val="17"/>
           </w:rPr>
-          <w:t xml:space="preserve">20</w:t>
+          <w:t xml:space="preserve">24</w:t>
         </w:r>
       </w:hyperlink>
       <w:r>
@@ -3877,7 +4104,7 @@
             <w:vertAlign w:val="superscript"/>
             <w:sz w:val="17"/>
           </w:rPr>
-          <w:t xml:space="preserve">21</w:t>
+          <w:t xml:space="preserve">25</w:t>
         </w:r>
       </w:hyperlink>
       <w:r>
@@ -3905,7 +4132,7 @@
             <w:vertAlign w:val="superscript"/>
             <w:sz w:val="17"/>
           </w:rPr>
-          <w:t xml:space="preserve">22</w:t>
+          <w:t xml:space="preserve">26</w:t>
         </w:r>
       </w:hyperlink>
       <w:r>
@@ -4151,14 +4378,14 @@
               </w:rPr>
               <w:t>On track: 6M covers 51-56% of the range. Networks and Customers &amp; Solutions grew; Green Capacities fell on weaker wind and a lower hedge price</w:t>
             </w:r>
-            <w:hyperlink r:id="rId12">
+            <w:hyperlink r:id="rId15">
               <w:r>
                 <w:rPr>
                   <w:color w:val="2A78D6"/>
                   <w:vertAlign w:val="superscript"/>
                   <w:sz w:val="14"/>
                 </w:rPr>
-                <w:t xml:space="preserve">3</w:t>
+                <w:t xml:space="preserve">6</w:t>
               </w:r>
             </w:hyperlink>
             <w:r>
@@ -4168,14 +4395,14 @@
               </w:rPr>
               <w:t>,</w:t>
             </w:r>
-            <w:hyperlink r:id="rId27">
+            <w:hyperlink r:id="rId31">
               <w:r>
                 <w:rPr>
                   <w:color w:val="2A78D6"/>
                   <w:vertAlign w:val="superscript"/>
                   <w:sz w:val="14"/>
                 </w:rPr>
-                <w:t xml:space="preserve">18</w:t>
+                <w:t xml:space="preserve">22</w:t>
               </w:r>
             </w:hyperlink>
             <w:r>
@@ -4261,14 +4488,14 @@
               </w:rPr>
               <w:t>,</w:t>
             </w:r>
-            <w:hyperlink r:id="rId26">
+            <w:hyperlink r:id="rId30">
               <w:r>
                 <w:rPr>
                   <w:color w:val="2A78D6"/>
                   <w:vertAlign w:val="superscript"/>
                   <w:sz w:val="14"/>
                 </w:rPr>
-                <w:t xml:space="preserve">23</w:t>
+                <w:t xml:space="preserve">27</w:t>
               </w:r>
             </w:hyperlink>
           </w:p>
@@ -4290,14 +4517,14 @@
               </w:rPr>
               <w:t>On track: 6M investments EUR 306.1m (−10.8% y/y); 68% went to Networks</w:t>
             </w:r>
-            <w:hyperlink r:id="rId26">
+            <w:hyperlink r:id="rId30">
               <w:r>
                 <w:rPr>
                   <w:color w:val="2A78D6"/>
                   <w:vertAlign w:val="superscript"/>
                   <w:sz w:val="14"/>
                 </w:rPr>
-                <w:t xml:space="preserve">23</w:t>
+                <w:t xml:space="preserve">27</w:t>
               </w:r>
             </w:hyperlink>
             <w:r>
@@ -4364,14 +4591,14 @@
               </w:rPr>
               <w:t>New strategy 2026-2029: investments EUR 2.5-3.0bn, 2029 EBITDA EUR 640-700m (investment envelope reduced)</w:t>
             </w:r>
-            <w:hyperlink r:id="rId30">
+            <w:hyperlink r:id="rId34">
               <w:r>
                 <w:rPr>
                   <w:color w:val="2A78D6"/>
                   <w:vertAlign w:val="superscript"/>
                   <w:sz w:val="14"/>
                 </w:rPr>
-                <w:t xml:space="preserve">24</w:t>
+                <w:t xml:space="preserve">28</w:t>
               </w:r>
             </w:hyperlink>
             <w:r>
@@ -4381,14 +4608,14 @@
               </w:rPr>
               <w:t>,</w:t>
             </w:r>
-            <w:hyperlink r:id="rId15">
+            <w:hyperlink r:id="rId16">
               <w:r>
                 <w:rPr>
                   <w:color w:val="2A78D6"/>
                   <w:vertAlign w:val="superscript"/>
                   <w:sz w:val="14"/>
                 </w:rPr>
-                <w:t xml:space="preserve">6</w:t>
+                <w:t xml:space="preserve">7</w:t>
               </w:r>
             </w:hyperlink>
           </w:p>
@@ -4409,14 +4636,14 @@
               </w:rPr>
               <w:t>Changed: the new 2026-2029 plan cuts the investment envelope to EUR 2.5-3.0bn and raises the EBITDA target to EUR 640-700m for 2029. Reason: not stated in the sources reviewed</w:t>
             </w:r>
-            <w:hyperlink r:id="rId15">
+            <w:hyperlink r:id="rId16">
               <w:r>
                 <w:rPr>
                   <w:color w:val="2A78D6"/>
                   <w:vertAlign w:val="superscript"/>
                   <w:sz w:val="14"/>
                 </w:rPr>
-                <w:t xml:space="preserve">6</w:t>
+                <w:t xml:space="preserve">7</w:t>
               </w:r>
             </w:hyperlink>
             <w:r>
@@ -4485,14 +4712,14 @@
               </w:rPr>
               <w:t>YE2025: 21.0%; 30 Jun 2026 (LTM): 22.2%</w:t>
             </w:r>
-            <w:hyperlink r:id="rId15">
+            <w:hyperlink r:id="rId16">
               <w:r>
                 <w:rPr>
                   <w:color w:val="2A78D6"/>
                   <w:vertAlign w:val="superscript"/>
                   <w:sz w:val="14"/>
                 </w:rPr>
-                <w:t xml:space="preserve">6</w:t>
+                <w:t xml:space="preserve">7</w:t>
               </w:r>
             </w:hyperlink>
             <w:r>
@@ -4502,14 +4729,14 @@
               </w:rPr>
               <w:t>,</w:t>
             </w:r>
-            <w:hyperlink r:id="rId14">
+            <w:hyperlink r:id="rId12">
               <w:r>
                 <w:rPr>
                   <w:color w:val="2A78D6"/>
                   <w:vertAlign w:val="superscript"/>
                   <w:sz w:val="14"/>
                 </w:rPr>
-                <w:t xml:space="preserve">5</w:t>
+                <w:t xml:space="preserve">3</w:t>
               </w:r>
             </w:hyperlink>
           </w:p>
@@ -4531,14 +4758,14 @@
               </w:rPr>
               <w:t>Improving but still below target: 21.0% → 22.2% as FFO grew 11.3% while net debt stayed flat (+0.7%)</w:t>
             </w:r>
-            <w:hyperlink r:id="rId14">
+            <w:hyperlink r:id="rId12">
               <w:r>
                 <w:rPr>
                   <w:color w:val="2A78D6"/>
                   <w:vertAlign w:val="superscript"/>
                   <w:sz w:val="14"/>
                 </w:rPr>
-                <w:t xml:space="preserve">25</w:t>
+                <w:t xml:space="preserve">29</w:t>
               </w:r>
             </w:hyperlink>
             <w:r>
@@ -4605,14 +4832,14 @@
               </w:rPr>
               <w:t>3.49x; S&amp;P BBB+, Moody's Baa1</w:t>
             </w:r>
-            <w:hyperlink r:id="rId15">
+            <w:hyperlink r:id="rId16">
               <w:r>
                 <w:rPr>
                   <w:color w:val="2A78D6"/>
                   <w:vertAlign w:val="superscript"/>
                   <w:sz w:val="14"/>
                 </w:rPr>
-                <w:t xml:space="preserve">6</w:t>
+                <w:t xml:space="preserve">7</w:t>
               </w:r>
             </w:hyperlink>
             <w:r>
@@ -4622,14 +4849,14 @@
               </w:rPr>
               <w:t>,</w:t>
             </w:r>
-            <w:hyperlink r:id="rId14">
+            <w:hyperlink r:id="rId12">
               <w:r>
                 <w:rPr>
                   <w:color w:val="2A78D6"/>
                   <w:vertAlign w:val="superscript"/>
                   <w:sz w:val="14"/>
                 </w:rPr>
-                <w:t xml:space="preserve">5</w:t>
+                <w:t xml:space="preserve">3</w:t>
               </w:r>
             </w:hyperlink>
             <w:r>
@@ -4667,14 +4894,14 @@
               </w:rPr>
               <w:t>Met: leverage 3.49x, in the middle of the range; net debt +0.7% since YE2025; ratings stable</w:t>
             </w:r>
-            <w:hyperlink r:id="rId14">
+            <w:hyperlink r:id="rId12">
               <w:r>
                 <w:rPr>
                   <w:color w:val="2A78D6"/>
                   <w:vertAlign w:val="superscript"/>
                   <w:sz w:val="14"/>
                 </w:rPr>
-                <w:t xml:space="preserve">5</w:t>
+                <w:t xml:space="preserve">3</w:t>
               </w:r>
             </w:hyperlink>
             <w:r>
@@ -4760,14 +4987,14 @@
               </w:rPr>
               <w:t>2025: EUR 1.366 (+3.0%); H1 2026: EUR 0.704 (+3.1%)</w:t>
             </w:r>
-            <w:hyperlink r:id="rId15">
+            <w:hyperlink r:id="rId16">
               <w:r>
                 <w:rPr>
                   <w:color w:val="2A78D6"/>
                   <w:vertAlign w:val="superscript"/>
                   <w:sz w:val="14"/>
                 </w:rPr>
-                <w:t xml:space="preserve">6</w:t>
+                <w:t xml:space="preserve">7</w:t>
               </w:r>
             </w:hyperlink>
             <w:r>
@@ -4914,14 +5141,14 @@
               </w:rPr>
               <w:t>2.1 GW installed, 0.7 GW under construction</w:t>
             </w:r>
-            <w:hyperlink r:id="rId15">
+            <w:hyperlink r:id="rId16">
               <w:r>
                 <w:rPr>
                   <w:color w:val="2A78D6"/>
                   <w:vertAlign w:val="superscript"/>
                   <w:sz w:val="14"/>
                 </w:rPr>
-                <w:t xml:space="preserve">6</w:t>
+                <w:t xml:space="preserve">7</w:t>
               </w:r>
             </w:hyperlink>
             <w:r>
@@ -4931,14 +5158,14 @@
               </w:rPr>
               <w:t>,</w:t>
             </w:r>
-            <w:hyperlink r:id="rId31">
+            <w:hyperlink r:id="rId35">
               <w:r>
                 <w:rPr>
                   <w:color w:val="2A78D6"/>
                   <w:vertAlign w:val="superscript"/>
                   <w:sz w:val="14"/>
                 </w:rPr>
-                <w:t xml:space="preserve">26</w:t>
+                <w:t xml:space="preserve">30</w:t>
               </w:r>
             </w:hyperlink>
           </w:p>
@@ -4959,14 +5186,14 @@
               </w:rPr>
               <w:t>Progressing: 2.1 GW installed + 0.7 GW under construction = 2.8 GW, the bottom of the target range (calculated by the tool)</w:t>
             </w:r>
-            <w:hyperlink r:id="rId31">
+            <w:hyperlink r:id="rId35">
               <w:r>
                 <w:rPr>
                   <w:color w:val="2A78D6"/>
                   <w:vertAlign w:val="superscript"/>
                   <w:sz w:val="14"/>
                 </w:rPr>
-                <w:t xml:space="preserve">26</w:t>
+                <w:t xml:space="preserve">30</w:t>
               </w:r>
             </w:hyperlink>
             <w:r>
@@ -5032,14 +5259,14 @@
         </w:rPr>
         <w:t xml:space="preserve"> shares (IGN1L) and three bonds (2027, 2028, 2030). The bonds are senior unsecured and carry the issuer rating of BBB+ (S&amp;P)</w:t>
       </w:r>
-      <w:hyperlink r:id="rId16">
+      <w:hyperlink r:id="rId14">
         <w:r>
           <w:rPr>
             <w:color w:val="2A78D6"/>
             <w:vertAlign w:val="superscript"/>
             <w:sz w:val="17"/>
           </w:rPr>
-          <w:t xml:space="preserve">7</w:t>
+          <w:t xml:space="preserve">5</w:t>
         </w:r>
       </w:hyperlink>
       <w:r>
@@ -5066,14 +5293,14 @@
         </w:rPr>
         <w:t xml:space="preserve"> leverage (3.49x) is within the strategic 3-4x range and ratings are stable; FFO / net debt (22.2%) is still below the ≥23% target. Investment is mostly in regulated networks</w:t>
       </w:r>
-      <w:hyperlink r:id="rId26">
+      <w:hyperlink r:id="rId30">
         <w:r>
           <w:rPr>
             <w:color w:val="2A78D6"/>
             <w:vertAlign w:val="superscript"/>
             <w:sz w:val="17"/>
           </w:rPr>
-          <w:t xml:space="preserve">27</w:t>
+          <w:t xml:space="preserve">31</w:t>
         </w:r>
       </w:hyperlink>
       <w:r>
@@ -5083,14 +5310,14 @@
         </w:rPr>
         <w:t>,</w:t>
       </w:r>
-      <w:hyperlink r:id="rId15">
+      <w:hyperlink r:id="rId16">
         <w:r>
           <w:rPr>
             <w:color w:val="2A78D6"/>
             <w:vertAlign w:val="superscript"/>
             <w:sz w:val="17"/>
           </w:rPr>
-          <w:t xml:space="preserve">6</w:t>
+          <w:t xml:space="preserve">7</w:t>
         </w:r>
       </w:hyperlink>
       <w:r>
@@ -5134,14 +5361,14 @@
         </w:rPr>
         <w:t xml:space="preserve"> the 2026-10-19 tender offer requires a decision (tender or hold to 2027-07-14). Terms and deadline are in the issuer's Tender Offer Launch Announcement</w:t>
       </w:r>
-      <w:hyperlink r:id="rId16">
+      <w:hyperlink r:id="rId14">
         <w:r>
           <w:rPr>
             <w:color w:val="2A78D6"/>
             <w:vertAlign w:val="superscript"/>
             <w:sz w:val="17"/>
           </w:rPr>
-          <w:t xml:space="preserve">7</w:t>
+          <w:t xml:space="preserve">5</w:t>
         </w:r>
       </w:hyperlink>
       <w:r>
@@ -5301,14 +5528,14 @@
         </w:rPr>
         <w:t>No coal generation and no oil &amp; gas exploration</w:t>
       </w:r>
-      <w:hyperlink r:id="rId24">
+      <w:hyperlink r:id="rId26">
         <w:r>
           <w:rPr>
             <w:color w:val="2A78D6"/>
             <w:vertAlign w:val="superscript"/>
             <w:sz w:val="16"/>
           </w:rPr>
-          <w:t xml:space="preserve">15</w:t>
+          <w:t xml:space="preserve">17</w:t>
         </w:r>
       </w:hyperlink>
       <w:r>
@@ -5393,14 +5620,14 @@
         </w:rPr>
         <w:t>Ignitis states it upholds the UN Global Compact principles</w:t>
       </w:r>
-      <w:hyperlink r:id="rId24">
+      <w:hyperlink r:id="rId26">
         <w:r>
           <w:rPr>
             <w:color w:val="2A78D6"/>
             <w:vertAlign w:val="superscript"/>
             <w:sz w:val="16"/>
           </w:rPr>
-          <w:t xml:space="preserve">15</w:t>
+          <w:t xml:space="preserve">17</w:t>
         </w:r>
       </w:hyperlink>
       <w:r>
@@ -5457,7 +5684,7 @@
           <w:color w:val="333333"/>
           <w:sz w:val="19"/>
         </w:rPr>
-        <w:t>Checked by the analyst with internal tools (add a screenshot).</w:t>
+        <w:t>Automatic check against the EU, UN, US OFAC and UK consolidated sanctions lists.</w:t>
       </w:r>
     </w:p>
     <w:p>
@@ -5468,44 +5695,10 @@
         <w:rPr>
           <w:sz w:val="24"/>
         </w:rPr>
-        <w:t xml:space="preserve">☐ </w:t>
+        <w:t xml:space="preserve">☑ </w:t>
       </w:r>
       <w:r>
         <w:t>Yes, issues were not identified from adverse media checks (add a screenshot)</w:t>
-      </w:r>
-    </w:p>
-    <w:p>
-      <w:pPr>
-        <w:spacing w:after="0"/>
-        <w:ind w:left="397"/>
-      </w:pPr>
-      <w:r>
-        <w:rPr>
-          <w:b/>
-          <w:color w:val="B42318"/>
-          <w:sz w:val="19"/>
-        </w:rPr>
-        <w:t>Needs review</w:t>
-      </w:r>
-    </w:p>
-    <w:p>
-      <w:pPr>
-        <w:spacing w:after="0"/>
-        <w:ind w:left="510" w:hanging="198"/>
-      </w:pPr>
-      <w:r>
-        <w:rPr>
-          <w:sz w:val="19"/>
-        </w:rPr>
-        <w:t xml:space="preserve">•  </w:t>
-      </w:r>
-      <w:r>
-        <w:rPr>
-          <w:b w:val="0"/>
-          <w:color w:val="333333"/>
-          <w:sz w:val="19"/>
-        </w:rPr>
-        <w:t>The automatic news scan (LT, LV, EE, EN; 30 days) found no adverse headlines.</w:t>
       </w:r>
     </w:p>
     <w:p>
@@ -5525,7 +5718,7 @@
           <w:color w:val="333333"/>
           <w:sz w:val="19"/>
         </w:rPr>
-        <w:t>Analyst confirms and adds a screenshot.</w:t>
+        <w:t>No adverse news found in the automatic news scan (Lithuanian, Latvian, Estonian and English media, last 30 days, 2026-10-22).</w:t>
       </w:r>
     </w:p>
     <w:p>
@@ -5675,14 +5868,14 @@
         </w:rPr>
         <w:t>EU Taxonomy-aligned capex 84.7% in 2025</w:t>
       </w:r>
-      <w:hyperlink r:id="rId24">
+      <w:hyperlink r:id="rId26">
         <w:r>
           <w:rPr>
             <w:color w:val="2A78D6"/>
             <w:vertAlign w:val="superscript"/>
             <w:sz w:val="16"/>
           </w:rPr>
-          <w:t xml:space="preserve">15</w:t>
+          <w:t xml:space="preserve">17</w:t>
         </w:r>
       </w:hyperlink>
       <w:r>
@@ -5733,14 +5926,14 @@
         </w:rPr>
         <w:t>Net zero by 2050 or sooner</w:t>
       </w:r>
-      <w:hyperlink r:id="rId32">
+      <w:hyperlink r:id="rId36">
         <w:r>
           <w:rPr>
             <w:color w:val="2A78D6"/>
             <w:vertAlign w:val="superscript"/>
             <w:sz w:val="16"/>
           </w:rPr>
-          <w:t xml:space="preserve">28</w:t>
+          <w:t xml:space="preserve">32</w:t>
         </w:r>
       </w:hyperlink>
       <w:r>
@@ -5760,7 +5953,7 @@
         <w:rPr>
           <w:sz w:val="24"/>
         </w:rPr>
-        <w:t xml:space="preserve">☐ </w:t>
+        <w:t xml:space="preserve">☑ </w:t>
       </w:r>
       <w:r>
         <w:t>Yes, the company does not have yellow flag/signal related to controversies based on UN Global Compact or any other relevant principles/standards</w:t>
@@ -5774,16 +5967,16 @@
       <w:r>
         <w:rPr>
           <w:b/>
-          <w:color w:val="B42318"/>
+          <w:color w:val="333333"/>
           <w:sz w:val="19"/>
         </w:rPr>
-        <w:t>Needs review</w:t>
+        <w:t>No material yellow flag</w:t>
       </w:r>
     </w:p>
     <w:p>
       <w:pPr>
         <w:spacing w:after="0"/>
-        <w:ind w:left="510" w:hanging="198"/>
+        <w:ind w:left="737" w:hanging="198"/>
       </w:pPr>
       <w:r>
         <w:rPr>
@@ -5797,31 +5990,57 @@
           <w:color w:val="333333"/>
           <w:sz w:val="19"/>
         </w:rPr>
-        <w:t>Possible yellow flag: a contractor employee was fatally injured in February 2026</w:t>
+        <w:t>No UN Global Compact related controversies found.</w:t>
       </w:r>
-      <w:hyperlink r:id="rId29">
+    </w:p>
+    <w:p>
+      <w:pPr>
+        <w:spacing w:after="0"/>
+        <w:ind w:left="397"/>
+      </w:pPr>
+      <w:r>
+        <w:rPr>
+          <w:b/>
+          <w:color w:val="333333"/>
+          <w:sz w:val="19"/>
+        </w:rPr>
+        <w:t>To note</w:t>
+      </w:r>
+    </w:p>
+    <w:p>
+      <w:pPr>
+        <w:spacing w:after="0"/>
+        <w:ind w:left="737" w:hanging="198"/>
+      </w:pPr>
+      <w:r>
+        <w:rPr>
+          <w:sz w:val="19"/>
+        </w:rPr>
+        <w:t xml:space="preserve">•  </w:t>
+      </w:r>
+      <w:r>
+        <w:rPr>
+          <w:b w:val="0"/>
+          <w:color w:val="333333"/>
+          <w:sz w:val="19"/>
+        </w:rPr>
+        <w:t>A contractor employee was fatally injured in February 2026</w:t>
+      </w:r>
+      <w:hyperlink r:id="rId33">
         <w:r>
           <w:rPr>
             <w:color w:val="2A78D6"/>
             <w:vertAlign w:val="superscript"/>
             <w:sz w:val="16"/>
           </w:rPr>
-          <w:t xml:space="preserve">20</w:t>
+          <w:t xml:space="preserve">24</w:t>
         </w:r>
       </w:hyperlink>
-      <w:r>
-        <w:rPr>
-          <w:b w:val="0"/>
-          <w:color w:val="333333"/>
-          <w:sz w:val="19"/>
-        </w:rPr>
-        <w:t>.</w:t>
-      </w:r>
     </w:p>
     <w:p>
       <w:pPr>
-        <w:spacing w:after="120"/>
-        <w:ind w:left="510" w:hanging="198"/>
+        <w:spacing w:after="0"/>
+        <w:ind w:left="737" w:hanging="198"/>
       </w:pPr>
       <w:r>
         <w:rPr>
@@ -5837,14 +6056,52 @@
         </w:rPr>
         <w:t>Scope 1 emissions rose 54.7% in 2025 due to higher gas generation</w:t>
       </w:r>
-      <w:hyperlink r:id="rId24">
+      <w:hyperlink r:id="rId26">
         <w:r>
           <w:rPr>
             <w:color w:val="2A78D6"/>
             <w:vertAlign w:val="superscript"/>
             <w:sz w:val="16"/>
           </w:rPr>
-          <w:t xml:space="preserve">15</w:t>
+          <w:t xml:space="preserve">17</w:t>
+        </w:r>
+      </w:hyperlink>
+      <w:r>
+        <w:rPr>
+          <w:b w:val="0"/>
+          <w:color w:val="333333"/>
+          <w:sz w:val="19"/>
+        </w:rPr>
+        <w:t>.</w:t>
+      </w:r>
+    </w:p>
+    <w:p>
+      <w:pPr>
+        <w:spacing w:after="120"/>
+        <w:ind w:left="737" w:hanging="198"/>
+      </w:pPr>
+      <w:r>
+        <w:rPr>
+          <w:sz w:val="19"/>
+        </w:rPr>
+        <w:t xml:space="preserve">•  </w:t>
+      </w:r>
+      <w:r>
+        <w:rPr>
+          <w:b w:val="0"/>
+          <w:color w:val="333333"/>
+          <w:sz w:val="19"/>
+        </w:rPr>
+        <w:t>Safety is managed under ISO 45001</w:t>
+      </w:r>
+      <w:hyperlink r:id="rId37">
+        <w:r>
+          <w:rPr>
+            <w:color w:val="2A78D6"/>
+            <w:vertAlign w:val="superscript"/>
+            <w:sz w:val="16"/>
+          </w:rPr>
+          <w:t xml:space="preserve">33</w:t>
         </w:r>
       </w:hyperlink>
       <w:r>
@@ -5903,14 +6160,14 @@
         </w:rPr>
         <w:t>The SEB Investments policy</w:t>
       </w:r>
-      <w:hyperlink r:id="rId33">
+      <w:hyperlink r:id="rId38">
         <w:r>
           <w:rPr>
             <w:color w:val="2A78D6"/>
             <w:vertAlign w:val="superscript"/>
             <w:sz w:val="16"/>
           </w:rPr>
-          <w:t xml:space="preserve">29</w:t>
+          <w:t xml:space="preserve">34</w:t>
         </w:r>
       </w:hyperlink>
       <w:r>
@@ -5921,14 +6178,14 @@
         </w:rPr>
         <w:t>, the Electricity &amp; Renewable Energy policy, since green generation and networks make up more than 15% of revenue</w:t>
       </w:r>
-      <w:hyperlink r:id="rId34">
+      <w:hyperlink r:id="rId39">
         <w:r>
           <w:rPr>
             <w:color w:val="2A78D6"/>
             <w:vertAlign w:val="superscript"/>
             <w:sz w:val="16"/>
           </w:rPr>
-          <w:t xml:space="preserve">30</w:t>
+          <w:t xml:space="preserve">35</w:t>
         </w:r>
       </w:hyperlink>
       <w:r>
@@ -5959,14 +6216,14 @@
         </w:rPr>
         <w:t>The gas revenue share was not found</w:t>
       </w:r>
-      <w:hyperlink r:id="rId35">
+      <w:hyperlink r:id="rId40">
         <w:r>
           <w:rPr>
             <w:color w:val="2A78D6"/>
             <w:vertAlign w:val="superscript"/>
             <w:sz w:val="16"/>
           </w:rPr>
-          <w:t xml:space="preserve">31</w:t>
+          <w:t xml:space="preserve">36</w:t>
         </w:r>
       </w:hyperlink>
       <w:r>
@@ -5976,14 +6233,14 @@
         </w:rPr>
         <w:t>,</w:t>
       </w:r>
-      <w:hyperlink r:id="rId36">
+      <w:hyperlink r:id="rId41">
         <w:r>
           <w:rPr>
             <w:color w:val="2A78D6"/>
             <w:vertAlign w:val="superscript"/>
             <w:sz w:val="16"/>
           </w:rPr>
-          <w:t xml:space="preserve">32</w:t>
+          <w:t xml:space="preserve">37</w:t>
         </w:r>
       </w:hyperlink>
       <w:r>
@@ -6028,14 +6285,14 @@
         </w:rPr>
         <w:t>Scope 1-3 emissions disclosed (4.49m t CO2e in 2025) and SBTi-validated 1.5°C targets</w:t>
       </w:r>
-      <w:hyperlink r:id="rId37">
+      <w:hyperlink r:id="rId42">
         <w:r>
           <w:rPr>
             <w:color w:val="2A78D6"/>
             <w:vertAlign w:val="superscript"/>
             <w:sz w:val="16"/>
           </w:rPr>
-          <w:t xml:space="preserve">33</w:t>
+          <w:t xml:space="preserve">38</w:t>
         </w:r>
       </w:hyperlink>
     </w:p>
@@ -6058,14 +6315,14 @@
         </w:rPr>
         <w:t>ISO 14001 environmental management at ESO, Ignitis gamyba, Ignitis and the Vilnius and Kaunas CHPs</w:t>
       </w:r>
-      <w:hyperlink r:id="rId38">
+      <w:hyperlink r:id="rId37">
         <w:r>
           <w:rPr>
             <w:color w:val="2A78D6"/>
             <w:vertAlign w:val="superscript"/>
             <w:sz w:val="16"/>
           </w:rPr>
-          <w:t xml:space="preserve">34</w:t>
+          <w:t xml:space="preserve">33</w:t>
         </w:r>
       </w:hyperlink>
       <w:r>
@@ -6096,14 +6353,14 @@
         </w:rPr>
         <w:t>No coal, peat or oil &amp; gas extraction</w:t>
       </w:r>
-      <w:hyperlink r:id="rId24">
+      <w:hyperlink r:id="rId26">
         <w:r>
           <w:rPr>
             <w:color w:val="2A78D6"/>
             <w:vertAlign w:val="superscript"/>
             <w:sz w:val="16"/>
           </w:rPr>
-          <w:t xml:space="preserve">15</w:t>
+          <w:t xml:space="preserve">17</w:t>
         </w:r>
       </w:hyperlink>
       <w:r>
@@ -6148,14 +6405,14 @@
         </w:rPr>
         <w:t>ISO 45001 safety management, no fatal accidents in 2025</w:t>
       </w:r>
-      <w:hyperlink r:id="rId39">
+      <w:hyperlink r:id="rId43">
         <w:r>
           <w:rPr>
             <w:color w:val="2A78D6"/>
             <w:vertAlign w:val="superscript"/>
             <w:sz w:val="16"/>
           </w:rPr>
-          <w:t xml:space="preserve">35</w:t>
+          <w:t xml:space="preserve">39</w:t>
         </w:r>
       </w:hyperlink>
       <w:r>
@@ -6165,14 +6422,14 @@
         </w:rPr>
         <w:t>,</w:t>
       </w:r>
-      <w:hyperlink r:id="rId38">
+      <w:hyperlink r:id="rId37">
         <w:r>
           <w:rPr>
             <w:color w:val="2A78D6"/>
             <w:vertAlign w:val="superscript"/>
             <w:sz w:val="16"/>
           </w:rPr>
-          <w:t xml:space="preserve">34</w:t>
+          <w:t xml:space="preserve">33</w:t>
         </w:r>
       </w:hyperlink>
     </w:p>
@@ -6195,14 +6452,14 @@
         </w:rPr>
         <w:t>Trust line for anonymous reports</w:t>
       </w:r>
-      <w:hyperlink r:id="rId40">
+      <w:hyperlink r:id="rId44">
         <w:r>
           <w:rPr>
             <w:color w:val="2A78D6"/>
             <w:vertAlign w:val="superscript"/>
             <w:sz w:val="16"/>
           </w:rPr>
-          <w:t xml:space="preserve">36</w:t>
+          <w:t xml:space="preserve">40</w:t>
         </w:r>
       </w:hyperlink>
     </w:p>
@@ -6225,14 +6482,14 @@
         </w:rPr>
         <w:t>Anti-corruption policy and ISO 37001 certification</w:t>
       </w:r>
-      <w:hyperlink r:id="rId38">
+      <w:hyperlink r:id="rId37">
         <w:r>
           <w:rPr>
             <w:color w:val="2A78D6"/>
             <w:vertAlign w:val="superscript"/>
             <w:sz w:val="16"/>
           </w:rPr>
-          <w:t xml:space="preserve">34</w:t>
+          <w:t xml:space="preserve">33</w:t>
         </w:r>
       </w:hyperlink>
       <w:r>
@@ -6242,14 +6499,14 @@
         </w:rPr>
         <w:t>,</w:t>
       </w:r>
-      <w:hyperlink r:id="rId40">
+      <w:hyperlink r:id="rId44">
         <w:r>
           <w:rPr>
             <w:color w:val="2A78D6"/>
             <w:vertAlign w:val="superscript"/>
             <w:sz w:val="16"/>
           </w:rPr>
-          <w:t xml:space="preserve">36</w:t>
+          <w:t xml:space="preserve">40</w:t>
         </w:r>
       </w:hyperlink>
     </w:p>
@@ -6272,14 +6529,14 @@
         </w:rPr>
         <w:t>UN Global Compact</w:t>
       </w:r>
-      <w:hyperlink r:id="rId37">
+      <w:hyperlink r:id="rId42">
         <w:r>
           <w:rPr>
             <w:color w:val="2A78D6"/>
             <w:vertAlign w:val="superscript"/>
             <w:sz w:val="16"/>
           </w:rPr>
-          <w:t xml:space="preserve">37</w:t>
+          <w:t xml:space="preserve">41</w:t>
         </w:r>
       </w:hyperlink>
     </w:p>
@@ -6302,14 +6559,14 @@
         </w:rPr>
         <w:t>Integrated annual report with climate data</w:t>
       </w:r>
-      <w:hyperlink r:id="rId24">
+      <w:hyperlink r:id="rId26">
         <w:r>
           <w:rPr>
             <w:color w:val="2A78D6"/>
             <w:vertAlign w:val="superscript"/>
             <w:sz w:val="16"/>
           </w:rPr>
-          <w:t xml:space="preserve">15</w:t>
+          <w:t xml:space="preserve">17</w:t>
         </w:r>
       </w:hyperlink>
     </w:p>
@@ -6332,14 +6589,14 @@
         </w:rPr>
         <w:t>Biodiversity monitoring and mitigation measures</w:t>
       </w:r>
-      <w:hyperlink r:id="rId41">
+      <w:hyperlink r:id="rId45">
         <w:r>
           <w:rPr>
             <w:color w:val="2A78D6"/>
             <w:vertAlign w:val="superscript"/>
             <w:sz w:val="16"/>
           </w:rPr>
-          <w:t xml:space="preserve">38</w:t>
+          <w:t xml:space="preserve">42</w:t>
         </w:r>
       </w:hyperlink>
       <w:r>
@@ -6362,38 +6619,8 @@
           <w:color w:val="333333"/>
           <w:sz w:val="19"/>
         </w:rPr>
-        <w:t>Not found / to check</w:t>
+        <w:t>Could be improved</w:t>
       </w:r>
-    </w:p>
-    <w:p>
-      <w:pPr>
-        <w:spacing w:after="0"/>
-        <w:ind w:left="737" w:hanging="198"/>
-      </w:pPr>
-      <w:r>
-        <w:rPr>
-          <w:sz w:val="19"/>
-        </w:rPr>
-        <w:t xml:space="preserve">•  </w:t>
-      </w:r>
-      <w:r>
-        <w:rPr>
-          <w:b w:val="0"/>
-          <w:color w:val="333333"/>
-          <w:sz w:val="19"/>
-        </w:rPr>
-        <w:t>A named human rights due diligence process and quantified biodiversity targets</w:t>
-      </w:r>
-      <w:hyperlink r:id="rId34">
-        <w:r>
-          <w:rPr>
-            <w:color w:val="2A78D6"/>
-            <w:vertAlign w:val="superscript"/>
-            <w:sz w:val="16"/>
-          </w:rPr>
-          <w:t xml:space="preserve">39</w:t>
-        </w:r>
-      </w:hyperlink>
     </w:p>
     <w:p>
       <w:pPr>
@@ -6412,16 +6639,16 @@
           <w:color w:val="333333"/>
           <w:sz w:val="19"/>
         </w:rPr>
-        <w:t>Country-by-country tax report (listed at</w:t>
+        <w:t>No named human rights due diligence process or quantified biodiversity targets are published</w:t>
       </w:r>
-      <w:hyperlink r:id="rId42">
+      <w:hyperlink r:id="rId39">
         <w:r>
           <w:rPr>
             <w:color w:val="2A78D6"/>
             <w:vertAlign w:val="superscript"/>
             <w:sz w:val="16"/>
           </w:rPr>
-          <w:t xml:space="preserve">40</w:t>
+          <w:t xml:space="preserve">43</w:t>
         </w:r>
       </w:hyperlink>
       <w:r>
@@ -6430,7 +6657,7 @@
           <w:color w:val="333333"/>
           <w:sz w:val="19"/>
         </w:rPr>
-        <w:t>, not read).</w:t>
+        <w:t>.</w:t>
       </w:r>
     </w:p>
     <w:p>
@@ -6472,26 +6699,6 @@
     </w:p>
     <w:p>
       <w:pPr>
-        <w:spacing w:after="0"/>
-        <w:ind w:left="510" w:hanging="198"/>
-      </w:pPr>
-      <w:r>
-        <w:rPr>
-          <w:sz w:val="19"/>
-        </w:rPr>
-        <w:t xml:space="preserve">•  </w:t>
-      </w:r>
-      <w:r>
-        <w:rPr>
-          <w:b w:val="0"/>
-          <w:color w:val="333333"/>
-          <w:sz w:val="19"/>
-        </w:rPr>
-        <w:t>No need identified.</w:t>
-      </w:r>
-    </w:p>
-    <w:p>
-      <w:pPr>
         <w:spacing w:after="120"/>
         <w:ind w:left="510" w:hanging="198"/>
       </w:pPr>
@@ -6507,7 +6714,7 @@
           <w:color w:val="333333"/>
           <w:sz w:val="19"/>
         </w:rPr>
-        <w:t>Possible topics: share of gas generation and Scope 1 growth, contractor safety.</w:t>
+        <w:t>No need: the company meets SEB policy expectations and has no red flags.</w:t>
       </w:r>
     </w:p>
     <w:p>
@@ -6541,24 +6748,10 @@
         <w:rPr>
           <w:sz w:val="24"/>
         </w:rPr>
-        <w:t xml:space="preserve">☐ </w:t>
+        <w:t xml:space="preserve">☑ </w:t>
       </w:r>
       <w:r>
         <w:t>Yes, the indicators of the company support the targets of sustainability and PAI indicators followed by the Fund</w:t>
-      </w:r>
-    </w:p>
-    <w:p>
-      <w:pPr>
-        <w:spacing w:after="0"/>
-        <w:ind w:left="397"/>
-      </w:pPr>
-      <w:r>
-        <w:rPr>
-          <w:b/>
-          <w:color w:val="B42318"/>
-          <w:sz w:val="19"/>
-        </w:rPr>
-        <w:t>Needs review</w:t>
       </w:r>
     </w:p>
     <w:p>
@@ -6578,16 +6771,16 @@
           <w:color w:val="333333"/>
           <w:sz w:val="19"/>
         </w:rPr>
-        <w:t>Available PAI data: total GHG emissions 4.49m t CO2e (+10.1%)</w:t>
+        <w:t>Total GHG emissions 4.49m t CO2e in 2025 (+10.1%)</w:t>
       </w:r>
-      <w:hyperlink r:id="rId24">
+      <w:hyperlink r:id="rId26">
         <w:r>
           <w:rPr>
             <w:color w:val="2A78D6"/>
             <w:vertAlign w:val="superscript"/>
             <w:sz w:val="16"/>
           </w:rPr>
-          <w:t xml:space="preserve">15</w:t>
+          <w:t xml:space="preserve">17</w:t>
         </w:r>
       </w:hyperlink>
     </w:p>
@@ -6610,14 +6803,14 @@
         </w:rPr>
         <w:t>Carbon intensity (Scope 1+2) 214 g CO2e/kWh in Q1 2026 (−12.8%)</w:t>
       </w:r>
-      <w:hyperlink r:id="rId29">
+      <w:hyperlink r:id="rId33">
         <w:r>
           <w:rPr>
             <w:color w:val="2A78D6"/>
             <w:vertAlign w:val="superscript"/>
             <w:sz w:val="16"/>
           </w:rPr>
-          <w:t xml:space="preserve">20</w:t>
+          <w:t xml:space="preserve">24</w:t>
         </w:r>
       </w:hyperlink>
     </w:p>
@@ -6640,24 +6833,16 @@
         </w:rPr>
         <w:t>Taxonomy-aligned capex 84.7%</w:t>
       </w:r>
-      <w:hyperlink r:id="rId24">
+      <w:hyperlink r:id="rId26">
         <w:r>
           <w:rPr>
             <w:color w:val="2A78D6"/>
             <w:vertAlign w:val="superscript"/>
             <w:sz w:val="16"/>
           </w:rPr>
-          <w:t xml:space="preserve">15</w:t>
+          <w:t xml:space="preserve">17</w:t>
         </w:r>
       </w:hyperlink>
-      <w:r>
-        <w:rPr>
-          <w:b w:val="0"/>
-          <w:color w:val="333333"/>
-          <w:sz w:val="19"/>
-        </w:rPr>
-        <w:t>.</w:t>
-      </w:r>
     </w:p>
     <w:p>
       <w:pPr>
@@ -6676,7 +6861,25 @@
           <w:color w:val="333333"/>
           <w:sz w:val="19"/>
         </w:rPr>
-        <w:t>Comparison with the Fund's targets - analyst.</w:t>
+        <w:t>SBTi-validated 1.5°C targets</w:t>
+      </w:r>
+      <w:hyperlink r:id="rId46">
+        <w:r>
+          <w:rPr>
+            <w:color w:val="2A78D6"/>
+            <w:vertAlign w:val="superscript"/>
+            <w:sz w:val="16"/>
+          </w:rPr>
+          <w:t xml:space="preserve">44</w:t>
+        </w:r>
+      </w:hyperlink>
+      <w:r>
+        <w:rPr>
+          <w:b w:val="0"/>
+          <w:color w:val="333333"/>
+          <w:sz w:val="19"/>
+        </w:rPr>
+        <w:t>.</w:t>
       </w:r>
     </w:p>
     <w:p>
@@ -6704,7 +6907,7 @@
         <w:rPr>
           <w:b w:val="0"/>
         </w:rPr>
-        <w:t>Exclusionary screening without findings (sanctions and media to be confirmed by the analyst). Positives: high Taxonomy-aligned capex, SBTi targets. Watch the share of gas generation and safety.</w:t>
+        <w:t>No exclusions or red flags. Strong green profile: 84.7% Taxonomy-aligned capex and SBTi-validated targets. Worth watching: higher gas generation in 2025 and contractor safety.</w:t>
       </w:r>
     </w:p>
     <w:p>
@@ -6792,7 +6995,7 @@
             <w:color w:val="2A78D6"/>
             <w:sz w:val="17"/>
           </w:rPr>
-          <w:t xml:space="preserve">Ignitis Group - First six months 2026 interim report, p. 24, 2026-08-12</w:t>
+          <w:t xml:space="preserve">Ignitis Group - First six months 2026 interim report, p. 10, 2026-08-12</w:t>
         </w:r>
       </w:hyperlink>
     </w:p>
@@ -6834,7 +7037,7 @@
             <w:color w:val="2A78D6"/>
             <w:sz w:val="17"/>
           </w:rPr>
-          <w:t xml:space="preserve">Ignitis Group - First six months 2026 interim report, p. 10, 2026-08-12</w:t>
+          <w:t xml:space="preserve">Bonds page (incl. tender offer for XS1646530565), 2026-10-22</w:t>
         </w:r>
       </w:hyperlink>
     </w:p>
@@ -6855,7 +7058,7 @@
             <w:color w:val="2A78D6"/>
             <w:sz w:val="17"/>
           </w:rPr>
-          <w:t xml:space="preserve">Strategic Plan 2026-2029, 2026-05</w:t>
+          <w:t xml:space="preserve">Ignitis Group - First six months 2026 interim report, p. 24, 2026-08-12</w:t>
         </w:r>
       </w:hyperlink>
     </w:p>
@@ -6876,7 +7079,7 @@
             <w:color w:val="2A78D6"/>
             <w:sz w:val="17"/>
           </w:rPr>
-          <w:t xml:space="preserve">Bonds page (incl. tender offer for XS1646530565), 2026-10-22</w:t>
+          <w:t xml:space="preserve">Strategic Plan 2026-2029, 2026-05</w:t>
         </w:r>
       </w:hyperlink>
     </w:p>
@@ -7023,7 +7226,7 @@
             <w:color w:val="2A78D6"/>
             <w:sz w:val="17"/>
           </w:rPr>
-          <w:t xml:space="preserve">Ignitis Group - First six months 2026 interim report, p. 33, 2026-08-12</w:t>
+          <w:t xml:space="preserve">Ignitis Group - First six months 2026 interim report, p. 36, 2026-08-12</w:t>
         </w:r>
       </w:hyperlink>
     </w:p>
@@ -7044,7 +7247,7 @@
             <w:color w:val="2A78D6"/>
             <w:sz w:val="17"/>
           </w:rPr>
-          <w:t xml:space="preserve">Integrated Annual Report 2025, 2026-02-25</w:t>
+          <w:t xml:space="preserve">Ignitis Group - First six months 2026 interim report, p. 32, 2026-08-12</w:t>
         </w:r>
       </w:hyperlink>
     </w:p>
@@ -7059,7 +7262,91 @@
         </w:rPr>
         <w:t xml:space="preserve">16. </w:t>
       </w:r>
+      <w:hyperlink r:id="rId25">
+        <w:r>
+          <w:rPr>
+            <w:color w:val="2A78D6"/>
+            <w:sz w:val="17"/>
+          </w:rPr>
+          <w:t xml:space="preserve">Ignitis Group - First six months 2026 interim report, p. 33, 2026-08-12</w:t>
+        </w:r>
+      </w:hyperlink>
+    </w:p>
+    <w:p>
+      <w:pPr>
+        <w:spacing w:after="20"/>
+        <w:ind w:left="340" w:hanging="340"/>
+      </w:pPr>
+      <w:r>
+        <w:rPr>
+          <w:sz w:val="17"/>
+        </w:rPr>
+        <w:t xml:space="preserve">17. </w:t>
+      </w:r>
       <w:hyperlink r:id="rId26">
+        <w:r>
+          <w:rPr>
+            <w:color w:val="2A78D6"/>
+            <w:sz w:val="17"/>
+          </w:rPr>
+          <w:t xml:space="preserve">Integrated Annual Report 2025, 2026-02-25</w:t>
+        </w:r>
+      </w:hyperlink>
+    </w:p>
+    <w:p>
+      <w:pPr>
+        <w:spacing w:after="20"/>
+        <w:ind w:left="340" w:hanging="340"/>
+      </w:pPr>
+      <w:r>
+        <w:rPr>
+          <w:sz w:val="17"/>
+        </w:rPr>
+        <w:t xml:space="preserve">18. </w:t>
+      </w:r>
+      <w:hyperlink r:id="rId27">
+        <w:r>
+          <w:rPr>
+            <w:color w:val="2A78D6"/>
+            <w:sz w:val="17"/>
+          </w:rPr>
+          <w:t xml:space="preserve">Integrated Annual Report 2025, p. 11, 2026-02-25</w:t>
+        </w:r>
+      </w:hyperlink>
+    </w:p>
+    <w:p>
+      <w:pPr>
+        <w:spacing w:after="20"/>
+        <w:ind w:left="340" w:hanging="340"/>
+      </w:pPr>
+      <w:r>
+        <w:rPr>
+          <w:sz w:val="17"/>
+        </w:rPr>
+        <w:t xml:space="preserve">19. </w:t>
+      </w:r>
+      <w:hyperlink r:id="rId28">
+        <w:r>
+          <w:rPr>
+            <w:color w:val="2A78D6"/>
+            <w:sz w:val="17"/>
+          </w:rPr>
+          <w:t xml:space="preserve">Ignitis Group - First six months 2026 interim report, p. 37, 2026-08-12</w:t>
+        </w:r>
+      </w:hyperlink>
+    </w:p>
+    <w:p>
+      <w:pPr>
+        <w:spacing w:after="20"/>
+        <w:ind w:left="340" w:hanging="340"/>
+      </w:pPr>
+      <w:r>
+        <w:rPr>
+          <w:sz w:val="17"/>
+        </w:rPr>
+        <w:t xml:space="preserve">20. </w:t>
+      </w:r>
+      <w:hyperlink r:id="rId30">
         <w:r>
           <w:rPr>
             <w:color w:val="2A78D6"/>
@@ -7078,7 +7365,7 @@
         <w:rPr>
           <w:sz w:val="17"/>
         </w:rPr>
-        <w:t xml:space="preserve">17. </w:t>
+        <w:t xml:space="preserve">21. </w:t>
       </w:r>
       <w:hyperlink r:id="rId18">
         <w:r>
@@ -7099,9 +7386,9 @@
         <w:rPr>
           <w:sz w:val="17"/>
         </w:rPr>
-        <w:t xml:space="preserve">18. </w:t>
+        <w:t xml:space="preserve">22. </w:t>
       </w:r>
-      <w:hyperlink r:id="rId27">
+      <w:hyperlink r:id="rId31">
         <w:r>
           <w:rPr>
             <w:color w:val="2A78D6"/>
@@ -7120,9 +7407,9 @@
         <w:rPr>
           <w:sz w:val="17"/>
         </w:rPr>
-        <w:t xml:space="preserve">19. </w:t>
+        <w:t xml:space="preserve">23. </w:t>
       </w:r>
-      <w:hyperlink r:id="rId28">
+      <w:hyperlink r:id="rId32">
         <w:r>
           <w:rPr>
             <w:color w:val="2A78D6"/>
@@ -7141,9 +7428,9 @@
         <w:rPr>
           <w:sz w:val="17"/>
         </w:rPr>
-        <w:t xml:space="preserve">20. </w:t>
+        <w:t xml:space="preserve">24. </w:t>
       </w:r>
-      <w:hyperlink r:id="rId29">
+      <w:hyperlink r:id="rId33">
         <w:r>
           <w:rPr>
             <w:color w:val="2A78D6"/>
@@ -7162,7 +7449,7 @@
         <w:rPr>
           <w:sz w:val="17"/>
         </w:rPr>
-        <w:t xml:space="preserve">21. </w:t>
+        <w:t xml:space="preserve">25. </w:t>
       </w:r>
       <w:hyperlink r:id="rId18">
         <w:r>
@@ -7170,7 +7457,7 @@
             <w:color w:val="2A78D6"/>
             <w:sz w:val="17"/>
           </w:rPr>
-          <w:t xml:space="preserve">Ignitis Group - First six months 2026 interim report, p. 11, 23 (verify revenue and net profit in the PDF), 2026-08-12</w:t>
+          <w:t xml:space="preserve">Ignitis Group - First six months 2026 interim report, p. 11, 23, 32, 2026-08-12</w:t>
         </w:r>
       </w:hyperlink>
     </w:p>
@@ -7183,7 +7470,7 @@
         <w:rPr>
           <w:sz w:val="17"/>
         </w:rPr>
-        <w:t xml:space="preserve">22. </w:t>
+        <w:t xml:space="preserve">26. </w:t>
       </w:r>
       <w:hyperlink r:id="rId22">
         <w:r>
@@ -7204,9 +7491,9 @@
         <w:rPr>
           <w:sz w:val="17"/>
         </w:rPr>
-        <w:t xml:space="preserve">23. </w:t>
+        <w:t xml:space="preserve">27. </w:t>
       </w:r>
-      <w:hyperlink r:id="rId26">
+      <w:hyperlink r:id="rId30">
         <w:r>
           <w:rPr>
             <w:color w:val="2A78D6"/>
@@ -7225,9 +7512,9 @@
         <w:rPr>
           <w:sz w:val="17"/>
         </w:rPr>
-        <w:t xml:space="preserve">24. </w:t>
+        <w:t xml:space="preserve">28. </w:t>
       </w:r>
-      <w:hyperlink r:id="rId30">
+      <w:hyperlink r:id="rId34">
         <w:r>
           <w:rPr>
             <w:color w:val="2A78D6"/>
@@ -7246,9 +7533,9 @@
         <w:rPr>
           <w:sz w:val="17"/>
         </w:rPr>
-        <w:t xml:space="preserve">25. </w:t>
+        <w:t xml:space="preserve">29. </w:t>
       </w:r>
-      <w:hyperlink r:id="rId14">
+      <w:hyperlink r:id="rId12">
         <w:r>
           <w:rPr>
             <w:color w:val="2A78D6"/>
@@ -7267,9 +7554,9 @@
         <w:rPr>
           <w:sz w:val="17"/>
         </w:rPr>
-        <w:t xml:space="preserve">26. </w:t>
+        <w:t xml:space="preserve">30. </w:t>
       </w:r>
-      <w:hyperlink r:id="rId31">
+      <w:hyperlink r:id="rId35">
         <w:r>
           <w:rPr>
             <w:color w:val="2A78D6"/>
@@ -7288,99 +7575,15 @@
         <w:rPr>
           <w:sz w:val="17"/>
         </w:rPr>
-        <w:t xml:space="preserve">27. </w:t>
+        <w:t xml:space="preserve">31. </w:t>
       </w:r>
-      <w:hyperlink r:id="rId26">
+      <w:hyperlink r:id="rId30">
         <w:r>
           <w:rPr>
             <w:color w:val="2A78D6"/>
             <w:sz w:val="17"/>
           </w:rPr>
           <w:t xml:space="preserve">Ignitis Group - First six months 2026 interim report, p. 5, 10, 2026-08-12</w:t>
-        </w:r>
-      </w:hyperlink>
-    </w:p>
-    <w:p>
-      <w:pPr>
-        <w:spacing w:after="20"/>
-        <w:ind w:left="340" w:hanging="340"/>
-      </w:pPr>
-      <w:r>
-        <w:rPr>
-          <w:sz w:val="17"/>
-        </w:rPr>
-        <w:t xml:space="preserve">28. </w:t>
-      </w:r>
-      <w:hyperlink r:id="rId32">
-        <w:r>
-          <w:rPr>
-            <w:color w:val="2A78D6"/>
-            <w:sz w:val="17"/>
-          </w:rPr>
-          <w:t xml:space="preserve">Integrated Annual Report 2025, p. 10, 2026-02-25</w:t>
-        </w:r>
-      </w:hyperlink>
-    </w:p>
-    <w:p>
-      <w:pPr>
-        <w:spacing w:after="20"/>
-        <w:ind w:left="340" w:hanging="340"/>
-      </w:pPr>
-      <w:r>
-        <w:rPr>
-          <w:sz w:val="17"/>
-        </w:rPr>
-        <w:t xml:space="preserve">29. </w:t>
-      </w:r>
-      <w:hyperlink r:id="rId33">
-        <w:r>
-          <w:rPr>
-            <w:color w:val="2A78D6"/>
-            <w:sz w:val="17"/>
-          </w:rPr>
-          <w:t xml:space="preserve">SEB Policy on Sustainability Considerations in Investments (2026-04-15), p. 5, 2026-04-15</w:t>
-        </w:r>
-      </w:hyperlink>
-    </w:p>
-    <w:p>
-      <w:pPr>
-        <w:spacing w:after="20"/>
-        <w:ind w:left="340" w:hanging="340"/>
-      </w:pPr>
-      <w:r>
-        <w:rPr>
-          <w:sz w:val="17"/>
-        </w:rPr>
-        <w:t xml:space="preserve">30. </w:t>
-      </w:r>
-      <w:hyperlink r:id="rId34">
-        <w:r>
-          <w:rPr>
-            <w:color w:val="2A78D6"/>
-            <w:sz w:val="17"/>
-          </w:rPr>
-          <w:t xml:space="preserve">SEB Sector Policy on Electricity &amp; Renewable Energy (2026-04-23), p. 6, 2026-04-23</w:t>
-        </w:r>
-      </w:hyperlink>
-    </w:p>
-    <w:p>
-      <w:pPr>
-        <w:spacing w:after="20"/>
-        <w:ind w:left="340" w:hanging="340"/>
-      </w:pPr>
-      <w:r>
-        <w:rPr>
-          <w:sz w:val="17"/>
-        </w:rPr>
-        <w:t xml:space="preserve">31. </w:t>
-      </w:r>
-      <w:hyperlink r:id="rId35">
-        <w:r>
-          <w:rPr>
-            <w:color w:val="2A78D6"/>
-            <w:sz w:val="17"/>
-          </w:rPr>
-          <w:t xml:space="preserve">Integrated Annual Report 2025, p. 24, 39, 2026-02-25</w:t>
         </w:r>
       </w:hyperlink>
     </w:p>
@@ -7401,7 +7604,7 @@
             <w:color w:val="2A78D6"/>
             <w:sz w:val="17"/>
           </w:rPr>
-          <w:t xml:space="preserve">SEB Sector Policy on Fossil Fuels (2026-04-23), p. 4, 6, 2026-04-23</w:t>
+          <w:t xml:space="preserve">Integrated Annual Report 2025, p. 10, 2026-02-25</w:t>
         </w:r>
       </w:hyperlink>
     </w:p>
@@ -7422,7 +7625,7 @@
             <w:color w:val="2A78D6"/>
             <w:sz w:val="17"/>
           </w:rPr>
-          <w:t xml:space="preserve">Integrated Annual Report 2025, p. 8-9, 15, 2026-02-25</w:t>
+          <w:t xml:space="preserve">Ignitis grupė - Politikos ir sertifikatai (website, LT), 2026-10-22</w:t>
         </w:r>
       </w:hyperlink>
     </w:p>
@@ -7443,7 +7646,7 @@
             <w:color w:val="2A78D6"/>
             <w:sz w:val="17"/>
           </w:rPr>
-          <w:t xml:space="preserve">Ignitis grupė - Politikos ir sertifikatai (website, LT), 2026-10-22</w:t>
+          <w:t xml:space="preserve">SEB Policy on Sustainability Considerations in Investments (2026-04-15), p. 5, 2026-04-15</w:t>
         </w:r>
       </w:hyperlink>
     </w:p>
@@ -7464,7 +7667,7 @@
             <w:color w:val="2A78D6"/>
             <w:sz w:val="17"/>
           </w:rPr>
-          <w:t xml:space="preserve">Integrated Annual Report 2025, p. 16, 2026-02-25</w:t>
+          <w:t xml:space="preserve">SEB Sector Policy on Electricity &amp; Renewable Energy (2026-04-23), p. 6, 2026-04-23</w:t>
         </w:r>
       </w:hyperlink>
     </w:p>
@@ -7485,7 +7688,7 @@
             <w:color w:val="2A78D6"/>
             <w:sz w:val="17"/>
           </w:rPr>
-          <w:t xml:space="preserve">Ignitis grupė - Verslo etika (website, LT), 2026-10-22</w:t>
+          <w:t xml:space="preserve">Integrated Annual Report 2025, p. 24, 39, 2026-02-25</w:t>
         </w:r>
       </w:hyperlink>
     </w:p>
@@ -7500,7 +7703,91 @@
         </w:rPr>
         <w:t xml:space="preserve">37. </w:t>
       </w:r>
-      <w:hyperlink r:id="rId37">
+      <w:hyperlink r:id="rId41">
+        <w:r>
+          <w:rPr>
+            <w:color w:val="2A78D6"/>
+            <w:sz w:val="17"/>
+          </w:rPr>
+          <w:t xml:space="preserve">SEB Sector Policy on Fossil Fuels (2026-04-23), p. 4, 6, 2026-04-23</w:t>
+        </w:r>
+      </w:hyperlink>
+    </w:p>
+    <w:p>
+      <w:pPr>
+        <w:spacing w:after="20"/>
+        <w:ind w:left="340" w:hanging="340"/>
+      </w:pPr>
+      <w:r>
+        <w:rPr>
+          <w:sz w:val="17"/>
+        </w:rPr>
+        <w:t xml:space="preserve">38. </w:t>
+      </w:r>
+      <w:hyperlink r:id="rId42">
+        <w:r>
+          <w:rPr>
+            <w:color w:val="2A78D6"/>
+            <w:sz w:val="17"/>
+          </w:rPr>
+          <w:t xml:space="preserve">Integrated Annual Report 2025, p. 8-9, 15, 2026-02-25</w:t>
+        </w:r>
+      </w:hyperlink>
+    </w:p>
+    <w:p>
+      <w:pPr>
+        <w:spacing w:after="20"/>
+        <w:ind w:left="340" w:hanging="340"/>
+      </w:pPr>
+      <w:r>
+        <w:rPr>
+          <w:sz w:val="17"/>
+        </w:rPr>
+        <w:t xml:space="preserve">39. </w:t>
+      </w:r>
+      <w:hyperlink r:id="rId43">
+        <w:r>
+          <w:rPr>
+            <w:color w:val="2A78D6"/>
+            <w:sz w:val="17"/>
+          </w:rPr>
+          <w:t xml:space="preserve">Integrated Annual Report 2025, p. 16, 2026-02-25</w:t>
+        </w:r>
+      </w:hyperlink>
+    </w:p>
+    <w:p>
+      <w:pPr>
+        <w:spacing w:after="20"/>
+        <w:ind w:left="340" w:hanging="340"/>
+      </w:pPr>
+      <w:r>
+        <w:rPr>
+          <w:sz w:val="17"/>
+        </w:rPr>
+        <w:t xml:space="preserve">40. </w:t>
+      </w:r>
+      <w:hyperlink r:id="rId44">
+        <w:r>
+          <w:rPr>
+            <w:color w:val="2A78D6"/>
+            <w:sz w:val="17"/>
+          </w:rPr>
+          <w:t xml:space="preserve">Ignitis grupė - Verslo etika (website, LT), 2026-10-22</w:t>
+        </w:r>
+      </w:hyperlink>
+    </w:p>
+    <w:p>
+      <w:pPr>
+        <w:spacing w:after="20"/>
+        <w:ind w:left="340" w:hanging="340"/>
+      </w:pPr>
+      <w:r>
+        <w:rPr>
+          <w:sz w:val="17"/>
+        </w:rPr>
+        <w:t xml:space="preserve">41. </w:t>
+      </w:r>
+      <w:hyperlink r:id="rId42">
         <w:r>
           <w:rPr>
             <w:color w:val="2A78D6"/>
@@ -7519,9 +7806,9 @@
         <w:rPr>
           <w:sz w:val="17"/>
         </w:rPr>
-        <w:t xml:space="preserve">38. </w:t>
+        <w:t xml:space="preserve">42. </w:t>
       </w:r>
-      <w:hyperlink r:id="rId41">
+      <w:hyperlink r:id="rId45">
         <w:r>
           <w:rPr>
             <w:color w:val="2A78D6"/>
@@ -7540,9 +7827,9 @@
         <w:rPr>
           <w:sz w:val="17"/>
         </w:rPr>
-        <w:t xml:space="preserve">39. </w:t>
+        <w:t xml:space="preserve">43. </w:t>
       </w:r>
-      <w:hyperlink r:id="rId34">
+      <w:hyperlink r:id="rId39">
         <w:r>
           <w:rPr>
             <w:color w:val="2A78D6"/>
@@ -7561,15 +7848,15 @@
         <w:rPr>
           <w:sz w:val="17"/>
         </w:rPr>
-        <w:t xml:space="preserve">40. </w:t>
+        <w:t xml:space="preserve">44. </w:t>
       </w:r>
-      <w:hyperlink r:id="rId42">
+      <w:hyperlink r:id="rId46">
         <w:r>
           <w:rPr>
             <w:color w:val="2A78D6"/>
             <w:sz w:val="17"/>
           </w:rPr>
-          <w:t xml:space="preserve">Integrated Annual Report 2025, p. 429, 2026-02-25</w:t>
+          <w:t xml:space="preserve">Integrated Annual Report 2025, p. 9, 2026-02-25</w:t>
         </w:r>
       </w:hyperlink>
     </w:p>

</xml_diff>

<commit_message>
ISIN sąrašo sinchronizavimas 2026-10-22
</commit_message>
<xml_diff>
--- a/docs/files/ignitis/ignitis_6M2026_en.docx
+++ b/docs/files/ignitis/ignitis_6M2026_en.docx
@@ -748,385 +748,6 @@
                 <w:sz w:val="17"/>
               </w:rPr>
               <w:t>Note</w:t>
-            </w:r>
-          </w:p>
-        </w:tc>
-      </w:tr>
-      <w:tr>
-        <w:tc>
-          <w:tcPr>
-            <w:tcW w:type="dxa" w:w="1701"/>
-          </w:tcPr>
-          <w:p>
-            <w:pPr>
-              <w:spacing w:after="0"/>
-            </w:pPr>
-            <w:r/>
-            <w:r>
-              <w:rPr>
-                <w:b w:val="0"/>
-                <w:sz w:val="17"/>
-              </w:rPr>
-              <w:t>LT0000115768</w:t>
-            </w:r>
-          </w:p>
-        </w:tc>
-        <w:tc>
-          <w:tcPr>
-            <w:tcW w:type="dxa" w:w="2608"/>
-          </w:tcPr>
-          <w:p>
-            <w:pPr>
-              <w:spacing w:after="0"/>
-            </w:pPr>
-            <w:r/>
-            <w:r>
-              <w:rPr>
-                <w:b w:val="0"/>
-                <w:sz w:val="17"/>
-              </w:rPr>
-              <w:t>Ignitis grupė ordinary share (IGN1L)</w:t>
-            </w:r>
-          </w:p>
-        </w:tc>
-        <w:tc>
-          <w:tcPr>
-            <w:tcW w:type="dxa" w:w="964"/>
-          </w:tcPr>
-          <w:p>
-            <w:pPr>
-              <w:spacing w:after="0"/>
-              <w:jc w:val="right"/>
-            </w:pPr>
-            <w:r/>
-            <w:r>
-              <w:rPr>
-                <w:b w:val="0"/>
-                <w:sz w:val="17"/>
-              </w:rPr>
-              <w:t>–</w:t>
-            </w:r>
-          </w:p>
-        </w:tc>
-        <w:tc>
-          <w:tcPr>
-            <w:tcW w:type="dxa" w:w="1304"/>
-          </w:tcPr>
-          <w:p>
-            <w:pPr>
-              <w:spacing w:after="0"/>
-            </w:pPr>
-            <w:r/>
-            <w:r>
-              <w:rPr>
-                <w:b w:val="0"/>
-                <w:sz w:val="17"/>
-              </w:rPr>
-              <w:t>share</w:t>
-            </w:r>
-          </w:p>
-        </w:tc>
-        <w:tc>
-          <w:tcPr>
-            <w:tcW w:type="dxa" w:w="3061"/>
-          </w:tcPr>
-          <w:p>
-            <w:pPr>
-              <w:spacing w:after="0"/>
-            </w:pPr>
-            <w:r/>
-            <w:r>
-              <w:rPr>
-                <w:b w:val="0"/>
-                <w:sz w:val="17"/>
-              </w:rPr>
-            </w:r>
-          </w:p>
-        </w:tc>
-      </w:tr>
-      <w:tr>
-        <w:tc>
-          <w:tcPr>
-            <w:tcW w:type="dxa" w:w="1701"/>
-            <w:shd w:val="clear" w:color="auto" w:fill="F6F8FA"/>
-          </w:tcPr>
-          <w:p>
-            <w:pPr>
-              <w:spacing w:after="0"/>
-            </w:pPr>
-            <w:r/>
-            <w:r>
-              <w:rPr>
-                <w:b w:val="0"/>
-                <w:sz w:val="17"/>
-              </w:rPr>
-              <w:t>XS1646530565</w:t>
-            </w:r>
-          </w:p>
-        </w:tc>
-        <w:tc>
-          <w:tcPr>
-            <w:tcW w:type="dxa" w:w="2608"/>
-            <w:shd w:val="clear" w:color="auto" w:fill="F6F8FA"/>
-          </w:tcPr>
-          <w:p>
-            <w:pPr>
-              <w:spacing w:after="0"/>
-            </w:pPr>
-            <w:r/>
-            <w:r>
-              <w:rPr>
-                <w:b w:val="0"/>
-                <w:sz w:val="17"/>
-              </w:rPr>
-              <w:t>Ignitis 2.000% green notes 2027</w:t>
-            </w:r>
-          </w:p>
-        </w:tc>
-        <w:tc>
-          <w:tcPr>
-            <w:tcW w:type="dxa" w:w="964"/>
-            <w:shd w:val="clear" w:color="auto" w:fill="F6F8FA"/>
-          </w:tcPr>
-          <w:p>
-            <w:pPr>
-              <w:spacing w:after="0"/>
-              <w:jc w:val="right"/>
-            </w:pPr>
-            <w:r/>
-            <w:r>
-              <w:rPr>
-                <w:b w:val="0"/>
-                <w:sz w:val="17"/>
-              </w:rPr>
-              <w:t>2.000%</w:t>
-            </w:r>
-          </w:p>
-        </w:tc>
-        <w:tc>
-          <w:tcPr>
-            <w:tcW w:type="dxa" w:w="1304"/>
-            <w:shd w:val="clear" w:color="auto" w:fill="F6F8FA"/>
-          </w:tcPr>
-          <w:p>
-            <w:pPr>
-              <w:spacing w:after="0"/>
-            </w:pPr>
-            <w:r/>
-            <w:r>
-              <w:rPr>
-                <w:b w:val="0"/>
-                <w:sz w:val="17"/>
-              </w:rPr>
-              <w:t>2027-07-14</w:t>
-            </w:r>
-          </w:p>
-        </w:tc>
-        <w:tc>
-          <w:tcPr>
-            <w:tcW w:type="dxa" w:w="3061"/>
-            <w:shd w:val="clear" w:color="auto" w:fill="F6F8FA"/>
-          </w:tcPr>
-          <w:p>
-            <w:pPr>
-              <w:spacing w:after="0"/>
-            </w:pPr>
-            <w:r/>
-            <w:r>
-              <w:rPr>
-                <w:b w:val="0"/>
-                <w:sz w:val="17"/>
-              </w:rPr>
-              <w:t>Tender offer for any and all notes announced 2026-10-19 (refinanced by new EuGB 4.500% 2031)</w:t>
-            </w:r>
-          </w:p>
-        </w:tc>
-      </w:tr>
-      <w:tr>
-        <w:tc>
-          <w:tcPr>
-            <w:tcW w:type="dxa" w:w="1701"/>
-          </w:tcPr>
-          <w:p>
-            <w:pPr>
-              <w:spacing w:after="0"/>
-            </w:pPr>
-            <w:r/>
-            <w:r>
-              <w:rPr>
-                <w:b w:val="0"/>
-                <w:sz w:val="17"/>
-              </w:rPr>
-              <w:t>XS1853999313</w:t>
-            </w:r>
-          </w:p>
-        </w:tc>
-        <w:tc>
-          <w:tcPr>
-            <w:tcW w:type="dxa" w:w="2608"/>
-          </w:tcPr>
-          <w:p>
-            <w:pPr>
-              <w:spacing w:after="0"/>
-            </w:pPr>
-            <w:r/>
-            <w:r>
-              <w:rPr>
-                <w:b w:val="0"/>
-                <w:sz w:val="17"/>
-              </w:rPr>
-              <w:t>Ignitis 1.875% green notes 2028</w:t>
-            </w:r>
-          </w:p>
-        </w:tc>
-        <w:tc>
-          <w:tcPr>
-            <w:tcW w:type="dxa" w:w="964"/>
-          </w:tcPr>
-          <w:p>
-            <w:pPr>
-              <w:spacing w:after="0"/>
-              <w:jc w:val="right"/>
-            </w:pPr>
-            <w:r/>
-            <w:r>
-              <w:rPr>
-                <w:b w:val="0"/>
-                <w:sz w:val="17"/>
-              </w:rPr>
-              <w:t>1.875%</w:t>
-            </w:r>
-          </w:p>
-        </w:tc>
-        <w:tc>
-          <w:tcPr>
-            <w:tcW w:type="dxa" w:w="1304"/>
-          </w:tcPr>
-          <w:p>
-            <w:pPr>
-              <w:spacing w:after="0"/>
-            </w:pPr>
-            <w:r/>
-            <w:r>
-              <w:rPr>
-                <w:b w:val="0"/>
-                <w:sz w:val="17"/>
-              </w:rPr>
-              <w:t>2028-07-10</w:t>
-            </w:r>
-          </w:p>
-        </w:tc>
-        <w:tc>
-          <w:tcPr>
-            <w:tcW w:type="dxa" w:w="3061"/>
-          </w:tcPr>
-          <w:p>
-            <w:pPr>
-              <w:spacing w:after="0"/>
-            </w:pPr>
-            <w:r/>
-            <w:r>
-              <w:rPr>
-                <w:b w:val="0"/>
-                <w:sz w:val="17"/>
-              </w:rPr>
-            </w:r>
-          </w:p>
-        </w:tc>
-      </w:tr>
-      <w:tr>
-        <w:tc>
-          <w:tcPr>
-            <w:tcW w:type="dxa" w:w="1701"/>
-            <w:shd w:val="clear" w:color="auto" w:fill="F6F8FA"/>
-          </w:tcPr>
-          <w:p>
-            <w:pPr>
-              <w:spacing w:after="0"/>
-            </w:pPr>
-            <w:r/>
-            <w:r>
-              <w:rPr>
-                <w:b w:val="0"/>
-                <w:sz w:val="17"/>
-              </w:rPr>
-              <w:t>XS2177349912</w:t>
-            </w:r>
-          </w:p>
-        </w:tc>
-        <w:tc>
-          <w:tcPr>
-            <w:tcW w:type="dxa" w:w="2608"/>
-            <w:shd w:val="clear" w:color="auto" w:fill="F6F8FA"/>
-          </w:tcPr>
-          <w:p>
-            <w:pPr>
-              <w:spacing w:after="0"/>
-            </w:pPr>
-            <w:r/>
-            <w:r>
-              <w:rPr>
-                <w:b w:val="0"/>
-                <w:sz w:val="17"/>
-              </w:rPr>
-              <w:t>Ignitis 2.000% notes 2030</w:t>
-            </w:r>
-          </w:p>
-        </w:tc>
-        <w:tc>
-          <w:tcPr>
-            <w:tcW w:type="dxa" w:w="964"/>
-            <w:shd w:val="clear" w:color="auto" w:fill="F6F8FA"/>
-          </w:tcPr>
-          <w:p>
-            <w:pPr>
-              <w:spacing w:after="0"/>
-              <w:jc w:val="right"/>
-            </w:pPr>
-            <w:r/>
-            <w:r>
-              <w:rPr>
-                <w:b w:val="0"/>
-                <w:sz w:val="17"/>
-              </w:rPr>
-              <w:t>2.000%</w:t>
-            </w:r>
-          </w:p>
-        </w:tc>
-        <w:tc>
-          <w:tcPr>
-            <w:tcW w:type="dxa" w:w="1304"/>
-            <w:shd w:val="clear" w:color="auto" w:fill="F6F8FA"/>
-          </w:tcPr>
-          <w:p>
-            <w:pPr>
-              <w:spacing w:after="0"/>
-            </w:pPr>
-            <w:r/>
-            <w:r>
-              <w:rPr>
-                <w:b w:val="0"/>
-                <w:sz w:val="17"/>
-              </w:rPr>
-              <w:t>2030-05-21</w:t>
-            </w:r>
-          </w:p>
-        </w:tc>
-        <w:tc>
-          <w:tcPr>
-            <w:tcW w:type="dxa" w:w="3061"/>
-            <w:shd w:val="clear" w:color="auto" w:fill="F6F8FA"/>
-          </w:tcPr>
-          <w:p>
-            <w:pPr>
-              <w:spacing w:after="0"/>
-            </w:pPr>
-            <w:r/>
-            <w:r>
-              <w:rPr>
-                <w:b w:val="0"/>
-                <w:sz w:val="17"/>
-              </w:rPr>
             </w:r>
           </w:p>
         </w:tc>

</xml_diff>

<commit_message>
Revert "ISIN sąrašo sinchronizavimas 2026-10-22"
This reverts commit ccaa50a44ce610ebc31520c02dab735da04add23.
</commit_message>
<xml_diff>
--- a/docs/files/ignitis/ignitis_6M2026_en.docx
+++ b/docs/files/ignitis/ignitis_6M2026_en.docx
@@ -748,6 +748,385 @@
                 <w:sz w:val="17"/>
               </w:rPr>
               <w:t>Note</w:t>
+            </w:r>
+          </w:p>
+        </w:tc>
+      </w:tr>
+      <w:tr>
+        <w:tc>
+          <w:tcPr>
+            <w:tcW w:type="dxa" w:w="1701"/>
+          </w:tcPr>
+          <w:p>
+            <w:pPr>
+              <w:spacing w:after="0"/>
+            </w:pPr>
+            <w:r/>
+            <w:r>
+              <w:rPr>
+                <w:b w:val="0"/>
+                <w:sz w:val="17"/>
+              </w:rPr>
+              <w:t>LT0000115768</w:t>
+            </w:r>
+          </w:p>
+        </w:tc>
+        <w:tc>
+          <w:tcPr>
+            <w:tcW w:type="dxa" w:w="2608"/>
+          </w:tcPr>
+          <w:p>
+            <w:pPr>
+              <w:spacing w:after="0"/>
+            </w:pPr>
+            <w:r/>
+            <w:r>
+              <w:rPr>
+                <w:b w:val="0"/>
+                <w:sz w:val="17"/>
+              </w:rPr>
+              <w:t>Ignitis grupė ordinary share (IGN1L)</w:t>
+            </w:r>
+          </w:p>
+        </w:tc>
+        <w:tc>
+          <w:tcPr>
+            <w:tcW w:type="dxa" w:w="964"/>
+          </w:tcPr>
+          <w:p>
+            <w:pPr>
+              <w:spacing w:after="0"/>
+              <w:jc w:val="right"/>
+            </w:pPr>
+            <w:r/>
+            <w:r>
+              <w:rPr>
+                <w:b w:val="0"/>
+                <w:sz w:val="17"/>
+              </w:rPr>
+              <w:t>–</w:t>
+            </w:r>
+          </w:p>
+        </w:tc>
+        <w:tc>
+          <w:tcPr>
+            <w:tcW w:type="dxa" w:w="1304"/>
+          </w:tcPr>
+          <w:p>
+            <w:pPr>
+              <w:spacing w:after="0"/>
+            </w:pPr>
+            <w:r/>
+            <w:r>
+              <w:rPr>
+                <w:b w:val="0"/>
+                <w:sz w:val="17"/>
+              </w:rPr>
+              <w:t>share</w:t>
+            </w:r>
+          </w:p>
+        </w:tc>
+        <w:tc>
+          <w:tcPr>
+            <w:tcW w:type="dxa" w:w="3061"/>
+          </w:tcPr>
+          <w:p>
+            <w:pPr>
+              <w:spacing w:after="0"/>
+            </w:pPr>
+            <w:r/>
+            <w:r>
+              <w:rPr>
+                <w:b w:val="0"/>
+                <w:sz w:val="17"/>
+              </w:rPr>
+            </w:r>
+          </w:p>
+        </w:tc>
+      </w:tr>
+      <w:tr>
+        <w:tc>
+          <w:tcPr>
+            <w:tcW w:type="dxa" w:w="1701"/>
+            <w:shd w:val="clear" w:color="auto" w:fill="F6F8FA"/>
+          </w:tcPr>
+          <w:p>
+            <w:pPr>
+              <w:spacing w:after="0"/>
+            </w:pPr>
+            <w:r/>
+            <w:r>
+              <w:rPr>
+                <w:b w:val="0"/>
+                <w:sz w:val="17"/>
+              </w:rPr>
+              <w:t>XS1646530565</w:t>
+            </w:r>
+          </w:p>
+        </w:tc>
+        <w:tc>
+          <w:tcPr>
+            <w:tcW w:type="dxa" w:w="2608"/>
+            <w:shd w:val="clear" w:color="auto" w:fill="F6F8FA"/>
+          </w:tcPr>
+          <w:p>
+            <w:pPr>
+              <w:spacing w:after="0"/>
+            </w:pPr>
+            <w:r/>
+            <w:r>
+              <w:rPr>
+                <w:b w:val="0"/>
+                <w:sz w:val="17"/>
+              </w:rPr>
+              <w:t>Ignitis 2.000% green notes 2027</w:t>
+            </w:r>
+          </w:p>
+        </w:tc>
+        <w:tc>
+          <w:tcPr>
+            <w:tcW w:type="dxa" w:w="964"/>
+            <w:shd w:val="clear" w:color="auto" w:fill="F6F8FA"/>
+          </w:tcPr>
+          <w:p>
+            <w:pPr>
+              <w:spacing w:after="0"/>
+              <w:jc w:val="right"/>
+            </w:pPr>
+            <w:r/>
+            <w:r>
+              <w:rPr>
+                <w:b w:val="0"/>
+                <w:sz w:val="17"/>
+              </w:rPr>
+              <w:t>2.000%</w:t>
+            </w:r>
+          </w:p>
+        </w:tc>
+        <w:tc>
+          <w:tcPr>
+            <w:tcW w:type="dxa" w:w="1304"/>
+            <w:shd w:val="clear" w:color="auto" w:fill="F6F8FA"/>
+          </w:tcPr>
+          <w:p>
+            <w:pPr>
+              <w:spacing w:after="0"/>
+            </w:pPr>
+            <w:r/>
+            <w:r>
+              <w:rPr>
+                <w:b w:val="0"/>
+                <w:sz w:val="17"/>
+              </w:rPr>
+              <w:t>2027-07-14</w:t>
+            </w:r>
+          </w:p>
+        </w:tc>
+        <w:tc>
+          <w:tcPr>
+            <w:tcW w:type="dxa" w:w="3061"/>
+            <w:shd w:val="clear" w:color="auto" w:fill="F6F8FA"/>
+          </w:tcPr>
+          <w:p>
+            <w:pPr>
+              <w:spacing w:after="0"/>
+            </w:pPr>
+            <w:r/>
+            <w:r>
+              <w:rPr>
+                <w:b w:val="0"/>
+                <w:sz w:val="17"/>
+              </w:rPr>
+              <w:t>Tender offer for any and all notes announced 2026-10-19 (refinanced by new EuGB 4.500% 2031)</w:t>
+            </w:r>
+          </w:p>
+        </w:tc>
+      </w:tr>
+      <w:tr>
+        <w:tc>
+          <w:tcPr>
+            <w:tcW w:type="dxa" w:w="1701"/>
+          </w:tcPr>
+          <w:p>
+            <w:pPr>
+              <w:spacing w:after="0"/>
+            </w:pPr>
+            <w:r/>
+            <w:r>
+              <w:rPr>
+                <w:b w:val="0"/>
+                <w:sz w:val="17"/>
+              </w:rPr>
+              <w:t>XS1853999313</w:t>
+            </w:r>
+          </w:p>
+        </w:tc>
+        <w:tc>
+          <w:tcPr>
+            <w:tcW w:type="dxa" w:w="2608"/>
+          </w:tcPr>
+          <w:p>
+            <w:pPr>
+              <w:spacing w:after="0"/>
+            </w:pPr>
+            <w:r/>
+            <w:r>
+              <w:rPr>
+                <w:b w:val="0"/>
+                <w:sz w:val="17"/>
+              </w:rPr>
+              <w:t>Ignitis 1.875% green notes 2028</w:t>
+            </w:r>
+          </w:p>
+        </w:tc>
+        <w:tc>
+          <w:tcPr>
+            <w:tcW w:type="dxa" w:w="964"/>
+          </w:tcPr>
+          <w:p>
+            <w:pPr>
+              <w:spacing w:after="0"/>
+              <w:jc w:val="right"/>
+            </w:pPr>
+            <w:r/>
+            <w:r>
+              <w:rPr>
+                <w:b w:val="0"/>
+                <w:sz w:val="17"/>
+              </w:rPr>
+              <w:t>1.875%</w:t>
+            </w:r>
+          </w:p>
+        </w:tc>
+        <w:tc>
+          <w:tcPr>
+            <w:tcW w:type="dxa" w:w="1304"/>
+          </w:tcPr>
+          <w:p>
+            <w:pPr>
+              <w:spacing w:after="0"/>
+            </w:pPr>
+            <w:r/>
+            <w:r>
+              <w:rPr>
+                <w:b w:val="0"/>
+                <w:sz w:val="17"/>
+              </w:rPr>
+              <w:t>2028-07-10</w:t>
+            </w:r>
+          </w:p>
+        </w:tc>
+        <w:tc>
+          <w:tcPr>
+            <w:tcW w:type="dxa" w:w="3061"/>
+          </w:tcPr>
+          <w:p>
+            <w:pPr>
+              <w:spacing w:after="0"/>
+            </w:pPr>
+            <w:r/>
+            <w:r>
+              <w:rPr>
+                <w:b w:val="0"/>
+                <w:sz w:val="17"/>
+              </w:rPr>
+            </w:r>
+          </w:p>
+        </w:tc>
+      </w:tr>
+      <w:tr>
+        <w:tc>
+          <w:tcPr>
+            <w:tcW w:type="dxa" w:w="1701"/>
+            <w:shd w:val="clear" w:color="auto" w:fill="F6F8FA"/>
+          </w:tcPr>
+          <w:p>
+            <w:pPr>
+              <w:spacing w:after="0"/>
+            </w:pPr>
+            <w:r/>
+            <w:r>
+              <w:rPr>
+                <w:b w:val="0"/>
+                <w:sz w:val="17"/>
+              </w:rPr>
+              <w:t>XS2177349912</w:t>
+            </w:r>
+          </w:p>
+        </w:tc>
+        <w:tc>
+          <w:tcPr>
+            <w:tcW w:type="dxa" w:w="2608"/>
+            <w:shd w:val="clear" w:color="auto" w:fill="F6F8FA"/>
+          </w:tcPr>
+          <w:p>
+            <w:pPr>
+              <w:spacing w:after="0"/>
+            </w:pPr>
+            <w:r/>
+            <w:r>
+              <w:rPr>
+                <w:b w:val="0"/>
+                <w:sz w:val="17"/>
+              </w:rPr>
+              <w:t>Ignitis 2.000% notes 2030</w:t>
+            </w:r>
+          </w:p>
+        </w:tc>
+        <w:tc>
+          <w:tcPr>
+            <w:tcW w:type="dxa" w:w="964"/>
+            <w:shd w:val="clear" w:color="auto" w:fill="F6F8FA"/>
+          </w:tcPr>
+          <w:p>
+            <w:pPr>
+              <w:spacing w:after="0"/>
+              <w:jc w:val="right"/>
+            </w:pPr>
+            <w:r/>
+            <w:r>
+              <w:rPr>
+                <w:b w:val="0"/>
+                <w:sz w:val="17"/>
+              </w:rPr>
+              <w:t>2.000%</w:t>
+            </w:r>
+          </w:p>
+        </w:tc>
+        <w:tc>
+          <w:tcPr>
+            <w:tcW w:type="dxa" w:w="1304"/>
+            <w:shd w:val="clear" w:color="auto" w:fill="F6F8FA"/>
+          </w:tcPr>
+          <w:p>
+            <w:pPr>
+              <w:spacing w:after="0"/>
+            </w:pPr>
+            <w:r/>
+            <w:r>
+              <w:rPr>
+                <w:b w:val="0"/>
+                <w:sz w:val="17"/>
+              </w:rPr>
+              <w:t>2030-05-21</w:t>
+            </w:r>
+          </w:p>
+        </w:tc>
+        <w:tc>
+          <w:tcPr>
+            <w:tcW w:type="dxa" w:w="3061"/>
+            <w:shd w:val="clear" w:color="auto" w:fill="F6F8FA"/>
+          </w:tcPr>
+          <w:p>
+            <w:pPr>
+              <w:spacing w:after="0"/>
+            </w:pPr>
+            <w:r/>
+            <w:r>
+              <w:rPr>
+                <w:b w:val="0"/>
+                <w:sz w:val="17"/>
+              </w:rPr>
             </w:r>
           </w:p>
         </w:tc>

</xml_diff>